<commit_message>
docs: sync registration claims with S2 anchor
</commit_message>
<xml_diff>
--- a/docs/paper/paper-idea-detailed-zh.docx
+++ b/docs/paper/paper-idea-detailed-zh.docx
@@ -79,19 +79,6 @@
       </w:pPr>
       <w:r>
         <w:rPr>
-          <w:rStyle w:val="SectionNumber"/>
-          <w:rFonts w:ascii="Hiragino Sans GB" w:hAnsi="Hiragino Sans GB" w:eastAsia="Hiragino Sans GB" w:cs="Hiragino Sans GB"/>
-        </w:rPr>
-        <w:t xml:space="preserve">1</w:t>
-      </w:r>
-      <w:r>
-        <w:rPr>
-          <w:rFonts w:ascii="Hiragino Sans GB" w:hAnsi="Hiragino Sans GB" w:eastAsia="Hiragino Sans GB" w:cs="Hiragino Sans GB"/>
-        </w:rPr>
-        <w:tab/>
-      </w:r>
-      <w:r>
-        <w:rPr>
           <w:rFonts w:hint="eastAsia" w:ascii="Hiragino Sans GB" w:hAnsi="Hiragino Sans GB" w:eastAsia="Hiragino Sans GB" w:cs="Hiragino Sans GB"/>
         </w:rPr>
         <w:t xml:space="preserve">阅读提示</w:t>
@@ -220,19 +207,6 @@
       </w:pPr>
       <w:r>
         <w:rPr>
-          <w:rStyle w:val="SectionNumber"/>
-          <w:rFonts w:ascii="Hiragino Sans GB" w:hAnsi="Hiragino Sans GB" w:eastAsia="Hiragino Sans GB" w:cs="Hiragino Sans GB"/>
-        </w:rPr>
-        <w:t xml:space="preserve">2</w:t>
-      </w:r>
-      <w:r>
-        <w:rPr>
-          <w:rFonts w:ascii="Hiragino Sans GB" w:hAnsi="Hiragino Sans GB" w:eastAsia="Hiragino Sans GB" w:cs="Hiragino Sans GB"/>
-        </w:rPr>
-        <w:tab/>
-      </w:r>
-      <w:r>
-        <w:rPr>
           <w:rFonts w:hint="eastAsia" w:ascii="Hiragino Sans GB" w:hAnsi="Hiragino Sans GB" w:eastAsia="Hiragino Sans GB" w:cs="Hiragino Sans GB"/>
         </w:rPr>
         <w:t xml:space="preserve">一句话概括论文</w:t>
@@ -494,19 +468,6 @@
       </w:pPr>
       <w:r>
         <w:rPr>
-          <w:rStyle w:val="SectionNumber"/>
-          <w:rFonts w:ascii="Hiragino Sans GB" w:hAnsi="Hiragino Sans GB" w:eastAsia="Hiragino Sans GB" w:cs="Hiragino Sans GB"/>
-        </w:rPr>
-        <w:t xml:space="preserve">3</w:t>
-      </w:r>
-      <w:r>
-        <w:rPr>
-          <w:rFonts w:ascii="Hiragino Sans GB" w:hAnsi="Hiragino Sans GB" w:eastAsia="Hiragino Sans GB" w:cs="Hiragino Sans GB"/>
-        </w:rPr>
-        <w:tab/>
-      </w:r>
-      <w:r>
-        <w:rPr>
           <w:rFonts w:hint="eastAsia" w:ascii="Hiragino Sans GB" w:hAnsi="Hiragino Sans GB" w:eastAsia="Hiragino Sans GB" w:cs="Hiragino Sans GB"/>
         </w:rPr>
         <w:t xml:space="preserve">研究问题为什么存在</w:t>
@@ -519,19 +480,6 @@
         <w:keepNext/>
         <w:keepLines/>
       </w:pPr>
-      <w:r>
-        <w:rPr>
-          <w:rStyle w:val="SectionNumber"/>
-          <w:rFonts w:ascii="Hiragino Sans GB" w:hAnsi="Hiragino Sans GB" w:eastAsia="Hiragino Sans GB" w:cs="Hiragino Sans GB"/>
-        </w:rPr>
-        <w:t xml:space="preserve">3.1</w:t>
-      </w:r>
-      <w:r>
-        <w:rPr>
-          <w:rFonts w:ascii="Hiragino Sans GB" w:hAnsi="Hiragino Sans GB" w:eastAsia="Hiragino Sans GB" w:cs="Hiragino Sans GB"/>
-        </w:rPr>
-        <w:tab/>
-      </w:r>
       <w:r>
         <w:rPr>
           <w:rFonts w:hint="eastAsia" w:ascii="Hiragino Sans GB" w:hAnsi="Hiragino Sans GB" w:eastAsia="Hiragino Sans GB" w:cs="Hiragino Sans GB"/>
@@ -2515,19 +2463,6 @@
       </w:pPr>
       <w:r>
         <w:rPr>
-          <w:rStyle w:val="SectionNumber"/>
-          <w:rFonts w:ascii="Hiragino Sans GB" w:hAnsi="Hiragino Sans GB" w:eastAsia="Hiragino Sans GB" w:cs="Hiragino Sans GB"/>
-        </w:rPr>
-        <w:t xml:space="preserve">3.2</w:t>
-      </w:r>
-      <w:r>
-        <w:rPr>
-          <w:rFonts w:ascii="Hiragino Sans GB" w:hAnsi="Hiragino Sans GB" w:eastAsia="Hiragino Sans GB" w:cs="Hiragino Sans GB"/>
-        </w:rPr>
-        <w:tab/>
-      </w:r>
-      <w:r>
-        <w:rPr>
           <w:rFonts w:hint="eastAsia" w:ascii="Hiragino Sans GB" w:hAnsi="Hiragino Sans GB" w:eastAsia="Hiragino Sans GB" w:cs="Hiragino Sans GB"/>
         </w:rPr>
         <w:t xml:space="preserve">朴素解法为什么可能太贵</w:t>
@@ -3136,19 +3071,6 @@
       </w:pPr>
       <w:r>
         <w:rPr>
-          <w:rStyle w:val="SectionNumber"/>
-          <w:rFonts w:ascii="Hiragino Sans GB" w:hAnsi="Hiragino Sans GB" w:eastAsia="Hiragino Sans GB" w:cs="Hiragino Sans GB"/>
-        </w:rPr>
-        <w:t xml:space="preserve">4</w:t>
-      </w:r>
-      <w:r>
-        <w:rPr>
-          <w:rFonts w:ascii="Hiragino Sans GB" w:hAnsi="Hiragino Sans GB" w:eastAsia="Hiragino Sans GB" w:cs="Hiragino Sans GB"/>
-        </w:rPr>
-        <w:tab/>
-      </w:r>
-      <w:r>
-        <w:rPr>
           <w:rFonts w:hint="eastAsia" w:ascii="Hiragino Sans GB" w:hAnsi="Hiragino Sans GB" w:eastAsia="Hiragino Sans GB" w:cs="Hiragino Sans GB"/>
         </w:rPr>
         <w:t xml:space="preserve">系统与威胁模型</w:t>
@@ -3809,19 +3731,6 @@
       </w:pPr>
       <w:r>
         <w:rPr>
-          <w:rStyle w:val="SectionNumber"/>
-          <w:rFonts w:ascii="Hiragino Sans GB" w:hAnsi="Hiragino Sans GB" w:eastAsia="Hiragino Sans GB" w:cs="Hiragino Sans GB"/>
-        </w:rPr>
-        <w:t xml:space="preserve">5</w:t>
-      </w:r>
-      <w:r>
-        <w:rPr>
-          <w:rFonts w:ascii="Hiragino Sans GB" w:hAnsi="Hiragino Sans GB" w:eastAsia="Hiragino Sans GB" w:cs="Hiragino Sans GB"/>
-        </w:rPr>
-        <w:tab/>
-      </w:r>
-      <w:r>
-        <w:rPr>
           <w:rFonts w:hint="eastAsia" w:ascii="Hiragino Sans GB" w:hAnsi="Hiragino Sans GB" w:eastAsia="Hiragino Sans GB" w:cs="Hiragino Sans GB"/>
         </w:rPr>
         <w:t xml:space="preserve">核心设计一：Publication</w:t>
@@ -3846,19 +3755,6 @@
         <w:keepNext/>
         <w:keepLines/>
       </w:pPr>
-      <w:r>
-        <w:rPr>
-          <w:rStyle w:val="SectionNumber"/>
-          <w:rFonts w:ascii="Hiragino Sans GB" w:hAnsi="Hiragino Sans GB" w:eastAsia="Hiragino Sans GB" w:cs="Hiragino Sans GB"/>
-        </w:rPr>
-        <w:t xml:space="preserve">5.1</w:t>
-      </w:r>
-      <w:r>
-        <w:rPr>
-          <w:rFonts w:ascii="Hiragino Sans GB" w:hAnsi="Hiragino Sans GB" w:eastAsia="Hiragino Sans GB" w:cs="Hiragino Sans GB"/>
-        </w:rPr>
-        <w:tab/>
-      </w:r>
       <w:r>
         <w:rPr>
           <w:rFonts w:hint="eastAsia" w:ascii="Hiragino Sans GB" w:hAnsi="Hiragino Sans GB" w:eastAsia="Hiragino Sans GB" w:cs="Hiragino Sans GB"/>
@@ -4653,19 +4549,6 @@
         <w:keepNext/>
         <w:keepLines/>
       </w:pPr>
-      <w:r>
-        <w:rPr>
-          <w:rStyle w:val="SectionNumber"/>
-          <w:rFonts w:ascii="Hiragino Sans GB" w:hAnsi="Hiragino Sans GB" w:eastAsia="Hiragino Sans GB" w:cs="Hiragino Sans GB"/>
-        </w:rPr>
-        <w:t xml:space="preserve">5.2</w:t>
-      </w:r>
-      <w:r>
-        <w:rPr>
-          <w:rFonts w:ascii="Hiragino Sans GB" w:hAnsi="Hiragino Sans GB" w:eastAsia="Hiragino Sans GB" w:cs="Hiragino Sans GB"/>
-        </w:rPr>
-        <w:tab/>
-      </w:r>
       <w:r>
         <w:rPr>
           <w:rFonts w:hint="eastAsia" w:ascii="Hiragino Sans GB" w:hAnsi="Hiragino Sans GB" w:eastAsia="Hiragino Sans GB" w:cs="Hiragino Sans GB"/>
@@ -5518,19 +5401,6 @@
       </w:pPr>
       <w:r>
         <w:rPr>
-          <w:rStyle w:val="SectionNumber"/>
-          <w:rFonts w:ascii="Hiragino Sans GB" w:hAnsi="Hiragino Sans GB" w:eastAsia="Hiragino Sans GB" w:cs="Hiragino Sans GB"/>
-        </w:rPr>
-        <w:t xml:space="preserve">5.3</w:t>
-      </w:r>
-      <w:r>
-        <w:rPr>
-          <w:rFonts w:ascii="Hiragino Sans GB" w:hAnsi="Hiragino Sans GB" w:eastAsia="Hiragino Sans GB" w:cs="Hiragino Sans GB"/>
-        </w:rPr>
-        <w:tab/>
-      </w:r>
-      <w:r>
-        <w:rPr>
           <w:rFonts w:ascii="Hiragino Sans GB" w:hAnsi="Hiragino Sans GB" w:eastAsia="Hiragino Sans GB" w:cs="Hiragino Sans GB"/>
         </w:rPr>
         <w:t xml:space="preserve">Publication Window</w:t>
@@ -5876,19 +5746,6 @@
         <w:keepNext/>
         <w:keepLines/>
       </w:pPr>
-      <w:r>
-        <w:rPr>
-          <w:rStyle w:val="SectionNumber"/>
-          <w:rFonts w:ascii="Hiragino Sans GB" w:hAnsi="Hiragino Sans GB" w:eastAsia="Hiragino Sans GB" w:cs="Hiragino Sans GB"/>
-        </w:rPr>
-        <w:t xml:space="preserve">6</w:t>
-      </w:r>
-      <w:r>
-        <w:rPr>
-          <w:rFonts w:ascii="Hiragino Sans GB" w:hAnsi="Hiragino Sans GB" w:eastAsia="Hiragino Sans GB" w:cs="Hiragino Sans GB"/>
-        </w:rPr>
-        <w:tab/>
-      </w:r>
       <w:r>
         <w:rPr>
           <w:rFonts w:hint="eastAsia" w:ascii="Hiragino Sans GB" w:hAnsi="Hiragino Sans GB" w:eastAsia="Hiragino Sans GB" w:cs="Hiragino Sans GB"/>
@@ -6743,19 +6600,6 @@
       </w:pPr>
       <w:r>
         <w:rPr>
-          <w:rStyle w:val="SectionNumber"/>
-          <w:rFonts w:ascii="Hiragino Sans GB" w:hAnsi="Hiragino Sans GB" w:eastAsia="Hiragino Sans GB" w:cs="Hiragino Sans GB"/>
-        </w:rPr>
-        <w:t xml:space="preserve">7</w:t>
-      </w:r>
-      <w:r>
-        <w:rPr>
-          <w:rFonts w:ascii="Hiragino Sans GB" w:hAnsi="Hiragino Sans GB" w:eastAsia="Hiragino Sans GB" w:cs="Hiragino Sans GB"/>
-        </w:rPr>
-        <w:tab/>
-      </w:r>
-      <w:r>
-        <w:rPr>
           <w:rFonts w:hint="eastAsia" w:ascii="Hiragino Sans GB" w:hAnsi="Hiragino Sans GB" w:eastAsia="Hiragino Sans GB" w:cs="Hiragino Sans GB"/>
         </w:rPr>
         <w:t xml:space="preserve">核心设计三：</w:t>
@@ -6789,19 +6633,6 @@
       </w:pPr>
       <w:r>
         <w:rPr>
-          <w:rStyle w:val="SectionNumber"/>
-          <w:rFonts w:ascii="Hiragino Sans GB" w:hAnsi="Hiragino Sans GB" w:eastAsia="Hiragino Sans GB" w:cs="Hiragino Sans GB"/>
-        </w:rPr>
-        <w:t xml:space="preserve">7.1</w:t>
-      </w:r>
-      <w:r>
-        <w:rPr>
-          <w:rFonts w:ascii="Hiragino Sans GB" w:hAnsi="Hiragino Sans GB" w:eastAsia="Hiragino Sans GB" w:cs="Hiragino Sans GB"/>
-        </w:rPr>
-        <w:tab/>
-      </w:r>
-      <w:r>
-        <w:rPr>
           <w:rFonts w:hint="eastAsia" w:ascii="Hiragino Sans GB" w:hAnsi="Hiragino Sans GB" w:eastAsia="Hiragino Sans GB" w:cs="Hiragino Sans GB"/>
         </w:rPr>
         <w:t xml:space="preserve">为什么不能把所有返回密文直接相加</w:t>
@@ -6915,19 +6746,6 @@
         <w:keepNext/>
         <w:keepLines/>
       </w:pPr>
-      <w:r>
-        <w:rPr>
-          <w:rStyle w:val="SectionNumber"/>
-          <w:rFonts w:ascii="Hiragino Sans GB" w:hAnsi="Hiragino Sans GB" w:eastAsia="Hiragino Sans GB" w:cs="Hiragino Sans GB"/>
-        </w:rPr>
-        <w:t xml:space="preserve">7.2</w:t>
-      </w:r>
-      <w:r>
-        <w:rPr>
-          <w:rFonts w:ascii="Hiragino Sans GB" w:hAnsi="Hiragino Sans GB" w:eastAsia="Hiragino Sans GB" w:cs="Hiragino Sans GB"/>
-        </w:rPr>
-        <w:tab/>
-      </w:r>
       <w:r>
         <w:rPr>
           <w:rFonts w:hint="eastAsia" w:ascii="Hiragino Sans GB" w:hAnsi="Hiragino Sans GB" w:eastAsia="Hiragino Sans GB" w:cs="Hiragino Sans GB"/>
@@ -7960,19 +7778,6 @@
       </w:pPr>
       <w:r>
         <w:rPr>
-          <w:rStyle w:val="SectionNumber"/>
-          <w:rFonts w:ascii="Hiragino Sans GB" w:hAnsi="Hiragino Sans GB" w:eastAsia="Hiragino Sans GB" w:cs="Hiragino Sans GB"/>
-        </w:rPr>
-        <w:t xml:space="preserve">7.3</w:t>
-      </w:r>
-      <w:r>
-        <w:rPr>
-          <w:rFonts w:ascii="Hiragino Sans GB" w:hAnsi="Hiragino Sans GB" w:eastAsia="Hiragino Sans GB" w:cs="Hiragino Sans GB"/>
-        </w:rPr>
-        <w:tab/>
-      </w:r>
-      <w:r>
-        <w:rPr>
           <w:rFonts w:hint="eastAsia" w:ascii="Hiragino Sans GB" w:hAnsi="Hiragino Sans GB" w:eastAsia="Hiragino Sans GB" w:cs="Hiragino Sans GB"/>
         </w:rPr>
         <w:t xml:space="preserve">公开摘要与私有计划</w:t>
@@ -8865,19 +8670,6 @@
       </w:pPr>
       <w:r>
         <w:rPr>
-          <w:rStyle w:val="SectionNumber"/>
-          <w:rFonts w:ascii="Hiragino Sans GB" w:hAnsi="Hiragino Sans GB" w:eastAsia="Hiragino Sans GB" w:cs="Hiragino Sans GB"/>
-        </w:rPr>
-        <w:t xml:space="preserve">8</w:t>
-      </w:r>
-      <w:r>
-        <w:rPr>
-          <w:rFonts w:ascii="Hiragino Sans GB" w:hAnsi="Hiragino Sans GB" w:eastAsia="Hiragino Sans GB" w:cs="Hiragino Sans GB"/>
-        </w:rPr>
-        <w:tab/>
-      </w:r>
-      <w:r>
-        <w:rPr>
           <w:rFonts w:hint="eastAsia" w:ascii="Hiragino Sans GB" w:hAnsi="Hiragino Sans GB" w:eastAsia="Hiragino Sans GB" w:cs="Hiragino Sans GB"/>
         </w:rPr>
         <w:t xml:space="preserve">核心设计四：只对真实重叠做</w:t>
@@ -8904,19 +8696,6 @@
       </w:pPr>
       <w:r>
         <w:rPr>
-          <w:rStyle w:val="SectionNumber"/>
-          <w:rFonts w:ascii="Hiragino Sans GB" w:hAnsi="Hiragino Sans GB" w:eastAsia="Hiragino Sans GB" w:cs="Hiragino Sans GB"/>
-        </w:rPr>
-        <w:t xml:space="preserve">8.1</w:t>
-      </w:r>
-      <w:r>
-        <w:rPr>
-          <w:rFonts w:ascii="Hiragino Sans GB" w:hAnsi="Hiragino Sans GB" w:eastAsia="Hiragino Sans GB" w:cs="Hiragino Sans GB"/>
-        </w:rPr>
-        <w:tab/>
-      </w:r>
-      <w:r>
-        <w:rPr>
           <w:rFonts w:hint="eastAsia" w:ascii="Hiragino Sans GB" w:hAnsi="Hiragino Sans GB" w:eastAsia="Hiragino Sans GB" w:cs="Hiragino Sans GB"/>
         </w:rPr>
         <w:t xml:space="preserve">目标</w:t>
@@ -9025,19 +8804,6 @@
         <w:keepNext/>
         <w:keepLines/>
       </w:pPr>
-      <w:r>
-        <w:rPr>
-          <w:rStyle w:val="SectionNumber"/>
-          <w:rFonts w:ascii="Hiragino Sans GB" w:hAnsi="Hiragino Sans GB" w:eastAsia="Hiragino Sans GB" w:cs="Hiragino Sans GB"/>
-        </w:rPr>
-        <w:t xml:space="preserve">8.2</w:t>
-      </w:r>
-      <w:r>
-        <w:rPr>
-          <w:rFonts w:ascii="Hiragino Sans GB" w:hAnsi="Hiragino Sans GB" w:eastAsia="Hiragino Sans GB" w:cs="Hiragino Sans GB"/>
-        </w:rPr>
-        <w:tab/>
-      </w:r>
       <w:r>
         <w:rPr>
           <w:rFonts w:hint="eastAsia" w:ascii="Hiragino Sans GB" w:hAnsi="Hiragino Sans GB" w:eastAsia="Hiragino Sans GB" w:cs="Hiragino Sans GB"/>
@@ -10545,19 +10311,6 @@
       </w:pPr>
       <w:r>
         <w:rPr>
-          <w:rStyle w:val="SectionNumber"/>
-          <w:rFonts w:ascii="Hiragino Sans GB" w:hAnsi="Hiragino Sans GB" w:eastAsia="Hiragino Sans GB" w:cs="Hiragino Sans GB"/>
-        </w:rPr>
-        <w:t xml:space="preserve">8.3</w:t>
-      </w:r>
-      <w:r>
-        <w:rPr>
-          <w:rFonts w:ascii="Hiragino Sans GB" w:hAnsi="Hiragino Sans GB" w:eastAsia="Hiragino Sans GB" w:cs="Hiragino Sans GB"/>
-        </w:rPr>
-        <w:tab/>
-      </w:r>
-      <w:r>
-        <w:rPr>
           <w:rFonts w:hint="eastAsia" w:ascii="Hiragino Sans GB" w:hAnsi="Hiragino Sans GB" w:eastAsia="Hiragino Sans GB" w:cs="Hiragino Sans GB"/>
         </w:rPr>
         <w:t xml:space="preserve">为什么</w:t>
@@ -10788,19 +10541,6 @@
       </w:pPr>
       <w:r>
         <w:rPr>
-          <w:rStyle w:val="SectionNumber"/>
-          <w:rFonts w:ascii="Hiragino Sans GB" w:hAnsi="Hiragino Sans GB" w:eastAsia="Hiragino Sans GB" w:cs="Hiragino Sans GB"/>
-        </w:rPr>
-        <w:t xml:space="preserve">8.4</w:t>
-      </w:r>
-      <w:r>
-        <w:rPr>
-          <w:rFonts w:ascii="Hiragino Sans GB" w:hAnsi="Hiragino Sans GB" w:eastAsia="Hiragino Sans GB" w:cs="Hiragino Sans GB"/>
-        </w:rPr>
-        <w:tab/>
-      </w:r>
-      <w:r>
-        <w:rPr>
           <w:rFonts w:ascii="Hiragino Sans GB" w:hAnsi="Hiragino Sans GB" w:eastAsia="Hiragino Sans GB" w:cs="Hiragino Sans GB"/>
         </w:rPr>
         <w:t xml:space="preserve">reserve-before-sample</w:t>
@@ -11062,19 +10802,6 @@
       </w:pPr>
       <w:r>
         <w:rPr>
-          <w:rStyle w:val="SectionNumber"/>
-          <w:rFonts w:ascii="Hiragino Sans GB" w:hAnsi="Hiragino Sans GB" w:eastAsia="Hiragino Sans GB" w:cs="Hiragino Sans GB"/>
-        </w:rPr>
-        <w:t xml:space="preserve">9</w:t>
-      </w:r>
-      <w:r>
-        <w:rPr>
-          <w:rFonts w:ascii="Hiragino Sans GB" w:hAnsi="Hiragino Sans GB" w:eastAsia="Hiragino Sans GB" w:cs="Hiragino Sans GB"/>
-        </w:rPr>
-        <w:tab/>
-      </w:r>
-      <w:r>
-        <w:rPr>
           <w:rFonts w:hint="eastAsia" w:ascii="Hiragino Sans GB" w:hAnsi="Hiragino Sans GB" w:eastAsia="Hiragino Sans GB" w:cs="Hiragino Sans GB"/>
         </w:rPr>
         <w:t xml:space="preserve">核心设计五：固定分段</w:t>
@@ -11093,19 +10820,6 @@
         <w:keepNext/>
         <w:keepLines/>
       </w:pPr>
-      <w:r>
-        <w:rPr>
-          <w:rStyle w:val="SectionNumber"/>
-          <w:rFonts w:ascii="Hiragino Sans GB" w:hAnsi="Hiragino Sans GB" w:eastAsia="Hiragino Sans GB" w:cs="Hiragino Sans GB"/>
-        </w:rPr>
-        <w:t xml:space="preserve">9.1</w:t>
-      </w:r>
-      <w:r>
-        <w:rPr>
-          <w:rFonts w:ascii="Hiragino Sans GB" w:hAnsi="Hiragino Sans GB" w:eastAsia="Hiragino Sans GB" w:cs="Hiragino Sans GB"/>
-        </w:rPr>
-        <w:tab/>
-      </w:r>
       <w:r>
         <w:rPr>
           <w:rFonts w:hint="eastAsia" w:ascii="Hiragino Sans GB" w:hAnsi="Hiragino Sans GB" w:eastAsia="Hiragino Sans GB" w:cs="Hiragino Sans GB"/>
@@ -11518,19 +11232,6 @@
       </w:pPr>
       <w:r>
         <w:rPr>
-          <w:rStyle w:val="SectionNumber"/>
-          <w:rFonts w:ascii="Hiragino Sans GB" w:hAnsi="Hiragino Sans GB" w:eastAsia="Hiragino Sans GB" w:cs="Hiragino Sans GB"/>
-        </w:rPr>
-        <w:t xml:space="preserve">9.2</w:t>
-      </w:r>
-      <w:r>
-        <w:rPr>
-          <w:rFonts w:ascii="Hiragino Sans GB" w:hAnsi="Hiragino Sans GB" w:eastAsia="Hiragino Sans GB" w:cs="Hiragino Sans GB"/>
-        </w:rPr>
-        <w:tab/>
-      </w:r>
-      <w:r>
-        <w:rPr>
           <w:rFonts w:hint="eastAsia" w:ascii="Hiragino Sans GB" w:hAnsi="Hiragino Sans GB" w:eastAsia="Hiragino Sans GB" w:cs="Hiragino Sans GB"/>
         </w:rPr>
         <w:t xml:space="preserve">固定宽度与页面</w:t>
@@ -11803,19 +11504,6 @@
         <w:keepNext/>
         <w:keepLines/>
       </w:pPr>
-      <w:r>
-        <w:rPr>
-          <w:rStyle w:val="SectionNumber"/>
-          <w:rFonts w:ascii="Hiragino Sans GB" w:hAnsi="Hiragino Sans GB" w:eastAsia="Hiragino Sans GB" w:cs="Hiragino Sans GB"/>
-        </w:rPr>
-        <w:t xml:space="preserve">9.3</w:t>
-      </w:r>
-      <w:r>
-        <w:rPr>
-          <w:rFonts w:ascii="Hiragino Sans GB" w:hAnsi="Hiragino Sans GB" w:eastAsia="Hiragino Sans GB" w:cs="Hiragino Sans GB"/>
-        </w:rPr>
-        <w:tab/>
-      </w:r>
       <w:r>
         <w:rPr>
           <w:rFonts w:ascii="Hiragino Sans GB" w:hAnsi="Hiragino Sans GB" w:eastAsia="Hiragino Sans GB" w:cs="Hiragino Sans GB"/>
@@ -13007,19 +12695,6 @@
       </w:pPr>
       <w:r>
         <w:rPr>
-          <w:rStyle w:val="SectionNumber"/>
-          <w:rFonts w:ascii="Hiragino Sans GB" w:hAnsi="Hiragino Sans GB" w:eastAsia="Hiragino Sans GB" w:cs="Hiragino Sans GB"/>
-        </w:rPr>
-        <w:t xml:space="preserve">10</w:t>
-      </w:r>
-      <w:r>
-        <w:rPr>
-          <w:rFonts w:ascii="Hiragino Sans GB" w:hAnsi="Hiragino Sans GB" w:eastAsia="Hiragino Sans GB" w:cs="Hiragino Sans GB"/>
-        </w:rPr>
-        <w:tab/>
-      </w:r>
-      <w:r>
-        <w:rPr>
           <w:rFonts w:hint="eastAsia" w:ascii="Hiragino Sans GB" w:hAnsi="Hiragino Sans GB" w:eastAsia="Hiragino Sans GB" w:cs="Hiragino Sans GB"/>
         </w:rPr>
         <w:t xml:space="preserve">候选策略与“不是在线万能选择器”</w:t>
@@ -14178,19 +13853,6 @@
       </w:pPr>
       <w:r>
         <w:rPr>
-          <w:rStyle w:val="SectionNumber"/>
-          <w:rFonts w:ascii="Hiragino Sans GB" w:hAnsi="Hiragino Sans GB" w:eastAsia="Hiragino Sans GB" w:cs="Hiragino Sans GB"/>
-        </w:rPr>
-        <w:t xml:space="preserve">11</w:t>
-      </w:r>
-      <w:r>
-        <w:rPr>
-          <w:rFonts w:ascii="Hiragino Sans GB" w:hAnsi="Hiragino Sans GB" w:eastAsia="Hiragino Sans GB" w:cs="Hiragino Sans GB"/>
-        </w:rPr>
-        <w:tab/>
-      </w:r>
-      <w:r>
-        <w:rPr>
           <w:rFonts w:hint="eastAsia" w:ascii="Hiragino Sans GB" w:hAnsi="Hiragino Sans GB" w:eastAsia="Hiragino Sans GB" w:cs="Hiragino Sans GB"/>
         </w:rPr>
         <w:t xml:space="preserve">完整成本模型</w:t>
@@ -14203,19 +13865,6 @@
         <w:keepNext/>
         <w:keepLines/>
       </w:pPr>
-      <w:r>
-        <w:rPr>
-          <w:rStyle w:val="SectionNumber"/>
-          <w:rFonts w:ascii="Hiragino Sans GB" w:hAnsi="Hiragino Sans GB" w:eastAsia="Hiragino Sans GB" w:cs="Hiragino Sans GB"/>
-        </w:rPr>
-        <w:t xml:space="preserve">11.1</w:t>
-      </w:r>
-      <w:r>
-        <w:rPr>
-          <w:rFonts w:ascii="Hiragino Sans GB" w:hAnsi="Hiragino Sans GB" w:eastAsia="Hiragino Sans GB" w:cs="Hiragino Sans GB"/>
-        </w:rPr>
-        <w:tab/>
-      </w:r>
       <w:r>
         <w:rPr>
           <w:rFonts w:hint="eastAsia" w:ascii="Hiragino Sans GB" w:hAnsi="Hiragino Sans GB" w:eastAsia="Hiragino Sans GB" w:cs="Hiragino Sans GB"/>
@@ -15409,19 +15058,6 @@
       </w:pPr>
       <w:r>
         <w:rPr>
-          <w:rStyle w:val="SectionNumber"/>
-          <w:rFonts w:ascii="Hiragino Sans GB" w:hAnsi="Hiragino Sans GB" w:eastAsia="Hiragino Sans GB" w:cs="Hiragino Sans GB"/>
-        </w:rPr>
-        <w:t xml:space="preserve">11.2</w:t>
-      </w:r>
-      <w:r>
-        <w:rPr>
-          <w:rFonts w:ascii="Hiragino Sans GB" w:hAnsi="Hiragino Sans GB" w:eastAsia="Hiragino Sans GB" w:cs="Hiragino Sans GB"/>
-        </w:rPr>
-        <w:tab/>
-      </w:r>
-      <w:r>
-        <w:rPr>
           <w:rFonts w:hint="eastAsia" w:ascii="Hiragino Sans GB" w:hAnsi="Hiragino Sans GB" w:eastAsia="Hiragino Sans GB" w:cs="Hiragino Sans GB"/>
         </w:rPr>
         <w:t xml:space="preserve">通信成本</w:t>
@@ -15751,19 +15387,6 @@
         <w:keepNext/>
         <w:keepLines/>
       </w:pPr>
-      <w:r>
-        <w:rPr>
-          <w:rStyle w:val="SectionNumber"/>
-          <w:rFonts w:ascii="Hiragino Sans GB" w:hAnsi="Hiragino Sans GB" w:eastAsia="Hiragino Sans GB" w:cs="Hiragino Sans GB"/>
-        </w:rPr>
-        <w:t xml:space="preserve">11.3</w:t>
-      </w:r>
-      <w:r>
-        <w:rPr>
-          <w:rFonts w:ascii="Hiragino Sans GB" w:hAnsi="Hiragino Sans GB" w:eastAsia="Hiragino Sans GB" w:cs="Hiragino Sans GB"/>
-        </w:rPr>
-        <w:tab/>
-      </w:r>
       <w:r>
         <w:rPr>
           <w:rFonts w:hint="eastAsia" w:ascii="Hiragino Sans GB" w:hAnsi="Hiragino Sans GB" w:eastAsia="Hiragino Sans GB" w:cs="Hiragino Sans GB"/>
@@ -16811,19 +16434,6 @@
       </w:pPr>
       <w:r>
         <w:rPr>
-          <w:rStyle w:val="SectionNumber"/>
-          <w:rFonts w:ascii="Hiragino Sans GB" w:hAnsi="Hiragino Sans GB" w:eastAsia="Hiragino Sans GB" w:cs="Hiragino Sans GB"/>
-        </w:rPr>
-        <w:t xml:space="preserve">12</w:t>
-      </w:r>
-      <w:r>
-        <w:rPr>
-          <w:rFonts w:ascii="Hiragino Sans GB" w:hAnsi="Hiragino Sans GB" w:eastAsia="Hiragino Sans GB" w:cs="Hiragino Sans GB"/>
-        </w:rPr>
-        <w:tab/>
-      </w:r>
-      <w:r>
-        <w:rPr>
           <w:rFonts w:hint="eastAsia" w:ascii="Hiragino Sans GB" w:hAnsi="Hiragino Sans GB" w:eastAsia="Hiragino Sans GB" w:cs="Hiragino Sans GB"/>
         </w:rPr>
         <w:t xml:space="preserve">因果实验设计</w:t>
@@ -17169,19 +16779,6 @@
         <w:keepNext/>
         <w:keepLines/>
       </w:pPr>
-      <w:r>
-        <w:rPr>
-          <w:rStyle w:val="SectionNumber"/>
-          <w:rFonts w:ascii="Hiragino Sans GB" w:hAnsi="Hiragino Sans GB" w:eastAsia="Hiragino Sans GB" w:cs="Hiragino Sans GB"/>
-        </w:rPr>
-        <w:t xml:space="preserve">12.1</w:t>
-      </w:r>
-      <w:r>
-        <w:rPr>
-          <w:rFonts w:ascii="Hiragino Sans GB" w:hAnsi="Hiragino Sans GB" w:eastAsia="Hiragino Sans GB" w:cs="Hiragino Sans GB"/>
-        </w:rPr>
-        <w:tab/>
-      </w:r>
       <w:r>
         <w:rPr>
           <w:rFonts w:hint="eastAsia" w:ascii="Hiragino Sans GB" w:hAnsi="Hiragino Sans GB" w:eastAsia="Hiragino Sans GB" w:cs="Hiragino Sans GB"/>
@@ -17706,19 +17303,6 @@
       </w:pPr>
       <w:r>
         <w:rPr>
-          <w:rStyle w:val="SectionNumber"/>
-          <w:rFonts w:ascii="Hiragino Sans GB" w:hAnsi="Hiragino Sans GB" w:eastAsia="Hiragino Sans GB" w:cs="Hiragino Sans GB"/>
-        </w:rPr>
-        <w:t xml:space="preserve">12.2</w:t>
-      </w:r>
-      <w:r>
-        <w:rPr>
-          <w:rFonts w:ascii="Hiragino Sans GB" w:hAnsi="Hiragino Sans GB" w:eastAsia="Hiragino Sans GB" w:cs="Hiragino Sans GB"/>
-        </w:rPr>
-        <w:tab/>
-      </w:r>
-      <w:r>
-        <w:rPr>
           <w:rFonts w:hint="eastAsia" w:ascii="Hiragino Sans GB" w:hAnsi="Hiragino Sans GB" w:eastAsia="Hiragino Sans GB" w:cs="Hiragino Sans GB"/>
         </w:rPr>
         <w:t xml:space="preserve">连续的</w:t>
@@ -18382,19 +17966,6 @@
         <w:keepNext/>
         <w:keepLines/>
       </w:pPr>
-      <w:r>
-        <w:rPr>
-          <w:rStyle w:val="SectionNumber"/>
-          <w:rFonts w:ascii="Hiragino Sans GB" w:hAnsi="Hiragino Sans GB" w:eastAsia="Hiragino Sans GB" w:cs="Hiragino Sans GB"/>
-        </w:rPr>
-        <w:t xml:space="preserve">12.3</w:t>
-      </w:r>
-      <w:r>
-        <w:rPr>
-          <w:rFonts w:ascii="Hiragino Sans GB" w:hAnsi="Hiragino Sans GB" w:eastAsia="Hiragino Sans GB" w:cs="Hiragino Sans GB"/>
-        </w:rPr>
-        <w:tab/>
-      </w:r>
       <w:r>
         <w:rPr>
           <w:rFonts w:hint="eastAsia" w:ascii="Hiragino Sans GB" w:hAnsi="Hiragino Sans GB" w:eastAsia="Hiragino Sans GB" w:cs="Hiragino Sans GB"/>
@@ -19470,19 +19041,6 @@
       </w:pPr>
       <w:r>
         <w:rPr>
-          <w:rStyle w:val="SectionNumber"/>
-          <w:rFonts w:ascii="Hiragino Sans GB" w:hAnsi="Hiragino Sans GB" w:eastAsia="Hiragino Sans GB" w:cs="Hiragino Sans GB"/>
-        </w:rPr>
-        <w:t xml:space="preserve">13</w:t>
-      </w:r>
-      <w:r>
-        <w:rPr>
-          <w:rFonts w:ascii="Hiragino Sans GB" w:hAnsi="Hiragino Sans GB" w:eastAsia="Hiragino Sans GB" w:cs="Hiragino Sans GB"/>
-        </w:rPr>
-        <w:tab/>
-      </w:r>
-      <w:r>
-        <w:rPr>
           <w:rFonts w:hint="eastAsia" w:ascii="Hiragino Sans GB" w:hAnsi="Hiragino Sans GB" w:eastAsia="Hiragino Sans GB" w:cs="Hiragino Sans GB"/>
         </w:rPr>
         <w:t xml:space="preserve">主判决规则</w:t>
@@ -19495,19 +19053,6 @@
         <w:keepNext/>
         <w:keepLines/>
       </w:pPr>
-      <w:r>
-        <w:rPr>
-          <w:rStyle w:val="SectionNumber"/>
-          <w:rFonts w:ascii="Hiragino Sans GB" w:hAnsi="Hiragino Sans GB" w:eastAsia="Hiragino Sans GB" w:cs="Hiragino Sans GB"/>
-        </w:rPr>
-        <w:t xml:space="preserve">13.1</w:t>
-      </w:r>
-      <w:r>
-        <w:rPr>
-          <w:rFonts w:ascii="Hiragino Sans GB" w:hAnsi="Hiragino Sans GB" w:eastAsia="Hiragino Sans GB" w:cs="Hiragino Sans GB"/>
-        </w:rPr>
-        <w:tab/>
-      </w:r>
       <w:r>
         <w:rPr>
           <w:rFonts w:hint="eastAsia" w:ascii="Hiragino Sans GB" w:hAnsi="Hiragino Sans GB" w:eastAsia="Hiragino Sans GB" w:cs="Hiragino Sans GB"/>
@@ -19998,19 +19543,6 @@
       </w:pPr>
       <w:r>
         <w:rPr>
-          <w:rStyle w:val="SectionNumber"/>
-          <w:rFonts w:ascii="Hiragino Sans GB" w:hAnsi="Hiragino Sans GB" w:eastAsia="Hiragino Sans GB" w:cs="Hiragino Sans GB"/>
-        </w:rPr>
-        <w:t xml:space="preserve">13.2</w:t>
-      </w:r>
-      <w:r>
-        <w:rPr>
-          <w:rFonts w:ascii="Hiragino Sans GB" w:hAnsi="Hiragino Sans GB" w:eastAsia="Hiragino Sans GB" w:cs="Hiragino Sans GB"/>
-        </w:rPr>
-        <w:tab/>
-      </w:r>
-      <w:r>
-        <w:rPr>
           <w:rFonts w:ascii="Hiragino Sans GB" w:hAnsi="Hiragino Sans GB" w:eastAsia="Hiragino Sans GB" w:cs="Hiragino Sans GB"/>
         </w:rPr>
         <w:t xml:space="preserve">Pareto </w:t>
@@ -20474,19 +20006,6 @@
       </w:pPr>
       <w:r>
         <w:rPr>
-          <w:rStyle w:val="SectionNumber"/>
-          <w:rFonts w:ascii="Hiragino Sans GB" w:hAnsi="Hiragino Sans GB" w:eastAsia="Hiragino Sans GB" w:cs="Hiragino Sans GB"/>
-        </w:rPr>
-        <w:t xml:space="preserve">13.3</w:t>
-      </w:r>
-      <w:r>
-        <w:rPr>
-          <w:rFonts w:ascii="Hiragino Sans GB" w:hAnsi="Hiragino Sans GB" w:eastAsia="Hiragino Sans GB" w:cs="Hiragino Sans GB"/>
-        </w:rPr>
-        <w:tab/>
-      </w:r>
-      <w:r>
-        <w:rPr>
           <w:rFonts w:ascii="Hiragino Sans GB" w:hAnsi="Hiragino Sans GB" w:eastAsia="Hiragino Sans GB" w:cs="Hiragino Sans GB"/>
         </w:rPr>
         <w:t xml:space="preserve">headline </w:t>
@@ -21041,19 +20560,6 @@
       </w:pPr>
       <w:r>
         <w:rPr>
-          <w:rStyle w:val="SectionNumber"/>
-          <w:rFonts w:ascii="Hiragino Sans GB" w:hAnsi="Hiragino Sans GB" w:eastAsia="Hiragino Sans GB" w:cs="Hiragino Sans GB"/>
-        </w:rPr>
-        <w:t xml:space="preserve">13.4</w:t>
-      </w:r>
-      <w:r>
-        <w:rPr>
-          <w:rFonts w:ascii="Hiragino Sans GB" w:hAnsi="Hiragino Sans GB" w:eastAsia="Hiragino Sans GB" w:cs="Hiragino Sans GB"/>
-        </w:rPr>
-        <w:tab/>
-      </w:r>
-      <w:r>
-        <w:rPr>
           <w:rFonts w:hint="eastAsia" w:ascii="Hiragino Sans GB" w:hAnsi="Hiragino Sans GB" w:eastAsia="Hiragino Sans GB" w:cs="Hiragino Sans GB"/>
         </w:rPr>
         <w:t xml:space="preserve">为什么不做传统总体推断</w:t>
@@ -21313,19 +20819,6 @@
       </w:pPr>
       <w:r>
         <w:rPr>
-          <w:rStyle w:val="SectionNumber"/>
-          <w:rFonts w:ascii="Hiragino Sans GB" w:hAnsi="Hiragino Sans GB" w:eastAsia="Hiragino Sans GB" w:cs="Hiragino Sans GB"/>
-        </w:rPr>
-        <w:t xml:space="preserve">14</w:t>
-      </w:r>
-      <w:r>
-        <w:rPr>
-          <w:rFonts w:ascii="Hiragino Sans GB" w:hAnsi="Hiragino Sans GB" w:eastAsia="Hiragino Sans GB" w:cs="Hiragino Sans GB"/>
-        </w:rPr>
-        <w:tab/>
-      </w:r>
-      <w:r>
-        <w:rPr>
           <w:rFonts w:hint="eastAsia" w:ascii="Hiragino Sans GB" w:hAnsi="Hiragino Sans GB" w:eastAsia="Hiragino Sans GB" w:cs="Hiragino Sans GB"/>
         </w:rPr>
         <w:t xml:space="preserve">证据链为什么被设计得很严格</w:t>
@@ -21340,19 +20833,6 @@
       </w:pPr>
       <w:r>
         <w:rPr>
-          <w:rStyle w:val="SectionNumber"/>
-          <w:rFonts w:ascii="Hiragino Sans GB" w:hAnsi="Hiragino Sans GB" w:eastAsia="Hiragino Sans GB" w:cs="Hiragino Sans GB"/>
-        </w:rPr>
-        <w:t xml:space="preserve">14.1</w:t>
-      </w:r>
-      <w:r>
-        <w:rPr>
-          <w:rFonts w:ascii="Hiragino Sans GB" w:hAnsi="Hiragino Sans GB" w:eastAsia="Hiragino Sans GB" w:cs="Hiragino Sans GB"/>
-        </w:rPr>
-        <w:tab/>
-      </w:r>
-      <w:r>
-        <w:rPr>
           <w:rFonts w:hint="eastAsia" w:ascii="Hiragino Sans GB" w:hAnsi="Hiragino Sans GB" w:eastAsia="Hiragino Sans GB" w:cs="Hiragino Sans GB"/>
         </w:rPr>
         <w:t xml:space="preserve">三类源快照</w:t>
@@ -21571,19 +21051,6 @@
       </w:pPr>
       <w:r>
         <w:rPr>
-          <w:rStyle w:val="SectionNumber"/>
-          <w:rFonts w:ascii="Hiragino Sans GB" w:hAnsi="Hiragino Sans GB" w:eastAsia="Hiragino Sans GB" w:cs="Hiragino Sans GB"/>
-        </w:rPr>
-        <w:t xml:space="preserve">14.2</w:t>
-      </w:r>
-      <w:r>
-        <w:rPr>
-          <w:rFonts w:ascii="Hiragino Sans GB" w:hAnsi="Hiragino Sans GB" w:eastAsia="Hiragino Sans GB" w:cs="Hiragino Sans GB"/>
-        </w:rPr>
-        <w:tab/>
-      </w:r>
-      <w:r>
-        <w:rPr>
           <w:rFonts w:ascii="Hiragino Sans GB" w:hAnsi="Hiragino Sans GB" w:eastAsia="Hiragino Sans GB" w:cs="Hiragino Sans GB"/>
         </w:rPr>
         <w:t xml:space="preserve">S1 </w:t>
@@ -21846,19 +21313,6 @@
       </w:pPr>
       <w:r>
         <w:rPr>
-          <w:rStyle w:val="SectionNumber"/>
-          <w:rFonts w:ascii="Hiragino Sans GB" w:hAnsi="Hiragino Sans GB" w:eastAsia="Hiragino Sans GB" w:cs="Hiragino Sans GB"/>
-        </w:rPr>
-        <w:t xml:space="preserve">14.3</w:t>
-      </w:r>
-      <w:r>
-        <w:rPr>
-          <w:rFonts w:ascii="Hiragino Sans GB" w:hAnsi="Hiragino Sans GB" w:eastAsia="Hiragino Sans GB" w:cs="Hiragino Sans GB"/>
-        </w:rPr>
-        <w:tab/>
-      </w:r>
-      <w:r>
-        <w:rPr>
           <w:rFonts w:hint="eastAsia" w:ascii="Hiragino Sans GB" w:hAnsi="Hiragino Sans GB" w:eastAsia="Hiragino Sans GB" w:cs="Hiragino Sans GB"/>
         </w:rPr>
         <w:t xml:space="preserve">四层实验角色</w:t>
@@ -22112,19 +21566,6 @@
         <w:keepNext/>
         <w:keepLines/>
       </w:pPr>
-      <w:r>
-        <w:rPr>
-          <w:rStyle w:val="SectionNumber"/>
-          <w:rFonts w:ascii="Hiragino Sans GB" w:hAnsi="Hiragino Sans GB" w:eastAsia="Hiragino Sans GB" w:cs="Hiragino Sans GB"/>
-        </w:rPr>
-        <w:t xml:space="preserve">15</w:t>
-      </w:r>
-      <w:r>
-        <w:rPr>
-          <w:rFonts w:ascii="Hiragino Sans GB" w:hAnsi="Hiragino Sans GB" w:eastAsia="Hiragino Sans GB" w:cs="Hiragino Sans GB"/>
-        </w:rPr>
-        <w:tab/>
-      </w:r>
       <w:r>
         <w:rPr>
           <w:rFonts w:hint="eastAsia" w:ascii="Hiragino Sans GB" w:hAnsi="Hiragino Sans GB" w:eastAsia="Hiragino Sans GB" w:cs="Hiragino Sans GB"/>
@@ -22818,19 +22259,6 @@
       </w:pPr>
       <w:r>
         <w:rPr>
-          <w:rStyle w:val="SectionNumber"/>
-          <w:rFonts w:ascii="Hiragino Sans GB" w:hAnsi="Hiragino Sans GB" w:eastAsia="Hiragino Sans GB" w:cs="Hiragino Sans GB"/>
-        </w:rPr>
-        <w:t xml:space="preserve">16</w:t>
-      </w:r>
-      <w:r>
-        <w:rPr>
-          <w:rFonts w:ascii="Hiragino Sans GB" w:hAnsi="Hiragino Sans GB" w:eastAsia="Hiragino Sans GB" w:cs="Hiragino Sans GB"/>
-        </w:rPr>
-        <w:tab/>
-      </w:r>
-      <w:r>
-        <w:rPr>
           <w:rFonts w:hint="eastAsia" w:ascii="Hiragino Sans GB" w:hAnsi="Hiragino Sans GB" w:eastAsia="Hiragino Sans GB" w:cs="Hiragino Sans GB"/>
         </w:rPr>
         <w:t xml:space="preserve">论文真正可以声称什么</w:t>
@@ -22843,19 +22271,6 @@
         <w:keepNext/>
         <w:keepLines/>
       </w:pPr>
-      <w:r>
-        <w:rPr>
-          <w:rStyle w:val="SectionNumber"/>
-          <w:rFonts w:ascii="Hiragino Sans GB" w:hAnsi="Hiragino Sans GB" w:eastAsia="Hiragino Sans GB" w:cs="Hiragino Sans GB"/>
-        </w:rPr>
-        <w:t xml:space="preserve">16.1</w:t>
-      </w:r>
-      <w:r>
-        <w:rPr>
-          <w:rFonts w:ascii="Hiragino Sans GB" w:hAnsi="Hiragino Sans GB" w:eastAsia="Hiragino Sans GB" w:cs="Hiragino Sans GB"/>
-        </w:rPr>
-        <w:tab/>
-      </w:r>
       <w:r>
         <w:rPr>
           <w:rFonts w:hint="eastAsia" w:ascii="Hiragino Sans GB" w:hAnsi="Hiragino Sans GB" w:eastAsia="Hiragino Sans GB" w:cs="Hiragino Sans GB"/>
@@ -23137,19 +22552,6 @@
       </w:pPr>
       <w:r>
         <w:rPr>
-          <w:rStyle w:val="SectionNumber"/>
-          <w:rFonts w:ascii="Hiragino Sans GB" w:hAnsi="Hiragino Sans GB" w:eastAsia="Hiragino Sans GB" w:cs="Hiragino Sans GB"/>
-        </w:rPr>
-        <w:t xml:space="preserve">16.2</w:t>
-      </w:r>
-      <w:r>
-        <w:rPr>
-          <w:rFonts w:ascii="Hiragino Sans GB" w:hAnsi="Hiragino Sans GB" w:eastAsia="Hiragino Sans GB" w:cs="Hiragino Sans GB"/>
-        </w:rPr>
-        <w:tab/>
-      </w:r>
-      <w:r>
-        <w:rPr>
           <w:rFonts w:hint="eastAsia" w:ascii="Hiragino Sans GB" w:hAnsi="Hiragino Sans GB" w:eastAsia="Hiragino Sans GB" w:cs="Hiragino Sans GB"/>
         </w:rPr>
         <w:t xml:space="preserve">不能扩大成的主张</w:t>
@@ -23556,19 +22958,6 @@
       </w:pPr>
       <w:r>
         <w:rPr>
-          <w:rStyle w:val="SectionNumber"/>
-          <w:rFonts w:ascii="Hiragino Sans GB" w:hAnsi="Hiragino Sans GB" w:eastAsia="Hiragino Sans GB" w:cs="Hiragino Sans GB"/>
-        </w:rPr>
-        <w:t xml:space="preserve">17</w:t>
-      </w:r>
-      <w:r>
-        <w:rPr>
-          <w:rFonts w:ascii="Hiragino Sans GB" w:hAnsi="Hiragino Sans GB" w:eastAsia="Hiragino Sans GB" w:cs="Hiragino Sans GB"/>
-        </w:rPr>
-        <w:tab/>
-      </w:r>
-      <w:r>
-        <w:rPr>
           <w:rFonts w:hint="eastAsia" w:ascii="Hiragino Sans GB" w:hAnsi="Hiragino Sans GB" w:eastAsia="Hiragino Sans GB" w:cs="Hiragino Sans GB"/>
         </w:rPr>
         <w:t xml:space="preserve">这篇论文的叙事主线</w:t>
@@ -24015,19 +23404,6 @@
       </w:pPr>
       <w:r>
         <w:rPr>
-          <w:rStyle w:val="SectionNumber"/>
-          <w:rFonts w:ascii="Hiragino Sans GB" w:hAnsi="Hiragino Sans GB" w:eastAsia="Hiragino Sans GB" w:cs="Hiragino Sans GB"/>
-        </w:rPr>
-        <w:t xml:space="preserve">18</w:t>
-      </w:r>
-      <w:r>
-        <w:rPr>
-          <w:rFonts w:ascii="Hiragino Sans GB" w:hAnsi="Hiragino Sans GB" w:eastAsia="Hiragino Sans GB" w:cs="Hiragino Sans GB"/>
-        </w:rPr>
-        <w:tab/>
-      </w:r>
-      <w:r>
-        <w:rPr>
           <w:rFonts w:hint="eastAsia" w:ascii="Hiragino Sans GB" w:hAnsi="Hiragino Sans GB" w:eastAsia="Hiragino Sans GB" w:cs="Hiragino Sans GB"/>
         </w:rPr>
         <w:t xml:space="preserve">当前进度与剩余工作</w:t>
@@ -24290,7 +23666,7 @@
         <w:rPr>
           <w:rFonts w:hint="eastAsia" w:ascii="Hiragino Sans GB" w:hAnsi="Hiragino Sans GB" w:eastAsia="Hiragino Sans GB" w:cs="Hiragino Sans GB"/>
         </w:rPr>
-        <w:t xml:space="preserve">需要注意，仓库中的</w:t>
+        <w:t xml:space="preserve">本分支已把</w:t>
       </w:r>
       <w:r>
         <w:rPr>
@@ -24315,7 +23691,19 @@
         <w:rPr>
           <w:rFonts w:hint="eastAsia" w:ascii="Hiragino Sans GB" w:hAnsi="Hiragino Sans GB" w:eastAsia="Hiragino Sans GB" w:cs="Hiragino Sans GB"/>
         </w:rPr>
-        <w:t xml:space="preserve">仍有少量文字把</w:t>
+        <w:t xml:space="preserve">中落后于当前</w:t>
+      </w:r>
+      <w:r>
+        <w:rPr>
+          <w:rFonts w:ascii="Hiragino Sans GB" w:hAnsi="Hiragino Sans GB" w:eastAsia="Hiragino Sans GB" w:cs="Hiragino Sans GB"/>
+        </w:rPr>
+        <w:t xml:space="preserve"> S2 anchor </w:t>
+      </w:r>
+      <w:r>
+        <w:rPr>
+          <w:rFonts w:hint="eastAsia" w:ascii="Hiragino Sans GB" w:hAnsi="Hiragino Sans GB" w:eastAsia="Hiragino Sans GB" w:cs="Hiragino Sans GB"/>
+        </w:rPr>
+        <w:t xml:space="preserve">的</w:t>
       </w:r>
       <w:r>
         <w:rPr>
@@ -24327,7 +23715,19 @@
         <w:rPr>
           <w:rFonts w:hint="eastAsia" w:ascii="Hiragino Sans GB" w:hAnsi="Hiragino Sans GB" w:eastAsia="Hiragino Sans GB" w:cs="Hiragino Sans GB"/>
         </w:rPr>
-        <w:t xml:space="preserve">写成</w:t>
+        <w:t xml:space="preserve">状态同步为精确</w:t>
+      </w:r>
+      <w:r>
+        <w:rPr>
+          <w:rFonts w:ascii="Hiragino Sans GB" w:hAnsi="Hiragino Sans GB" w:eastAsia="Hiragino Sans GB" w:cs="Hiragino Sans GB"/>
+        </w:rPr>
+        <w:t xml:space="preserve"> S1/S2 </w:t>
+      </w:r>
+      <w:r>
+        <w:rPr>
+          <w:rFonts w:hint="eastAsia" w:ascii="Hiragino Sans GB" w:hAnsi="Hiragino Sans GB" w:eastAsia="Hiragino Sans GB" w:cs="Hiragino Sans GB"/>
+        </w:rPr>
+        <w:t xml:space="preserve">范围内的</w:t>
       </w:r>
       <w:r>
         <w:rPr>
@@ -24340,49 +23740,68 @@
           <w:rStyle w:val="VerbatimChar"/>
           <w:rFonts w:ascii="Hiragino Sans GB" w:hAnsi="Hiragino Sans GB" w:eastAsia="Hiragino Sans GB" w:cs="Hiragino Sans GB"/>
         </w:rPr>
+        <w:t xml:space="preserve">PASS</w:t>
+      </w:r>
+      <w:r>
+        <w:rPr>
+          <w:rFonts w:hint="eastAsia" w:ascii="Hiragino Sans GB" w:hAnsi="Hiragino Sans GB" w:eastAsia="Hiragino Sans GB" w:cs="Hiragino Sans GB"/>
+        </w:rPr>
+        <w:t xml:space="preserve">。该状态只说明固定候选目录可以被仓库承认，绝不等于</w:t>
+      </w:r>
+      <w:r>
+        <w:rPr>
+          <w:rFonts w:ascii="Hiragino Sans GB" w:hAnsi="Hiragino Sans GB" w:eastAsia="Hiragino Sans GB" w:cs="Hiragino Sans GB"/>
+        </w:rPr>
+        <w:t xml:space="preserve"> formal Day </w:t>
+      </w:r>
+      <w:r>
+        <w:rPr>
+          <w:rFonts w:hint="eastAsia" w:ascii="Hiragino Sans GB" w:hAnsi="Hiragino Sans GB" w:eastAsia="Hiragino Sans GB" w:cs="Hiragino Sans GB"/>
+        </w:rPr>
+        <w:t xml:space="preserve">1A、完整成本或经验结果已经产生；C3</w:t>
+      </w:r>
+      <w:r>
+        <w:rPr>
+          <w:rFonts w:ascii="Hiragino Sans GB" w:hAnsi="Hiragino Sans GB" w:eastAsia="Hiragino Sans GB" w:cs="Hiragino Sans GB"/>
+        </w:rPr>
+        <w:t xml:space="preserve"> </w:t>
+      </w:r>
+      <w:r>
+        <w:rPr>
+          <w:rFonts w:hint="eastAsia" w:ascii="Hiragino Sans GB" w:hAnsi="Hiragino Sans GB" w:eastAsia="Hiragino Sans GB" w:cs="Hiragino Sans GB"/>
+        </w:rPr>
+        <w:t xml:space="preserve">与所有经验</w:t>
+      </w:r>
+      <w:r>
+        <w:rPr>
+          <w:rFonts w:ascii="Hiragino Sans GB" w:hAnsi="Hiragino Sans GB" w:eastAsia="Hiragino Sans GB" w:cs="Hiragino Sans GB"/>
+        </w:rPr>
+        <w:t xml:space="preserve"> claim </w:t>
+      </w:r>
+      <w:r>
+        <w:rPr>
+          <w:rFonts w:hint="eastAsia" w:ascii="Hiragino Sans GB" w:hAnsi="Hiragino Sans GB" w:eastAsia="Hiragino Sans GB" w:cs="Hiragino Sans GB"/>
+        </w:rPr>
+        <w:t xml:space="preserve">仍保持</w:t>
+      </w:r>
+      <w:r>
+        <w:rPr>
+          <w:rFonts w:ascii="Hiragino Sans GB" w:hAnsi="Hiragino Sans GB" w:eastAsia="Hiragino Sans GB" w:cs="Hiragino Sans GB"/>
+        </w:rPr>
+        <w:t xml:space="preserve"> </w:t>
+      </w:r>
+      <w:r>
+        <w:rPr>
+          <w:rStyle w:val="VerbatimChar"/>
+          <w:rFonts w:ascii="Hiragino Sans GB" w:hAnsi="Hiragino Sans GB" w:eastAsia="Hiragino Sans GB" w:cs="Hiragino Sans GB"/>
+        </w:rPr>
         <w:t xml:space="preserve">HOLD</w:t>
       </w:r>
       <w:r>
         <w:rPr>
-          <w:rFonts w:hint="eastAsia" w:ascii="Hiragino Sans GB" w:hAnsi="Hiragino Sans GB" w:eastAsia="Hiragino Sans GB" w:cs="Hiragino Sans GB"/>
-        </w:rPr>
-        <w:t xml:space="preserve">，已经落后于当前</w:t>
-      </w:r>
-      <w:r>
-        <w:rPr>
-          <w:rFonts w:ascii="Hiragino Sans GB" w:hAnsi="Hiragino Sans GB" w:eastAsia="Hiragino Sans GB" w:cs="Hiragino Sans GB"/>
-        </w:rPr>
-        <w:t xml:space="preserve"> S2 </w:t>
-      </w:r>
-      <w:r>
-        <w:rPr>
-          <w:rFonts w:hint="eastAsia" w:ascii="Hiragino Sans GB" w:hAnsi="Hiragino Sans GB" w:eastAsia="Hiragino Sans GB" w:cs="Hiragino Sans GB"/>
-        </w:rPr>
-        <w:t xml:space="preserve">anchor；这应在下一个安全证据停点更新。但</w:t>
-      </w:r>
-      <w:r>
-        <w:rPr>
-          <w:rFonts w:ascii="Hiragino Sans GB" w:hAnsi="Hiragino Sans GB" w:eastAsia="Hiragino Sans GB" w:cs="Hiragino Sans GB"/>
-        </w:rPr>
-        <w:t xml:space="preserve"> registration </w:t>
-      </w:r>
-      <w:r>
-        <w:rPr>
-          <w:rFonts w:hint="eastAsia" w:ascii="Hiragino Sans GB" w:hAnsi="Hiragino Sans GB" w:eastAsia="Hiragino Sans GB" w:cs="Hiragino Sans GB"/>
-        </w:rPr>
-        <w:t xml:space="preserve">成功只说明固定候选目录可以被仓库承认，绝不等于</w:t>
-      </w:r>
-      <w:r>
-        <w:rPr>
-          <w:rFonts w:ascii="Hiragino Sans GB" w:hAnsi="Hiragino Sans GB" w:eastAsia="Hiragino Sans GB" w:cs="Hiragino Sans GB"/>
-        </w:rPr>
-        <w:t xml:space="preserve"> formal Day </w:t>
-      </w:r>
-      <w:r>
-        <w:rPr>
-          <w:rFonts w:hint="eastAsia" w:ascii="Hiragino Sans GB" w:hAnsi="Hiragino Sans GB" w:eastAsia="Hiragino Sans GB" w:cs="Hiragino Sans GB"/>
-        </w:rPr>
-        <w:t xml:space="preserve">1A、完整成本或经验结果已经产生。</w:t>
+          <w:rFonts w:ascii="Hiragino Sans GB" w:hAnsi="Hiragino Sans GB" w:eastAsia="Hiragino Sans GB" w:cs="Hiragino Sans GB"/>
+        </w:rPr>
+        <w:t xml:space="preserve">。</w:t>
       </w:r>
     </w:p>
     <w:p>
@@ -24690,19 +24109,6 @@
         <w:keepNext/>
         <w:keepLines/>
       </w:pPr>
-      <w:r>
-        <w:rPr>
-          <w:rStyle w:val="SectionNumber"/>
-          <w:rFonts w:ascii="Hiragino Sans GB" w:hAnsi="Hiragino Sans GB" w:eastAsia="Hiragino Sans GB" w:cs="Hiragino Sans GB"/>
-        </w:rPr>
-        <w:t xml:space="preserve">19</w:t>
-      </w:r>
-      <w:r>
-        <w:rPr>
-          <w:rFonts w:ascii="Hiragino Sans GB" w:hAnsi="Hiragino Sans GB" w:eastAsia="Hiragino Sans GB" w:cs="Hiragino Sans GB"/>
-        </w:rPr>
-        <w:tab/>
-      </w:r>
       <w:r>
         <w:rPr>
           <w:rFonts w:hint="eastAsia" w:ascii="Hiragino Sans GB" w:hAnsi="Hiragino Sans GB" w:eastAsia="Hiragino Sans GB" w:cs="Hiragino Sans GB"/>
@@ -24864,19 +24270,6 @@
         <w:keepNext/>
         <w:keepLines/>
       </w:pPr>
-      <w:r>
-        <w:rPr>
-          <w:rStyle w:val="SectionNumber"/>
-          <w:rFonts w:ascii="Hiragino Sans GB" w:hAnsi="Hiragino Sans GB" w:eastAsia="Hiragino Sans GB" w:cs="Hiragino Sans GB"/>
-        </w:rPr>
-        <w:t xml:space="preserve">20</w:t>
-      </w:r>
-      <w:r>
-        <w:rPr>
-          <w:rFonts w:ascii="Hiragino Sans GB" w:hAnsi="Hiragino Sans GB" w:eastAsia="Hiragino Sans GB" w:cs="Hiragino Sans GB"/>
-        </w:rPr>
-        <w:tab/>
-      </w:r>
       <w:r>
         <w:rPr>
           <w:rFonts w:hint="eastAsia" w:ascii="Hiragino Sans GB" w:hAnsi="Hiragino Sans GB" w:eastAsia="Hiragino Sans GB" w:cs="Hiragino Sans GB"/>

</xml_diff>

<commit_message>
paper: freeze Route C review manuscript
</commit_message>
<xml_diff>
--- a/docs/paper/paper-idea-detailed-zh.docx
+++ b/docs/paper/paper-idea-detailed-zh.docx
@@ -76,11 +76,24 @@
         <w:t xml:space="preserve">2026-08-30</w:t>
       </w:r>
     </w:p>
-    <w:bookmarkStart w:id="19" w:name="阅读提示"/>
+    <w:bookmarkStart w:id="161" w:name="阅读提示"/>
     <w:p>
       <w:pPr>
         <w:pStyle w:val="Heading1"/>
       </w:pPr>
+      <w:r>
+        <w:rPr>
+          <w:rStyle w:val="SectionNumber"/>
+          <w:rFonts w:ascii="Noto Sans CJK SC" w:hAnsi="Noto Sans CJK SC" w:eastAsia="Noto Sans CJK SC" w:cs="Noto Sans CJK SC" w:hint="eastAsia"/>
+        </w:rPr>
+        <w:t xml:space="preserve">1</w:t>
+      </w:r>
+      <w:r>
+        <w:rPr>
+          <w:rFonts w:ascii="Noto Sans CJK SC" w:hAnsi="Noto Sans CJK SC" w:eastAsia="Noto Sans CJK SC" w:cs="Noto Sans CJK SC" w:hint="eastAsia"/>
+        </w:rPr>
+        <w:tab/>
+      </w:r>
       <w:r>
         <w:rPr>
           <w:rFonts w:hint="eastAsia" w:ascii="Noto Sans CJK SC" w:hAnsi="Noto Sans CJK SC" w:eastAsia="Noto Sans CJK SC" w:cs="Noto Sans CJK SC"/>
@@ -984,12 +997,25 @@
         <w:t xml:space="preserve">后偷换身份再跑一次。</w:t>
       </w:r>
     </w:p>
-    <w:bookmarkEnd w:id="19"/>
-    <w:bookmarkStart w:id="20" w:name="一句话概括论文-idea"/>
+    <w:bookmarkEnd w:id="161"/>
+    <w:bookmarkStart w:id="165" w:name="一句话概括论文-idea"/>
     <w:p>
       <w:pPr>
         <w:pStyle w:val="Heading1"/>
       </w:pPr>
+      <w:r>
+        <w:rPr>
+          <w:rStyle w:val="SectionNumber"/>
+          <w:rFonts w:ascii="Noto Sans CJK SC" w:hAnsi="Noto Sans CJK SC" w:eastAsia="Noto Sans CJK SC" w:cs="Noto Sans CJK SC" w:hint="eastAsia"/>
+        </w:rPr>
+        <w:t xml:space="preserve">2</w:t>
+      </w:r>
+      <w:r>
+        <w:rPr>
+          <w:rFonts w:ascii="Noto Sans CJK SC" w:hAnsi="Noto Sans CJK SC" w:eastAsia="Noto Sans CJK SC" w:cs="Noto Sans CJK SC" w:hint="eastAsia"/>
+        </w:rPr>
+        <w:tab/>
+      </w:r>
       <w:r>
         <w:rPr>
           <w:rFonts w:hint="eastAsia" w:ascii="Noto Sans CJK SC" w:hAnsi="Noto Sans CJK SC" w:eastAsia="Noto Sans CJK SC" w:cs="Noto Sans CJK SC"/>
@@ -1215,24 +1241,149 @@
         <w:t xml:space="preserve">实测常数、通信字节和最终论文结论必须来自同一冻结行为与可重放工件。</w:t>
       </w:r>
     </w:p>
-    <w:bookmarkEnd w:id="20"/>
-    <w:bookmarkStart w:id="23" w:name="研究问题为什么存在"/>
+    <w:p>
+      <w:pPr>
+        <w:pStyle w:val="CaptionedFigure"/>
+        <w:keepNext/>
+        <w:jc w:val="center"/>
+      </w:pPr>
+      <w:r>
+        <w:rPr>
+          <w:rFonts w:ascii="Noto Sans CJK SC" w:hAnsi="Noto Sans CJK SC" w:eastAsia="Noto Sans CJK SC" w:cs="Noto Sans CJK SC" w:hint="eastAsia"/>
+        </w:rPr>
+        <w:drawing>
+          <wp:inline>
+            <wp:extent cx="5760720" cy="3127247"/>
+            <wp:effectExtent b="0" l="0" r="0" t="0"/>
+            <wp:docPr descr="版本绑定协议流程：矩阵更新、查询重排、Cloud 公开执行与 Client B 私有重构共同绑定到不可变版本。" title="Figure 1" id="163" name="Picture"/>
+            <a:graphic>
+              <a:graphicData uri="http://schemas.openxmlformats.org/drawingml/2006/picture">
+                <pic:pic>
+                  <pic:nvPicPr>
+                    <pic:cNvPr descr="assets/route-c-protocol-flow.png" id="164" name="Picture"/>
+                    <pic:cNvPicPr>
+                      <a:picLocks noChangeArrowheads="1" noChangeAspect="1"/>
+                    </pic:cNvPicPr>
+                  </pic:nvPicPr>
+                  <pic:blipFill>
+                    <a:blip r:embed="rId162"/>
+                    <a:stretch>
+                      <a:fillRect/>
+                    </a:stretch>
+                  </pic:blipFill>
+                  <pic:spPr bwMode="auto">
+                    <a:xfrm>
+                      <a:off x="0" y="0"/>
+                      <a:ext cx="5760720" cy="3127247"/>
+                    </a:xfrm>
+                    <a:prstGeom prst="rect">
+                      <a:avLst/>
+                    </a:prstGeom>
+                    <a:noFill/>
+                    <a:ln w="9525">
+                      <a:noFill/>
+                      <a:headEnd/>
+                      <a:tailEnd/>
+                    </a:ln>
+                  </pic:spPr>
+                </pic:pic>
+              </a:graphicData>
+            </a:graphic>
+          </wp:inline>
+        </w:drawing>
+      </w:r>
+    </w:p>
+    <w:p>
+      <w:pPr>
+        <w:pStyle w:val="ImageCaption"/>
+      </w:pPr>
+      <w:r>
+        <w:rPr>
+          <w:rFonts w:hint="eastAsia" w:ascii="Noto Sans CJK SC" w:hAnsi="Noto Sans CJK SC" w:eastAsia="Noto Sans CJK SC" w:cs="Noto Sans CJK SC"/>
+        </w:rPr>
+        <w:t xml:space="preserve">图</w:t>
+      </w:r>
+      <w:r>
+        <w:rPr>
+          <w:rFonts w:ascii="Noto Sans CJK SC" w:hAnsi="Noto Sans CJK SC" w:eastAsia="Noto Sans CJK SC" w:cs="Noto Sans CJK SC" w:hint="eastAsia"/>
+        </w:rPr>
+        <w:t xml:space="preserve"> </w:t>
+      </w:r>
+      <w:r>
+        <w:rPr>
+          <w:rFonts w:hint="eastAsia" w:ascii="Noto Sans CJK SC" w:hAnsi="Noto Sans CJK SC" w:eastAsia="Noto Sans CJK SC" w:cs="Noto Sans CJK SC"/>
+        </w:rPr>
+        <w:t xml:space="preserve">1：同一个不可变版本把更新、查询重排、Cloud</w:t>
+      </w:r>
+      <w:r>
+        <w:rPr>
+          <w:rFonts w:ascii="Noto Sans CJK SC" w:hAnsi="Noto Sans CJK SC" w:eastAsia="Noto Sans CJK SC" w:cs="Noto Sans CJK SC" w:hint="eastAsia"/>
+        </w:rPr>
+        <w:t xml:space="preserve"> </w:t>
+      </w:r>
+      <w:r>
+        <w:rPr>
+          <w:rFonts w:hint="eastAsia" w:ascii="Noto Sans CJK SC" w:hAnsi="Noto Sans CJK SC" w:eastAsia="Noto Sans CJK SC" w:cs="Noto Sans CJK SC"/>
+        </w:rPr>
+        <w:t xml:space="preserve">公开执行与</w:t>
+      </w:r>
+      <w:r>
+        <w:rPr>
+          <w:rFonts w:ascii="Noto Sans CJK SC" w:hAnsi="Noto Sans CJK SC" w:eastAsia="Noto Sans CJK SC" w:cs="Noto Sans CJK SC" w:hint="eastAsia"/>
+        </w:rPr>
+        <w:t xml:space="preserve"> Client B </w:t>
+      </w:r>
+      <w:r>
+        <w:rPr>
+          <w:rFonts w:hint="eastAsia" w:ascii="Noto Sans CJK SC" w:hAnsi="Noto Sans CJK SC" w:eastAsia="Noto Sans CJK SC" w:cs="Noto Sans CJK SC"/>
+        </w:rPr>
+        <w:t xml:space="preserve">私有重构闭合起来。</w:t>
+      </w:r>
+    </w:p>
+    <w:bookmarkEnd w:id="165"/>
+    <w:bookmarkStart w:id="168" w:name="研究问题为什么存在"/>
     <w:p>
       <w:pPr>
         <w:pStyle w:val="Heading1"/>
       </w:pPr>
       <w:r>
         <w:rPr>
+          <w:rStyle w:val="SectionNumber"/>
+          <w:rFonts w:ascii="Noto Sans CJK SC" w:hAnsi="Noto Sans CJK SC" w:eastAsia="Noto Sans CJK SC" w:cs="Noto Sans CJK SC" w:hint="eastAsia"/>
+        </w:rPr>
+        <w:t xml:space="preserve">3</w:t>
+      </w:r>
+      <w:r>
+        <w:rPr>
+          <w:rFonts w:ascii="Noto Sans CJK SC" w:hAnsi="Noto Sans CJK SC" w:eastAsia="Noto Sans CJK SC" w:cs="Noto Sans CJK SC" w:hint="eastAsia"/>
+        </w:rPr>
+        <w:tab/>
+      </w:r>
+      <w:r>
+        <w:rPr>
           <w:rFonts w:hint="eastAsia" w:ascii="Noto Sans CJK SC" w:hAnsi="Noto Sans CJK SC" w:eastAsia="Noto Sans CJK SC" w:cs="Noto Sans CJK SC"/>
         </w:rPr>
         <w:t xml:space="preserve">研究问题为什么存在</w:t>
       </w:r>
     </w:p>
-    <w:bookmarkStart w:id="21" w:name="静态-cssc-解决了什么"/>
+    <w:bookmarkStart w:id="166" w:name="静态-cssc-解决了什么"/>
     <w:p>
       <w:pPr>
         <w:pStyle w:val="Heading2"/>
       </w:pPr>
+      <w:r>
+        <w:rPr>
+          <w:rStyle w:val="SectionNumber"/>
+          <w:rFonts w:ascii="Noto Sans CJK SC" w:hAnsi="Noto Sans CJK SC" w:eastAsia="Noto Sans CJK SC" w:cs="Noto Sans CJK SC" w:hint="eastAsia"/>
+        </w:rPr>
+        <w:t xml:space="preserve">3.1</w:t>
+      </w:r>
+      <w:r>
+        <w:rPr>
+          <w:rFonts w:ascii="Noto Sans CJK SC" w:hAnsi="Noto Sans CJK SC" w:eastAsia="Noto Sans CJK SC" w:cs="Noto Sans CJK SC" w:hint="eastAsia"/>
+        </w:rPr>
+        <w:tab/>
+      </w:r>
       <w:r>
         <w:rPr>
           <w:rFonts w:hint="eastAsia" w:ascii="Noto Sans CJK SC" w:hAnsi="Noto Sans CJK SC" w:eastAsia="Noto Sans CJK SC" w:cs="Noto Sans CJK SC"/>
@@ -3186,12 +3337,25 @@
         <w:t xml:space="preserve">决定，不能只根据纸面表格猜测。</w:t>
       </w:r>
     </w:p>
-    <w:bookmarkEnd w:id="21"/>
-    <w:bookmarkStart w:id="22" w:name="朴素解法为什么可能太贵"/>
+    <w:bookmarkEnd w:id="166"/>
+    <w:bookmarkStart w:id="167" w:name="朴素解法为什么可能太贵"/>
     <w:p>
       <w:pPr>
         <w:pStyle w:val="Heading2"/>
       </w:pPr>
+      <w:r>
+        <w:rPr>
+          <w:rStyle w:val="SectionNumber"/>
+          <w:rFonts w:ascii="Noto Sans CJK SC" w:hAnsi="Noto Sans CJK SC" w:eastAsia="Noto Sans CJK SC" w:cs="Noto Sans CJK SC" w:hint="eastAsia"/>
+        </w:rPr>
+        <w:t xml:space="preserve">3.2</w:t>
+      </w:r>
+      <w:r>
+        <w:rPr>
+          <w:rFonts w:ascii="Noto Sans CJK SC" w:hAnsi="Noto Sans CJK SC" w:eastAsia="Noto Sans CJK SC" w:cs="Noto Sans CJK SC" w:hint="eastAsia"/>
+        </w:rPr>
+        <w:tab/>
+      </w:r>
       <w:r>
         <w:rPr>
           <w:rFonts w:hint="eastAsia" w:ascii="Noto Sans CJK SC" w:hAnsi="Noto Sans CJK SC" w:eastAsia="Noto Sans CJK SC" w:cs="Noto Sans CJK SC"/>
@@ -3745,15 +3909,28 @@
         <w:t xml:space="preserve">区域。</w:t>
       </w:r>
     </w:p>
-    <w:bookmarkEnd w:id="22"/>
-    <w:bookmarkEnd w:id="23"/>
-    <w:bookmarkStart w:id="38" w:name="与已有工作的边界本文的新意只剩什么"/>
+    <w:bookmarkEnd w:id="167"/>
+    <w:bookmarkEnd w:id="168"/>
+    <w:bookmarkStart w:id="183" w:name="与已有工作的边界本文的新意只剩什么"/>
     <w:p>
       <w:pPr>
         <w:pStyle w:val="Heading1"/>
       </w:pPr>
       <w:r>
         <w:rPr>
+          <w:rStyle w:val="SectionNumber"/>
+          <w:rFonts w:ascii="Noto Sans CJK SC" w:hAnsi="Noto Sans CJK SC" w:eastAsia="Noto Sans CJK SC" w:cs="Noto Sans CJK SC" w:hint="eastAsia"/>
+        </w:rPr>
+        <w:t xml:space="preserve">4</w:t>
+      </w:r>
+      <w:r>
+        <w:rPr>
+          <w:rFonts w:ascii="Noto Sans CJK SC" w:hAnsi="Noto Sans CJK SC" w:eastAsia="Noto Sans CJK SC" w:cs="Noto Sans CJK SC" w:hint="eastAsia"/>
+        </w:rPr>
+        <w:tab/>
+      </w:r>
+      <w:r>
+        <w:rPr>
           <w:rFonts w:hint="eastAsia" w:ascii="Noto Sans CJK SC" w:hAnsi="Noto Sans CJK SC" w:eastAsia="Noto Sans CJK SC" w:cs="Noto Sans CJK SC"/>
         </w:rPr>
         <w:t xml:space="preserve">与已有工作的边界：本文的新意只剩什么</w:t>
@@ -3795,11 +3972,24 @@
         <w:t xml:space="preserve">叙事。</w:t>
       </w:r>
     </w:p>
-    <w:bookmarkStart w:id="31" w:name="静态加密稀疏线性代数已经很丰富"/>
+    <w:bookmarkStart w:id="176" w:name="静态加密稀疏线性代数已经很丰富"/>
     <w:p>
       <w:pPr>
         <w:pStyle w:val="Heading2"/>
       </w:pPr>
+      <w:r>
+        <w:rPr>
+          <w:rStyle w:val="SectionNumber"/>
+          <w:rFonts w:ascii="Noto Sans CJK SC" w:hAnsi="Noto Sans CJK SC" w:eastAsia="Noto Sans CJK SC" w:cs="Noto Sans CJK SC" w:hint="eastAsia"/>
+        </w:rPr>
+        <w:t xml:space="preserve">4.1</w:t>
+      </w:r>
+      <w:r>
+        <w:rPr>
+          <w:rFonts w:ascii="Noto Sans CJK SC" w:hAnsi="Noto Sans CJK SC" w:eastAsia="Noto Sans CJK SC" w:cs="Noto Sans CJK SC" w:hint="eastAsia"/>
+        </w:rPr>
+        <w:tab/>
+      </w:r>
       <w:r>
         <w:rPr>
           <w:rFonts w:hint="eastAsia" w:ascii="Noto Sans CJK SC" w:hAnsi="Noto Sans CJK SC" w:eastAsia="Noto Sans CJK SC" w:cs="Noto Sans CJK SC"/>
@@ -3815,7 +4005,7 @@
           <w:numId w:val="1003"/>
         </w:numPr>
       </w:pPr>
-      <w:hyperlink r:id="rId24">
+      <w:hyperlink r:id="rId169">
         <w:r>
           <w:rPr>
             <w:rStyle w:val="Hyperlink"/>
@@ -3875,7 +4065,7 @@
           <w:numId w:val="1003"/>
         </w:numPr>
       </w:pPr>
-      <w:hyperlink r:id="rId25">
+      <w:hyperlink r:id="rId170">
         <w:r>
           <w:rPr>
             <w:rStyle w:val="Hyperlink"/>
@@ -3919,7 +4109,7 @@
         </w:rPr>
         <w:t xml:space="preserve">decomposition；</w:t>
       </w:r>
-      <w:hyperlink r:id="rId26">
+      <w:hyperlink r:id="rId171">
         <w:r>
           <w:rPr>
             <w:rStyle w:val="Hyperlink"/>
@@ -3972,7 +4162,7 @@
           <w:numId w:val="1003"/>
         </w:numPr>
       </w:pPr>
-      <w:hyperlink r:id="rId27">
+      <w:hyperlink r:id="rId172">
         <w:r>
           <w:rPr>
             <w:rStyle w:val="Hyperlink"/>
@@ -4028,7 +4218,7 @@
         </w:rPr>
         <w:t xml:space="preserve">indices，并利用双方稀疏性；</w:t>
       </w:r>
-      <w:hyperlink r:id="rId28">
+      <w:hyperlink r:id="rId173">
         <w:r>
           <w:rPr>
             <w:rStyle w:val="Hyperlink"/>
@@ -4183,7 +4373,7 @@
         </w:rPr>
         <w:t xml:space="preserve"> </w:t>
       </w:r>
-      <w:hyperlink r:id="rId29">
+      <w:hyperlink r:id="rId174">
         <w:r>
           <w:rPr>
             <w:rStyle w:val="Hyperlink"/>
@@ -4221,7 +4411,7 @@
         </w:rPr>
         <w:t xml:space="preserve"> </w:t>
       </w:r>
-      <w:hyperlink r:id="rId30">
+      <w:hyperlink r:id="rId175">
         <w:r>
           <w:rPr>
             <w:rStyle w:val="Hyperlink"/>
@@ -4404,14 +4594,27 @@
         <w:t xml:space="preserve"> publication-state maintenance。</w:t>
       </w:r>
     </w:p>
-    <w:bookmarkEnd w:id="31"/>
-    <w:bookmarkStart w:id="36" w:name="动态版本和掩码也不是孤立的新原语"/>
+    <w:bookmarkEnd w:id="176"/>
+    <w:bookmarkStart w:id="181" w:name="动态版本和掩码也不是孤立的新原语"/>
     <w:p>
       <w:pPr>
         <w:pStyle w:val="Heading2"/>
       </w:pPr>
       <w:r>
         <w:rPr>
+          <w:rStyle w:val="SectionNumber"/>
+          <w:rFonts w:ascii="Noto Sans CJK SC" w:hAnsi="Noto Sans CJK SC" w:eastAsia="Noto Sans CJK SC" w:cs="Noto Sans CJK SC" w:hint="eastAsia"/>
+        </w:rPr>
+        <w:t xml:space="preserve">4.2</w:t>
+      </w:r>
+      <w:r>
+        <w:rPr>
+          <w:rFonts w:ascii="Noto Sans CJK SC" w:hAnsi="Noto Sans CJK SC" w:eastAsia="Noto Sans CJK SC" w:cs="Noto Sans CJK SC" w:hint="eastAsia"/>
+        </w:rPr>
+        <w:tab/>
+      </w:r>
+      <w:r>
+        <w:rPr>
           <w:rFonts w:hint="eastAsia" w:ascii="Noto Sans CJK SC" w:hAnsi="Noto Sans CJK SC" w:eastAsia="Noto Sans CJK SC" w:cs="Noto Sans CJK SC"/>
         </w:rPr>
         <w:t xml:space="preserve">动态、版本和掩码也不是孤立的新原语</w:t>
@@ -4421,7 +4624,7 @@
       <w:pPr>
         <w:pStyle w:val="FirstParagraph"/>
       </w:pPr>
-      <w:hyperlink r:id="rId32">
+      <w:hyperlink r:id="rId177">
         <w:r>
           <w:rPr>
             <w:rStyle w:val="Hyperlink"/>
@@ -4477,7 +4680,7 @@
         </w:rPr>
         <w:t xml:space="preserve">本身还可能显著增加存储与通信成本。</w:t>
       </w:r>
-      <w:hyperlink r:id="rId33">
+      <w:hyperlink r:id="rId178">
         <w:r>
           <w:rPr>
             <w:rStyle w:val="Hyperlink"/>
@@ -4562,7 +4765,7 @@
       <w:pPr>
         <w:pStyle w:val="BodyText"/>
       </w:pPr>
-      <w:hyperlink r:id="rId34">
+      <w:hyperlink r:id="rId179">
         <w:r>
           <w:rPr>
             <w:rStyle w:val="Hyperlink"/>
@@ -4606,7 +4809,7 @@
         </w:rPr>
         <w:t xml:space="preserve">shares，</w:t>
       </w:r>
-      <w:hyperlink r:id="rId35">
+      <w:hyperlink r:id="rId180">
         <w:r>
           <w:rPr>
             <w:rStyle w:val="Hyperlink"/>
@@ -4828,12 +5031,25 @@
         <w:t xml:space="preserve">被重复使用。</w:t>
       </w:r>
     </w:p>
-    <w:bookmarkEnd w:id="36"/>
-    <w:bookmarkStart w:id="37" w:name="因而最终只能采用窄-gap-statement"/>
+    <w:bookmarkEnd w:id="181"/>
+    <w:bookmarkStart w:id="182" w:name="因而最终只能采用窄-gap-statement"/>
     <w:p>
       <w:pPr>
         <w:pStyle w:val="Heading2"/>
       </w:pPr>
+      <w:r>
+        <w:rPr>
+          <w:rStyle w:val="SectionNumber"/>
+          <w:rFonts w:ascii="Noto Sans CJK SC" w:hAnsi="Noto Sans CJK SC" w:eastAsia="Noto Sans CJK SC" w:cs="Noto Sans CJK SC" w:hint="eastAsia"/>
+        </w:rPr>
+        <w:t xml:space="preserve">4.3</w:t>
+      </w:r>
+      <w:r>
+        <w:rPr>
+          <w:rFonts w:ascii="Noto Sans CJK SC" w:hAnsi="Noto Sans CJK SC" w:eastAsia="Noto Sans CJK SC" w:cs="Noto Sans CJK SC" w:hint="eastAsia"/>
+        </w:rPr>
+        <w:tab/>
+      </w:r>
       <w:r>
         <w:rPr>
           <w:rFonts w:hint="eastAsia" w:ascii="Noto Sans CJK SC" w:hAnsi="Noto Sans CJK SC" w:eastAsia="Noto Sans CJK SC" w:cs="Noto Sans CJK SC"/>
@@ -5215,13 +5431,26 @@
         <w:t xml:space="preserve"> baseline。</w:t>
       </w:r>
     </w:p>
-    <w:bookmarkEnd w:id="37"/>
-    <w:bookmarkEnd w:id="38"/>
-    <w:bookmarkStart w:id="39" w:name="系统与威胁模型"/>
+    <w:bookmarkEnd w:id="182"/>
+    <w:bookmarkEnd w:id="183"/>
+    <w:bookmarkStart w:id="184" w:name="系统与威胁模型"/>
     <w:p>
       <w:pPr>
         <w:pStyle w:val="Heading1"/>
       </w:pPr>
+      <w:r>
+        <w:rPr>
+          <w:rStyle w:val="SectionNumber"/>
+          <w:rFonts w:ascii="Noto Sans CJK SC" w:hAnsi="Noto Sans CJK SC" w:eastAsia="Noto Sans CJK SC" w:cs="Noto Sans CJK SC" w:hint="eastAsia"/>
+        </w:rPr>
+        <w:t xml:space="preserve">5</w:t>
+      </w:r>
+      <w:r>
+        <w:rPr>
+          <w:rFonts w:ascii="Noto Sans CJK SC" w:hAnsi="Noto Sans CJK SC" w:eastAsia="Noto Sans CJK SC" w:cs="Noto Sans CJK SC" w:hint="eastAsia"/>
+        </w:rPr>
+        <w:tab/>
+      </w:r>
       <w:r>
         <w:rPr>
           <w:rFonts w:hint="eastAsia" w:ascii="Noto Sans CJK SC" w:hAnsi="Noto Sans CJK SC" w:eastAsia="Noto Sans CJK SC" w:cs="Noto Sans CJK SC"/>
@@ -5851,14 +6080,27 @@
         <w:t xml:space="preserve"> simulation-based security proof。</w:t>
       </w:r>
     </w:p>
-    <w:bookmarkEnd w:id="39"/>
-    <w:bookmarkStart w:id="43" w:name="核心设计一版本绑定-publication-window"/>
+    <w:bookmarkEnd w:id="184"/>
+    <w:bookmarkStart w:id="188" w:name="核心设计一版本绑定-publication-window"/>
     <w:p>
       <w:pPr>
         <w:pStyle w:val="Heading1"/>
       </w:pPr>
       <w:r>
         <w:rPr>
+          <w:rStyle w:val="SectionNumber"/>
+          <w:rFonts w:ascii="Noto Sans CJK SC" w:hAnsi="Noto Sans CJK SC" w:eastAsia="Noto Sans CJK SC" w:cs="Noto Sans CJK SC" w:hint="eastAsia"/>
+        </w:rPr>
+        <w:t xml:space="preserve">6</w:t>
+      </w:r>
+      <w:r>
+        <w:rPr>
+          <w:rFonts w:ascii="Noto Sans CJK SC" w:hAnsi="Noto Sans CJK SC" w:eastAsia="Noto Sans CJK SC" w:cs="Noto Sans CJK SC" w:hint="eastAsia"/>
+        </w:rPr>
+        <w:tab/>
+      </w:r>
+      <w:r>
+        <w:rPr>
           <w:rFonts w:hint="eastAsia" w:ascii="Noto Sans CJK SC" w:hAnsi="Noto Sans CJK SC" w:eastAsia="Noto Sans CJK SC" w:cs="Noto Sans CJK SC"/>
         </w:rPr>
         <w:t xml:space="preserve">核心设计一：版本绑定</w:t>
@@ -5870,11 +6112,24 @@
         <w:t xml:space="preserve"> Publication Window</w:t>
       </w:r>
     </w:p>
-    <w:bookmarkStart w:id="40" w:name="版本化状态"/>
+    <w:bookmarkStart w:id="185" w:name="版本化状态"/>
     <w:p>
       <w:pPr>
         <w:pStyle w:val="Heading2"/>
       </w:pPr>
+      <w:r>
+        <w:rPr>
+          <w:rStyle w:val="SectionNumber"/>
+          <w:rFonts w:ascii="Noto Sans CJK SC" w:hAnsi="Noto Sans CJK SC" w:eastAsia="Noto Sans CJK SC" w:cs="Noto Sans CJK SC" w:hint="eastAsia"/>
+        </w:rPr>
+        <w:t xml:space="preserve">6.1</w:t>
+      </w:r>
+      <w:r>
+        <w:rPr>
+          <w:rFonts w:ascii="Noto Sans CJK SC" w:hAnsi="Noto Sans CJK SC" w:eastAsia="Noto Sans CJK SC" w:cs="Noto Sans CJK SC" w:hint="eastAsia"/>
+        </w:rPr>
+        <w:tab/>
+      </w:r>
       <w:r>
         <w:rPr>
           <w:rFonts w:hint="eastAsia" w:ascii="Noto Sans CJK SC" w:hAnsi="Noto Sans CJK SC" w:eastAsia="Noto Sans CJK SC" w:cs="Noto Sans CJK SC"/>
@@ -6622,12 +6877,25 @@
         </m:oMath>
       </m:oMathPara>
     </w:p>
-    <w:bookmarkEnd w:id="40"/>
-    <w:bookmarkStart w:id="41" w:name="原子提交规则"/>
+    <w:bookmarkEnd w:id="185"/>
+    <w:bookmarkStart w:id="186" w:name="原子提交规则"/>
     <w:p>
       <w:pPr>
         <w:pStyle w:val="Heading2"/>
       </w:pPr>
+      <w:r>
+        <w:rPr>
+          <w:rStyle w:val="SectionNumber"/>
+          <w:rFonts w:ascii="Noto Sans CJK SC" w:hAnsi="Noto Sans CJK SC" w:eastAsia="Noto Sans CJK SC" w:cs="Noto Sans CJK SC" w:hint="eastAsia"/>
+        </w:rPr>
+        <w:t xml:space="preserve">6.2</w:t>
+      </w:r>
+      <w:r>
+        <w:rPr>
+          <w:rFonts w:ascii="Noto Sans CJK SC" w:hAnsi="Noto Sans CJK SC" w:eastAsia="Noto Sans CJK SC" w:cs="Noto Sans CJK SC" w:hint="eastAsia"/>
+        </w:rPr>
+        <w:tab/>
+      </w:r>
       <w:r>
         <w:rPr>
           <w:rFonts w:hint="eastAsia" w:ascii="Noto Sans CJK SC" w:hAnsi="Noto Sans CJK SC" w:eastAsia="Noto Sans CJK SC" w:cs="Noto Sans CJK SC"/>
@@ -7464,12 +7732,25 @@
         <w:t xml:space="preserve">基础设施重跑外，不做选择性重试。</w:t>
       </w:r>
     </w:p>
-    <w:bookmarkEnd w:id="41"/>
-    <w:bookmarkStart w:id="42" w:name="publication-window"/>
+    <w:bookmarkEnd w:id="186"/>
+    <w:bookmarkStart w:id="187" w:name="publication-window"/>
     <w:p>
       <w:pPr>
         <w:pStyle w:val="Heading2"/>
       </w:pPr>
+      <w:r>
+        <w:rPr>
+          <w:rStyle w:val="SectionNumber"/>
+          <w:rFonts w:ascii="Noto Sans CJK SC" w:hAnsi="Noto Sans CJK SC" w:eastAsia="Noto Sans CJK SC" w:cs="Noto Sans CJK SC" w:hint="eastAsia"/>
+        </w:rPr>
+        <w:t xml:space="preserve">6.3</w:t>
+      </w:r>
+      <w:r>
+        <w:rPr>
+          <w:rFonts w:ascii="Noto Sans CJK SC" w:hAnsi="Noto Sans CJK SC" w:eastAsia="Noto Sans CJK SC" w:cs="Noto Sans CJK SC" w:hint="eastAsia"/>
+        </w:rPr>
+        <w:tab/>
+      </w:r>
       <w:r>
         <w:rPr>
           <w:rFonts w:ascii="Noto Sans CJK SC" w:hAnsi="Noto Sans CJK SC" w:eastAsia="Noto Sans CJK SC" w:cs="Noto Sans CJK SC" w:hint="eastAsia"/>
@@ -7804,13 +8085,26 @@
         <w:t xml:space="preserve">流量无限推迟新鲜度边界。窗口不能切开一个原子事件组。</w:t>
       </w:r>
     </w:p>
-    <w:bookmarkEnd w:id="42"/>
-    <w:bookmarkEnd w:id="43"/>
-    <w:bookmarkStart w:id="44" w:name="核心设计二版本化查询重排而不是列号取模"/>
+    <w:bookmarkEnd w:id="187"/>
+    <w:bookmarkEnd w:id="188"/>
+    <w:bookmarkStart w:id="189" w:name="核心设计二版本化查询重排而不是列号取模"/>
     <w:p>
       <w:pPr>
         <w:pStyle w:val="Heading1"/>
       </w:pPr>
+      <w:r>
+        <w:rPr>
+          <w:rStyle w:val="SectionNumber"/>
+          <w:rFonts w:ascii="Noto Sans CJK SC" w:hAnsi="Noto Sans CJK SC" w:eastAsia="Noto Sans CJK SC" w:cs="Noto Sans CJK SC" w:hint="eastAsia"/>
+        </w:rPr>
+        <w:t xml:space="preserve">7</w:t>
+      </w:r>
+      <w:r>
+        <w:rPr>
+          <w:rFonts w:ascii="Noto Sans CJK SC" w:hAnsi="Noto Sans CJK SC" w:eastAsia="Noto Sans CJK SC" w:cs="Noto Sans CJK SC" w:hint="eastAsia"/>
+        </w:rPr>
+        <w:tab/>
+      </w:r>
       <w:r>
         <w:rPr>
           <w:rFonts w:hint="eastAsia" w:ascii="Noto Sans CJK SC" w:hAnsi="Noto Sans CJK SC" w:eastAsia="Noto Sans CJK SC" w:cs="Noto Sans CJK SC"/>
@@ -8109,13 +8403,38 @@
         <w:rPr>
           <w:rFonts w:ascii="Noto Sans CJK SC" w:hAnsi="Noto Sans CJK SC" w:eastAsia="Noto Sans CJK SC" w:cs="Noto Sans CJK SC" w:hint="eastAsia"/>
         </w:rPr>
-        <w:t xml:space="preserve"> lane </w:t>
-      </w:r>
-      <w:r>
-        <w:rPr>
-          <w:rFonts w:hint="eastAsia" w:ascii="Noto Sans CJK SC" w:hAnsi="Noto Sans CJK SC" w:eastAsia="Noto Sans CJK SC" w:cs="Noto Sans CJK SC"/>
-        </w:rPr>
-        <w:t xml:space="preserve">保存的全局列编号为</w:t>
+        <w:t xml:space="preserve"> value lane </w:t>
+      </w:r>
+      <w:r>
+        <w:rPr>
+          <w:rFonts w:hint="eastAsia" w:ascii="Noto Sans CJK SC" w:hAnsi="Noto Sans CJK SC" w:eastAsia="Noto Sans CJK SC" w:cs="Noto Sans CJK SC"/>
+        </w:rPr>
+        <w:t xml:space="preserve">与并行</w:t>
+      </w:r>
+      <w:r>
+        <w:rPr>
+          <w:rFonts w:ascii="Noto Sans CJK SC" w:hAnsi="Noto Sans CJK SC" w:eastAsia="Noto Sans CJK SC" w:cs="Noto Sans CJK SC" w:hint="eastAsia"/>
+        </w:rPr>
+        <w:t xml:space="preserve"> </w:t>
+      </w:r>
+      <w:r>
+        <w:rPr>
+          <w:rStyle w:val="VerbatimChar"/>
+          <w:rFonts w:ascii="Noto Sans CJK SC" w:hAnsi="Noto Sans CJK SC" w:eastAsia="Noto Sans CJK SC" w:cs="Noto Sans CJK SC" w:hint="eastAsia"/>
+        </w:rPr>
+        <w:t xml:space="preserve">ColumnIndex</w:t>
+      </w:r>
+      <w:r>
+        <w:rPr>
+          <w:rFonts w:ascii="Noto Sans CJK SC" w:hAnsi="Noto Sans CJK SC" w:eastAsia="Noto Sans CJK SC" w:cs="Noto Sans CJK SC" w:hint="eastAsia"/>
+        </w:rPr>
+        <w:t xml:space="preserve"> </w:t>
+      </w:r>
+      <w:r>
+        <w:rPr>
+          <w:rFonts w:hint="eastAsia" w:ascii="Noto Sans CJK SC" w:hAnsi="Noto Sans CJK SC" w:eastAsia="Noto Sans CJK SC" w:cs="Noto Sans CJK SC"/>
+        </w:rPr>
+        <w:t xml:space="preserve">条目中的全局列编号</w:t>
       </w:r>
       <w:r>
         <w:rPr>
@@ -8159,7 +8478,19 @@
         <w:rPr>
           <w:rFonts w:ascii="Noto Sans CJK SC" w:hAnsi="Noto Sans CJK SC" w:eastAsia="Noto Sans CJK SC" w:cs="Noto Sans CJK SC" w:hint="eastAsia"/>
         </w:rPr>
-        <w:t xml:space="preserve">。Client B </w:t>
+        <w:t xml:space="preserve"> </w:t>
+      </w:r>
+      <w:r>
+        <w:rPr>
+          <w:rFonts w:hint="eastAsia" w:ascii="Noto Sans CJK SC" w:hAnsi="Noto Sans CJK SC" w:eastAsia="Noto Sans CJK SC" w:cs="Noto Sans CJK SC"/>
+        </w:rPr>
+        <w:t xml:space="preserve">成对。Client</w:t>
+      </w:r>
+      <w:r>
+        <w:rPr>
+          <w:rFonts w:ascii="Noto Sans CJK SC" w:hAnsi="Noto Sans CJK SC" w:eastAsia="Noto Sans CJK SC" w:cs="Noto Sans CJK SC" w:hint="eastAsia"/>
+        </w:rPr>
+        <w:t xml:space="preserve"> B </w:t>
       </w:r>
       <w:r>
         <w:rPr>
@@ -8645,14 +8976,27 @@
         <w:t xml:space="preserve"> typed bundle。</w:t>
       </w:r>
     </w:p>
-    <w:bookmarkEnd w:id="44"/>
-    <w:bookmarkStart w:id="48" w:name="核心设计三outputplan-统一重叠拼接和隐式零"/>
+    <w:bookmarkEnd w:id="189"/>
+    <w:bookmarkStart w:id="193" w:name="核心设计三outputplan-统一重叠拼接和隐式零"/>
     <w:p>
       <w:pPr>
         <w:pStyle w:val="Heading1"/>
       </w:pPr>
       <w:r>
         <w:rPr>
+          <w:rStyle w:val="SectionNumber"/>
+          <w:rFonts w:ascii="Noto Sans CJK SC" w:hAnsi="Noto Sans CJK SC" w:eastAsia="Noto Sans CJK SC" w:cs="Noto Sans CJK SC" w:hint="eastAsia"/>
+        </w:rPr>
+        <w:t xml:space="preserve">8</w:t>
+      </w:r>
+      <w:r>
+        <w:rPr>
+          <w:rFonts w:ascii="Noto Sans CJK SC" w:hAnsi="Noto Sans CJK SC" w:eastAsia="Noto Sans CJK SC" w:cs="Noto Sans CJK SC" w:hint="eastAsia"/>
+        </w:rPr>
+        <w:tab/>
+      </w:r>
+      <w:r>
+        <w:rPr>
           <w:rFonts w:hint="eastAsia" w:ascii="Noto Sans CJK SC" w:hAnsi="Noto Sans CJK SC" w:eastAsia="Noto Sans CJK SC" w:cs="Noto Sans CJK SC"/>
         </w:rPr>
         <w:t xml:space="preserve">核心设计三：OutputPlan</w:t>
@@ -8670,11 +9014,24 @@
         <w:t xml:space="preserve">统一重叠、拼接和隐式零</w:t>
       </w:r>
     </w:p>
-    <w:bookmarkStart w:id="45" w:name="为什么不能把所有返回密文直接相加"/>
+    <w:bookmarkStart w:id="190" w:name="为什么不能把所有返回密文直接相加"/>
     <w:p>
       <w:pPr>
         <w:pStyle w:val="Heading2"/>
       </w:pPr>
+      <w:r>
+        <w:rPr>
+          <w:rStyle w:val="SectionNumber"/>
+          <w:rFonts w:ascii="Noto Sans CJK SC" w:hAnsi="Noto Sans CJK SC" w:eastAsia="Noto Sans CJK SC" w:cs="Noto Sans CJK SC" w:hint="eastAsia"/>
+        </w:rPr>
+        <w:t xml:space="preserve">8.1</w:t>
+      </w:r>
+      <w:r>
+        <w:rPr>
+          <w:rFonts w:ascii="Noto Sans CJK SC" w:hAnsi="Noto Sans CJK SC" w:eastAsia="Noto Sans CJK SC" w:cs="Noto Sans CJK SC" w:hint="eastAsia"/>
+        </w:rPr>
+        <w:tab/>
+      </w:r>
       <w:r>
         <w:rPr>
           <w:rFonts w:hint="eastAsia" w:ascii="Noto Sans CJK SC" w:hAnsi="Noto Sans CJK SC" w:eastAsia="Noto Sans CJK SC" w:cs="Noto Sans CJK SC"/>
@@ -8761,12 +9118,25 @@
         <w:t xml:space="preserve">如果只看“返回了几个密文”，无法区分这三种情况。</w:t>
       </w:r>
     </w:p>
-    <w:bookmarkEnd w:id="45"/>
-    <w:bookmarkStart w:id="46" w:name="映射与贡献集合"/>
+    <w:bookmarkEnd w:id="190"/>
+    <w:bookmarkStart w:id="191" w:name="映射与贡献集合"/>
     <w:p>
       <w:pPr>
         <w:pStyle w:val="Heading2"/>
       </w:pPr>
+      <w:r>
+        <w:rPr>
+          <w:rStyle w:val="SectionNumber"/>
+          <w:rFonts w:ascii="Noto Sans CJK SC" w:hAnsi="Noto Sans CJK SC" w:eastAsia="Noto Sans CJK SC" w:cs="Noto Sans CJK SC" w:hint="eastAsia"/>
+        </w:rPr>
+        <w:t xml:space="preserve">8.2</w:t>
+      </w:r>
+      <w:r>
+        <w:rPr>
+          <w:rFonts w:ascii="Noto Sans CJK SC" w:hAnsi="Noto Sans CJK SC" w:eastAsia="Noto Sans CJK SC" w:cs="Noto Sans CJK SC" w:hint="eastAsia"/>
+        </w:rPr>
+        <w:tab/>
+      </w:r>
       <w:r>
         <w:rPr>
           <w:rFonts w:hint="eastAsia" w:ascii="Noto Sans CJK SC" w:hAnsi="Noto Sans CJK SC" w:eastAsia="Noto Sans CJK SC" w:cs="Noto Sans CJK SC"/>
@@ -9781,12 +10151,25 @@
         <w:t xml:space="preserve">不会被误加，重叠坐标也不会被误拼接。</w:t>
       </w:r>
     </w:p>
-    <w:bookmarkEnd w:id="46"/>
-    <w:bookmarkStart w:id="47" w:name="公开摘要与私有计划"/>
+    <w:bookmarkEnd w:id="191"/>
+    <w:bookmarkStart w:id="192" w:name="公开摘要与私有计划"/>
     <w:p>
       <w:pPr>
         <w:pStyle w:val="Heading2"/>
       </w:pPr>
+      <w:r>
+        <w:rPr>
+          <w:rStyle w:val="SectionNumber"/>
+          <w:rFonts w:ascii="Noto Sans CJK SC" w:hAnsi="Noto Sans CJK SC" w:eastAsia="Noto Sans CJK SC" w:cs="Noto Sans CJK SC" w:hint="eastAsia"/>
+        </w:rPr>
+        <w:t xml:space="preserve">8.3</w:t>
+      </w:r>
+      <w:r>
+        <w:rPr>
+          <w:rFonts w:ascii="Noto Sans CJK SC" w:hAnsi="Noto Sans CJK SC" w:eastAsia="Noto Sans CJK SC" w:cs="Noto Sans CJK SC" w:hint="eastAsia"/>
+        </w:rPr>
+        <w:tab/>
+      </w:r>
       <w:r>
         <w:rPr>
           <w:rFonts w:hint="eastAsia" w:ascii="Noto Sans CJK SC" w:hAnsi="Noto Sans CJK SC" w:eastAsia="Noto Sans CJK SC" w:cs="Noto Sans CJK SC"/>
@@ -10633,15 +11016,28 @@
         <w:t xml:space="preserve">按完整计划恢复。</w:t>
       </w:r>
     </w:p>
-    <w:bookmarkEnd w:id="47"/>
-    <w:bookmarkEnd w:id="48"/>
-    <w:bookmarkStart w:id="53" w:name="核心设计四只对真实重叠做-f1-m-零和掩码"/>
+    <w:bookmarkEnd w:id="192"/>
+    <w:bookmarkEnd w:id="193"/>
+    <w:bookmarkStart w:id="198" w:name="核心设计四只对真实重叠做-f1-m-零和掩码"/>
     <w:p>
       <w:pPr>
         <w:pStyle w:val="Heading1"/>
       </w:pPr>
       <w:r>
         <w:rPr>
+          <w:rStyle w:val="SectionNumber"/>
+          <w:rFonts w:ascii="Noto Sans CJK SC" w:hAnsi="Noto Sans CJK SC" w:eastAsia="Noto Sans CJK SC" w:cs="Noto Sans CJK SC" w:hint="eastAsia"/>
+        </w:rPr>
+        <w:t xml:space="preserve">9</w:t>
+      </w:r>
+      <w:r>
+        <w:rPr>
+          <w:rFonts w:ascii="Noto Sans CJK SC" w:hAnsi="Noto Sans CJK SC" w:eastAsia="Noto Sans CJK SC" w:cs="Noto Sans CJK SC" w:hint="eastAsia"/>
+        </w:rPr>
+        <w:tab/>
+      </w:r>
+      <w:r>
+        <w:rPr>
           <w:rFonts w:hint="eastAsia" w:ascii="Noto Sans CJK SC" w:hAnsi="Noto Sans CJK SC" w:eastAsia="Noto Sans CJK SC" w:cs="Noto Sans CJK SC"/>
         </w:rPr>
         <w:t xml:space="preserve">核心设计四：只对真实重叠做</w:t>
@@ -10659,13 +11055,26 @@
         <w:t xml:space="preserve">零和掩码</w:t>
       </w:r>
     </w:p>
-    <w:bookmarkStart w:id="49" w:name="目标"/>
+    <w:bookmarkStart w:id="194" w:name="目标"/>
     <w:p>
       <w:pPr>
         <w:pStyle w:val="Heading2"/>
       </w:pPr>
       <w:r>
         <w:rPr>
+          <w:rStyle w:val="SectionNumber"/>
+          <w:rFonts w:ascii="Noto Sans CJK SC" w:hAnsi="Noto Sans CJK SC" w:eastAsia="Noto Sans CJK SC" w:cs="Noto Sans CJK SC" w:hint="eastAsia"/>
+        </w:rPr>
+        <w:t xml:space="preserve">9.1</w:t>
+      </w:r>
+      <w:r>
+        <w:rPr>
+          <w:rFonts w:ascii="Noto Sans CJK SC" w:hAnsi="Noto Sans CJK SC" w:eastAsia="Noto Sans CJK SC" w:cs="Noto Sans CJK SC" w:hint="eastAsia"/>
+        </w:rPr>
+        <w:tab/>
+      </w:r>
+      <w:r>
+        <w:rPr>
           <w:rFonts w:hint="eastAsia" w:ascii="Noto Sans CJK SC" w:hAnsi="Noto Sans CJK SC" w:eastAsia="Noto Sans CJK SC" w:cs="Noto Sans CJK SC"/>
         </w:rPr>
         <w:t xml:space="preserve">目标</w:t>
@@ -10766,12 +11175,25 @@
         <w:t xml:space="preserve">上，并把“一次性”要求变成持久化、可失败关闭的绑定。</w:t>
       </w:r>
     </w:p>
-    <w:bookmarkEnd w:id="49"/>
-    <w:bookmarkStart w:id="50" w:name="零和构造"/>
+    <w:bookmarkEnd w:id="194"/>
+    <w:bookmarkStart w:id="195" w:name="零和构造"/>
     <w:p>
       <w:pPr>
         <w:pStyle w:val="Heading2"/>
       </w:pPr>
+      <w:r>
+        <w:rPr>
+          <w:rStyle w:val="SectionNumber"/>
+          <w:rFonts w:ascii="Noto Sans CJK SC" w:hAnsi="Noto Sans CJK SC" w:eastAsia="Noto Sans CJK SC" w:cs="Noto Sans CJK SC" w:hint="eastAsia"/>
+        </w:rPr>
+        <w:t xml:space="preserve">9.2</w:t>
+      </w:r>
+      <w:r>
+        <w:rPr>
+          <w:rFonts w:ascii="Noto Sans CJK SC" w:hAnsi="Noto Sans CJK SC" w:eastAsia="Noto Sans CJK SC" w:cs="Noto Sans CJK SC" w:hint="eastAsia"/>
+        </w:rPr>
+        <w:tab/>
+      </w:r>
       <w:r>
         <w:rPr>
           <w:rFonts w:hint="eastAsia" w:ascii="Noto Sans CJK SC" w:hAnsi="Noto Sans CJK SC" w:eastAsia="Noto Sans CJK SC" w:cs="Noto Sans CJK SC"/>
@@ -12259,12 +12681,25 @@
         <w:t xml:space="preserve">门禁证明，当前文字不得把代数抵消等式写成已经完成的安全证明。</w:t>
       </w:r>
     </w:p>
-    <w:bookmarkEnd w:id="50"/>
-    <w:bookmarkStart w:id="51" w:name="为什么-multiplicity-为-0-或-1-时不应随机掩码"/>
+    <w:bookmarkEnd w:id="195"/>
+    <w:bookmarkStart w:id="196" w:name="为什么-multiplicity-为-0-或-1-时不应随机掩码"/>
     <w:p>
       <w:pPr>
         <w:pStyle w:val="Heading2"/>
       </w:pPr>
+      <w:r>
+        <w:rPr>
+          <w:rStyle w:val="SectionNumber"/>
+          <w:rFonts w:ascii="Noto Sans CJK SC" w:hAnsi="Noto Sans CJK SC" w:eastAsia="Noto Sans CJK SC" w:cs="Noto Sans CJK SC" w:hint="eastAsia"/>
+        </w:rPr>
+        <w:t xml:space="preserve">9.3</w:t>
+      </w:r>
+      <w:r>
+        <w:rPr>
+          <w:rFonts w:ascii="Noto Sans CJK SC" w:hAnsi="Noto Sans CJK SC" w:eastAsia="Noto Sans CJK SC" w:cs="Noto Sans CJK SC" w:hint="eastAsia"/>
+        </w:rPr>
+        <w:tab/>
+      </w:r>
       <w:r>
         <w:rPr>
           <w:rFonts w:hint="eastAsia" w:ascii="Noto Sans CJK SC" w:hAnsi="Noto Sans CJK SC" w:eastAsia="Noto Sans CJK SC" w:cs="Noto Sans CJK SC"/>
@@ -12485,12 +12920,25 @@
         <w:t xml:space="preserve">。它和随机零和掩码是两个不同的成本类别，不能混算。</w:t>
       </w:r>
     </w:p>
-    <w:bookmarkEnd w:id="51"/>
-    <w:bookmarkStart w:id="52" w:name="reserve-before-sample"/>
+    <w:bookmarkEnd w:id="196"/>
+    <w:bookmarkStart w:id="197" w:name="reserve-before-sample"/>
     <w:p>
       <w:pPr>
         <w:pStyle w:val="Heading2"/>
       </w:pPr>
+      <w:r>
+        <w:rPr>
+          <w:rStyle w:val="SectionNumber"/>
+          <w:rFonts w:ascii="Noto Sans CJK SC" w:hAnsi="Noto Sans CJK SC" w:eastAsia="Noto Sans CJK SC" w:cs="Noto Sans CJK SC" w:hint="eastAsia"/>
+        </w:rPr>
+        <w:t xml:space="preserve">9.4</w:t>
+      </w:r>
+      <w:r>
+        <w:rPr>
+          <w:rFonts w:ascii="Noto Sans CJK SC" w:hAnsi="Noto Sans CJK SC" w:eastAsia="Noto Sans CJK SC" w:cs="Noto Sans CJK SC" w:hint="eastAsia"/>
+        </w:rPr>
+        <w:tab/>
+      </w:r>
       <w:r>
         <w:rPr>
           <w:rFonts w:ascii="Noto Sans CJK SC" w:hAnsi="Noto Sans CJK SC" w:eastAsia="Noto Sans CJK SC" w:cs="Noto Sans CJK SC" w:hint="eastAsia"/>
@@ -12739,15 +13187,28 @@
         <w:t xml:space="preserve">模型。仓库回滚、数据库复制、跨设备协调或数据库被攻破不在当前安全主张内。</w:t>
       </w:r>
     </w:p>
-    <w:bookmarkEnd w:id="52"/>
-    <w:bookmarkEnd w:id="53"/>
-    <w:bookmarkStart w:id="57" w:name="核心设计五固定分段-strong-delta"/>
+    <w:bookmarkEnd w:id="197"/>
+    <w:bookmarkEnd w:id="198"/>
+    <w:bookmarkStart w:id="202" w:name="核心设计五固定分段-strong-delta"/>
     <w:p>
       <w:pPr>
         <w:pStyle w:val="Heading1"/>
       </w:pPr>
       <w:r>
         <w:rPr>
+          <w:rStyle w:val="SectionNumber"/>
+          <w:rFonts w:ascii="Noto Sans CJK SC" w:hAnsi="Noto Sans CJK SC" w:eastAsia="Noto Sans CJK SC" w:cs="Noto Sans CJK SC" w:hint="eastAsia"/>
+        </w:rPr>
+        <w:t xml:space="preserve">10</w:t>
+      </w:r>
+      <w:r>
+        <w:rPr>
+          <w:rFonts w:ascii="Noto Sans CJK SC" w:hAnsi="Noto Sans CJK SC" w:eastAsia="Noto Sans CJK SC" w:cs="Noto Sans CJK SC" w:hint="eastAsia"/>
+        </w:rPr>
+        <w:tab/>
+      </w:r>
+      <w:r>
+        <w:rPr>
           <w:rFonts w:hint="eastAsia" w:ascii="Noto Sans CJK SC" w:hAnsi="Noto Sans CJK SC" w:eastAsia="Noto Sans CJK SC" w:cs="Noto Sans CJK SC"/>
         </w:rPr>
         <w:t xml:space="preserve">核心设计五：固定分段</w:t>
@@ -12759,11 +13220,24 @@
         <w:t xml:space="preserve"> strong delta</w:t>
       </w:r>
     </w:p>
-    <w:bookmarkStart w:id="54" w:name="设计动机"/>
+    <w:bookmarkStart w:id="199" w:name="设计动机"/>
     <w:p>
       <w:pPr>
         <w:pStyle w:val="Heading2"/>
       </w:pPr>
+      <w:r>
+        <w:rPr>
+          <w:rStyle w:val="SectionNumber"/>
+          <w:rFonts w:ascii="Noto Sans CJK SC" w:hAnsi="Noto Sans CJK SC" w:eastAsia="Noto Sans CJK SC" w:cs="Noto Sans CJK SC" w:hint="eastAsia"/>
+        </w:rPr>
+        <w:t xml:space="preserve">10.1</w:t>
+      </w:r>
+      <w:r>
+        <w:rPr>
+          <w:rFonts w:ascii="Noto Sans CJK SC" w:hAnsi="Noto Sans CJK SC" w:eastAsia="Noto Sans CJK SC" w:cs="Noto Sans CJK SC" w:hint="eastAsia"/>
+        </w:rPr>
+        <w:tab/>
+      </w:r>
       <w:r>
         <w:rPr>
           <w:rFonts w:hint="eastAsia" w:ascii="Noto Sans CJK SC" w:hAnsi="Noto Sans CJK SC" w:eastAsia="Noto Sans CJK SC" w:cs="Noto Sans CJK SC"/>
@@ -13164,12 +13638,25 @@
         <w:t xml:space="preserve">由固定宽度段组成。</w:t>
       </w:r>
     </w:p>
-    <w:bookmarkEnd w:id="54"/>
-    <w:bookmarkStart w:id="55" w:name="固定宽度与页面"/>
+    <w:bookmarkEnd w:id="199"/>
+    <w:bookmarkStart w:id="200" w:name="固定宽度与页面"/>
     <w:p>
       <w:pPr>
         <w:pStyle w:val="Heading2"/>
       </w:pPr>
+      <w:r>
+        <w:rPr>
+          <w:rStyle w:val="SectionNumber"/>
+          <w:rFonts w:ascii="Noto Sans CJK SC" w:hAnsi="Noto Sans CJK SC" w:eastAsia="Noto Sans CJK SC" w:cs="Noto Sans CJK SC" w:hint="eastAsia"/>
+        </w:rPr>
+        <w:t xml:space="preserve">10.2</w:t>
+      </w:r>
+      <w:r>
+        <w:rPr>
+          <w:rFonts w:ascii="Noto Sans CJK SC" w:hAnsi="Noto Sans CJK SC" w:eastAsia="Noto Sans CJK SC" w:cs="Noto Sans CJK SC" w:hint="eastAsia"/>
+        </w:rPr>
+        <w:tab/>
+      </w:r>
       <w:r>
         <w:rPr>
           <w:rFonts w:hint="eastAsia" w:ascii="Noto Sans CJK SC" w:hAnsi="Noto Sans CJK SC" w:eastAsia="Noto Sans CJK SC" w:cs="Noto Sans CJK SC"/>
@@ -13430,12 +13917,25 @@
         <w:t xml:space="preserve">对所有矩阵都最优”。</w:t>
       </w:r>
     </w:p>
-    <w:bookmarkEnd w:id="55"/>
-    <w:bookmarkStart w:id="56" w:name="cloud-侧固定-reduction"/>
+    <w:bookmarkEnd w:id="200"/>
+    <w:bookmarkStart w:id="201" w:name="cloud-侧固定-reduction"/>
     <w:p>
       <w:pPr>
         <w:pStyle w:val="Heading2"/>
       </w:pPr>
+      <w:r>
+        <w:rPr>
+          <w:rStyle w:val="SectionNumber"/>
+          <w:rFonts w:ascii="Noto Sans CJK SC" w:hAnsi="Noto Sans CJK SC" w:eastAsia="Noto Sans CJK SC" w:cs="Noto Sans CJK SC" w:hint="eastAsia"/>
+        </w:rPr>
+        <w:t xml:space="preserve">10.3</w:t>
+      </w:r>
+      <w:r>
+        <w:rPr>
+          <w:rFonts w:ascii="Noto Sans CJK SC" w:hAnsi="Noto Sans CJK SC" w:eastAsia="Noto Sans CJK SC" w:cs="Noto Sans CJK SC" w:hint="eastAsia"/>
+        </w:rPr>
+        <w:tab/>
+      </w:r>
       <w:r>
         <w:rPr>
           <w:rFonts w:ascii="Noto Sans CJK SC" w:hAnsi="Noto Sans CJK SC" w:eastAsia="Noto Sans CJK SC" w:cs="Noto Sans CJK SC" w:hint="eastAsia"/>
@@ -14608,13 +15108,26 @@
         <w:t xml:space="preserve">dummy。由此既保持执行图的类型稳定，又把两类对象分别计费。</w:t>
       </w:r>
     </w:p>
-    <w:bookmarkEnd w:id="56"/>
-    <w:bookmarkEnd w:id="57"/>
-    <w:bookmarkStart w:id="58" w:name="三个固定策略不是在线万能选择器"/>
+    <w:bookmarkEnd w:id="201"/>
+    <w:bookmarkEnd w:id="202"/>
+    <w:bookmarkStart w:id="203" w:name="三个固定策略不是在线万能选择器"/>
     <w:p>
       <w:pPr>
         <w:pStyle w:val="Heading1"/>
       </w:pPr>
+      <w:r>
+        <w:rPr>
+          <w:rStyle w:val="SectionNumber"/>
+          <w:rFonts w:ascii="Noto Sans CJK SC" w:hAnsi="Noto Sans CJK SC" w:eastAsia="Noto Sans CJK SC" w:cs="Noto Sans CJK SC" w:hint="eastAsia"/>
+        </w:rPr>
+        <w:t xml:space="preserve">11</w:t>
+      </w:r>
+      <w:r>
+        <w:rPr>
+          <w:rFonts w:ascii="Noto Sans CJK SC" w:hAnsi="Noto Sans CJK SC" w:eastAsia="Noto Sans CJK SC" w:cs="Noto Sans CJK SC" w:hint="eastAsia"/>
+        </w:rPr>
+        <w:tab/>
+      </w:r>
       <w:r>
         <w:rPr>
           <w:rFonts w:hint="eastAsia" w:ascii="Noto Sans CJK SC" w:hAnsi="Noto Sans CJK SC" w:eastAsia="Noto Sans CJK SC" w:cs="Noto Sans CJK SC"/>
@@ -14938,24 +15451,50 @@
         <w:t xml:space="preserve">中，三个固定机制分别付出什么代价。</w:t>
       </w:r>
     </w:p>
-    <w:bookmarkEnd w:id="58"/>
-    <w:bookmarkStart w:id="62" w:name="成本与测量口径"/>
+    <w:bookmarkEnd w:id="203"/>
+    <w:bookmarkStart w:id="207" w:name="成本与测量口径"/>
     <w:p>
       <w:pPr>
         <w:pStyle w:val="Heading1"/>
       </w:pPr>
       <w:r>
         <w:rPr>
+          <w:rStyle w:val="SectionNumber"/>
+          <w:rFonts w:ascii="Noto Sans CJK SC" w:hAnsi="Noto Sans CJK SC" w:eastAsia="Noto Sans CJK SC" w:cs="Noto Sans CJK SC" w:hint="eastAsia"/>
+        </w:rPr>
+        <w:t xml:space="preserve">12</w:t>
+      </w:r>
+      <w:r>
+        <w:rPr>
+          <w:rFonts w:ascii="Noto Sans CJK SC" w:hAnsi="Noto Sans CJK SC" w:eastAsia="Noto Sans CJK SC" w:cs="Noto Sans CJK SC" w:hint="eastAsia"/>
+        </w:rPr>
+        <w:tab/>
+      </w:r>
+      <w:r>
+        <w:rPr>
           <w:rFonts w:hint="eastAsia" w:ascii="Noto Sans CJK SC" w:hAnsi="Noto Sans CJK SC" w:eastAsia="Noto Sans CJK SC" w:cs="Noto Sans CJK SC"/>
         </w:rPr>
         <w:t xml:space="preserve">成本与测量口径</w:t>
       </w:r>
     </w:p>
-    <w:bookmarkStart w:id="59" w:name="五类证据必须分开"/>
+    <w:bookmarkStart w:id="204" w:name="五类证据必须分开"/>
     <w:p>
       <w:pPr>
         <w:pStyle w:val="Heading2"/>
       </w:pPr>
+      <w:r>
+        <w:rPr>
+          <w:rStyle w:val="SectionNumber"/>
+          <w:rFonts w:ascii="Noto Sans CJK SC" w:hAnsi="Noto Sans CJK SC" w:eastAsia="Noto Sans CJK SC" w:cs="Noto Sans CJK SC" w:hint="eastAsia"/>
+        </w:rPr>
+        <w:t xml:space="preserve">12.1</w:t>
+      </w:r>
+      <w:r>
+        <w:rPr>
+          <w:rFonts w:ascii="Noto Sans CJK SC" w:hAnsi="Noto Sans CJK SC" w:eastAsia="Noto Sans CJK SC" w:cs="Noto Sans CJK SC" w:hint="eastAsia"/>
+        </w:rPr>
+        <w:tab/>
+      </w:r>
       <w:r>
         <w:rPr>
           <w:rFonts w:hint="eastAsia" w:ascii="Noto Sans CJK SC" w:hAnsi="Noto Sans CJK SC" w:eastAsia="Noto Sans CJK SC" w:cs="Noto Sans CJK SC"/>
@@ -16156,12 +16695,25 @@
         <w:t xml:space="preserve">外推。</w:t>
       </w:r>
     </w:p>
-    <w:bookmarkEnd w:id="59"/>
-    <w:bookmarkStart w:id="60" w:name="通信字节与带宽换算"/>
+    <w:bookmarkEnd w:id="204"/>
+    <w:bookmarkStart w:id="205" w:name="通信字节与带宽换算"/>
     <w:p>
       <w:pPr>
         <w:pStyle w:val="Heading2"/>
       </w:pPr>
+      <w:r>
+        <w:rPr>
+          <w:rStyle w:val="SectionNumber"/>
+          <w:rFonts w:ascii="Noto Sans CJK SC" w:hAnsi="Noto Sans CJK SC" w:eastAsia="Noto Sans CJK SC" w:cs="Noto Sans CJK SC" w:hint="eastAsia"/>
+        </w:rPr>
+        <w:t xml:space="preserve">12.2</w:t>
+      </w:r>
+      <w:r>
+        <w:rPr>
+          <w:rFonts w:ascii="Noto Sans CJK SC" w:hAnsi="Noto Sans CJK SC" w:eastAsia="Noto Sans CJK SC" w:cs="Noto Sans CJK SC" w:hint="eastAsia"/>
+        </w:rPr>
+        <w:tab/>
+      </w:r>
       <w:r>
         <w:rPr>
           <w:rFonts w:hint="eastAsia" w:ascii="Noto Sans CJK SC" w:hAnsi="Noto Sans CJK SC" w:eastAsia="Noto Sans CJK SC" w:cs="Noto Sans CJK SC"/>
@@ -16667,12 +17219,25 @@
         <w:t xml:space="preserve">通信。</w:t>
       </w:r>
     </w:p>
-    <w:bookmarkEnd w:id="60"/>
-    <w:bookmarkStart w:id="61" w:name="openfhe-原生-case-不与-simulator-混加"/>
+    <w:bookmarkEnd w:id="205"/>
+    <w:bookmarkStart w:id="206" w:name="openfhe-原生-case-不与-simulator-混加"/>
     <w:p>
       <w:pPr>
         <w:pStyle w:val="Heading2"/>
       </w:pPr>
+      <w:r>
+        <w:rPr>
+          <w:rStyle w:val="SectionNumber"/>
+          <w:rFonts w:ascii="Noto Sans CJK SC" w:hAnsi="Noto Sans CJK SC" w:eastAsia="Noto Sans CJK SC" w:cs="Noto Sans CJK SC" w:hint="eastAsia"/>
+        </w:rPr>
+        <w:t xml:space="preserve">12.3</w:t>
+      </w:r>
+      <w:r>
+        <w:rPr>
+          <w:rFonts w:ascii="Noto Sans CJK SC" w:hAnsi="Noto Sans CJK SC" w:eastAsia="Noto Sans CJK SC" w:cs="Noto Sans CJK SC" w:hint="eastAsia"/>
+        </w:rPr>
+        <w:tab/>
+      </w:r>
       <w:r>
         <w:rPr>
           <w:rFonts w:ascii="Noto Sans CJK SC" w:hAnsi="Noto Sans CJK SC" w:eastAsia="Noto Sans CJK SC" w:cs="Noto Sans CJK SC" w:hint="eastAsia"/>
@@ -17322,25 +17887,51 @@
         <w:t xml:space="preserve">完全相同。</w:t>
       </w:r>
     </w:p>
-    <w:bookmarkEnd w:id="61"/>
-    <w:bookmarkEnd w:id="62"/>
-    <w:bookmarkStart w:id="67" w:name="三类正式实验矩阵"/>
+    <w:bookmarkEnd w:id="206"/>
+    <w:bookmarkEnd w:id="207"/>
+    <w:bookmarkStart w:id="212" w:name="三类正式实验矩阵"/>
     <w:p>
       <w:pPr>
         <w:pStyle w:val="Heading1"/>
       </w:pPr>
       <w:r>
         <w:rPr>
+          <w:rStyle w:val="SectionNumber"/>
+          <w:rFonts w:ascii="Noto Sans CJK SC" w:hAnsi="Noto Sans CJK SC" w:eastAsia="Noto Sans CJK SC" w:cs="Noto Sans CJK SC" w:hint="eastAsia"/>
+        </w:rPr>
+        <w:t xml:space="preserve">13</w:t>
+      </w:r>
+      <w:r>
+        <w:rPr>
+          <w:rFonts w:ascii="Noto Sans CJK SC" w:hAnsi="Noto Sans CJK SC" w:eastAsia="Noto Sans CJK SC" w:cs="Noto Sans CJK SC" w:hint="eastAsia"/>
+        </w:rPr>
+        <w:tab/>
+      </w:r>
+      <w:r>
+        <w:rPr>
           <w:rFonts w:hint="eastAsia" w:ascii="Noto Sans CJK SC" w:hAnsi="Noto Sans CJK SC" w:eastAsia="Noto Sans CJK SC" w:cs="Noto Sans CJK SC"/>
         </w:rPr>
         <w:t xml:space="preserve">三类正式实验矩阵</w:t>
       </w:r>
     </w:p>
-    <w:bookmarkStart w:id="63" w:name="合成矩阵两个规模三个种子四个-rho"/>
+    <w:bookmarkStart w:id="208" w:name="合成矩阵两个规模三个种子四个-rho"/>
     <w:p>
       <w:pPr>
         <w:pStyle w:val="Heading2"/>
       </w:pPr>
+      <w:r>
+        <w:rPr>
+          <w:rStyle w:val="SectionNumber"/>
+          <w:rFonts w:ascii="Noto Sans CJK SC" w:hAnsi="Noto Sans CJK SC" w:eastAsia="Noto Sans CJK SC" w:cs="Noto Sans CJK SC" w:hint="eastAsia"/>
+        </w:rPr>
+        <w:t xml:space="preserve">13.1</w:t>
+      </w:r>
+      <w:r>
+        <w:rPr>
+          <w:rFonts w:ascii="Noto Sans CJK SC" w:hAnsi="Noto Sans CJK SC" w:eastAsia="Noto Sans CJK SC" w:cs="Noto Sans CJK SC" w:hint="eastAsia"/>
+        </w:rPr>
+        <w:tab/>
+      </w:r>
       <w:r>
         <w:rPr>
           <w:rFonts w:hint="eastAsia" w:ascii="Noto Sans CJK SC" w:hAnsi="Noto Sans CJK SC" w:eastAsia="Noto Sans CJK SC" w:cs="Noto Sans CJK SC"/>
@@ -18298,12 +18889,25 @@
         <w:t xml:space="preserve"> shard fail closed。</w:t>
       </w:r>
     </w:p>
-    <w:bookmarkEnd w:id="63"/>
-    <w:bookmarkStart w:id="64" w:name="单一真实来源snap-stack-overflow-a2q"/>
+    <w:bookmarkEnd w:id="208"/>
+    <w:bookmarkStart w:id="209" w:name="单一真实来源snap-stack-overflow-a2q"/>
     <w:p>
       <w:pPr>
         <w:pStyle w:val="Heading2"/>
       </w:pPr>
+      <w:r>
+        <w:rPr>
+          <w:rStyle w:val="SectionNumber"/>
+          <w:rFonts w:ascii="Noto Sans CJK SC" w:hAnsi="Noto Sans CJK SC" w:eastAsia="Noto Sans CJK SC" w:cs="Noto Sans CJK SC" w:hint="eastAsia"/>
+        </w:rPr>
+        <w:t xml:space="preserve">13.2</w:t>
+      </w:r>
+      <w:r>
+        <w:rPr>
+          <w:rFonts w:ascii="Noto Sans CJK SC" w:hAnsi="Noto Sans CJK SC" w:eastAsia="Noto Sans CJK SC" w:cs="Noto Sans CJK SC" w:hint="eastAsia"/>
+        </w:rPr>
+        <w:tab/>
+      </w:r>
       <w:r>
         <w:rPr>
           <w:rFonts w:hint="eastAsia" w:ascii="Noto Sans CJK SC" w:hAnsi="Noto Sans CJK SC" w:eastAsia="Noto Sans CJK SC" w:cs="Noto Sans CJK SC"/>
@@ -19073,12 +19677,25 @@
         <w:t xml:space="preserve">稳健性外推。</w:t>
       </w:r>
     </w:p>
-    <w:bookmarkEnd w:id="64"/>
-    <w:bookmarkStart w:id="65" w:name="当前源码-openfhe-矩阵"/>
+    <w:bookmarkEnd w:id="209"/>
+    <w:bookmarkStart w:id="210" w:name="当前源码-openfhe-矩阵"/>
     <w:p>
       <w:pPr>
         <w:pStyle w:val="Heading2"/>
       </w:pPr>
+      <w:r>
+        <w:rPr>
+          <w:rStyle w:val="SectionNumber"/>
+          <w:rFonts w:ascii="Noto Sans CJK SC" w:hAnsi="Noto Sans CJK SC" w:eastAsia="Noto Sans CJK SC" w:cs="Noto Sans CJK SC" w:hint="eastAsia"/>
+        </w:rPr>
+        <w:t xml:space="preserve">13.3</w:t>
+      </w:r>
+      <w:r>
+        <w:rPr>
+          <w:rFonts w:ascii="Noto Sans CJK SC" w:hAnsi="Noto Sans CJK SC" w:eastAsia="Noto Sans CJK SC" w:cs="Noto Sans CJK SC" w:hint="eastAsia"/>
+        </w:rPr>
+        <w:tab/>
+      </w:r>
       <w:r>
         <w:rPr>
           <w:rFonts w:hint="eastAsia" w:ascii="Noto Sans CJK SC" w:hAnsi="Noto Sans CJK SC" w:eastAsia="Noto Sans CJK SC" w:cs="Noto Sans CJK SC"/>
@@ -19448,12 +20065,25 @@
         <w:t xml:space="preserve">被重放。</w:t>
       </w:r>
     </w:p>
-    <w:bookmarkEnd w:id="65"/>
-    <w:bookmarkStart w:id="66" w:name="完整工件数量"/>
+    <w:bookmarkEnd w:id="210"/>
+    <w:bookmarkStart w:id="211" w:name="完整工件数量"/>
     <w:p>
       <w:pPr>
         <w:pStyle w:val="Heading2"/>
       </w:pPr>
+      <w:r>
+        <w:rPr>
+          <w:rStyle w:val="SectionNumber"/>
+          <w:rFonts w:ascii="Noto Sans CJK SC" w:hAnsi="Noto Sans CJK SC" w:eastAsia="Noto Sans CJK SC" w:cs="Noto Sans CJK SC" w:hint="eastAsia"/>
+        </w:rPr>
+        <w:t xml:space="preserve">13.4</w:t>
+      </w:r>
+      <w:r>
+        <w:rPr>
+          <w:rFonts w:ascii="Noto Sans CJK SC" w:hAnsi="Noto Sans CJK SC" w:eastAsia="Noto Sans CJK SC" w:cs="Noto Sans CJK SC" w:hint="eastAsia"/>
+        </w:rPr>
+        <w:tab/>
+      </w:r>
       <w:r>
         <w:rPr>
           <w:rFonts w:hint="eastAsia" w:ascii="Noto Sans CJK SC" w:hAnsi="Noto Sans CJK SC" w:eastAsia="Noto Sans CJK SC" w:cs="Noto Sans CJK SC"/>
@@ -19668,13 +20298,26 @@
         <w:t xml:space="preserve">都拒绝。</w:t>
       </w:r>
     </w:p>
-    <w:bookmarkEnd w:id="66"/>
-    <w:bookmarkEnd w:id="67"/>
-    <w:bookmarkStart w:id="68" w:name="因果解释报告规则与否证条件"/>
+    <w:bookmarkEnd w:id="211"/>
+    <w:bookmarkEnd w:id="212"/>
+    <w:bookmarkStart w:id="213" w:name="因果解释报告规则与否证条件"/>
     <w:p>
       <w:pPr>
         <w:pStyle w:val="Heading1"/>
       </w:pPr>
+      <w:r>
+        <w:rPr>
+          <w:rStyle w:val="SectionNumber"/>
+          <w:rFonts w:ascii="Noto Sans CJK SC" w:hAnsi="Noto Sans CJK SC" w:eastAsia="Noto Sans CJK SC" w:cs="Noto Sans CJK SC" w:hint="eastAsia"/>
+        </w:rPr>
+        <w:t xml:space="preserve">14</w:t>
+      </w:r>
+      <w:r>
+        <w:rPr>
+          <w:rFonts w:ascii="Noto Sans CJK SC" w:hAnsi="Noto Sans CJK SC" w:eastAsia="Noto Sans CJK SC" w:cs="Noto Sans CJK SC" w:hint="eastAsia"/>
+        </w:rPr>
+        <w:tab/>
+      </w:r>
       <w:r>
         <w:rPr>
           <w:rFonts w:hint="eastAsia" w:ascii="Noto Sans CJK SC" w:hAnsi="Noto Sans CJK SC" w:eastAsia="Noto Sans CJK SC" w:cs="Noto Sans CJK SC"/>
@@ -20398,24 +21041,50 @@
         <w:t xml:space="preserve">有利，并不构成失败；它会作为边界或负结果如实报告。</w:t>
       </w:r>
     </w:p>
-    <w:bookmarkEnd w:id="68"/>
-    <w:bookmarkStart w:id="72" w:name="证据链为什么被设计得很严格"/>
+    <w:bookmarkEnd w:id="213"/>
+    <w:bookmarkStart w:id="217" w:name="证据链为什么被设计得很严格"/>
     <w:p>
       <w:pPr>
         <w:pStyle w:val="Heading1"/>
       </w:pPr>
       <w:r>
         <w:rPr>
+          <w:rStyle w:val="SectionNumber"/>
+          <w:rFonts w:ascii="Noto Sans CJK SC" w:hAnsi="Noto Sans CJK SC" w:eastAsia="Noto Sans CJK SC" w:cs="Noto Sans CJK SC" w:hint="eastAsia"/>
+        </w:rPr>
+        <w:t xml:space="preserve">15</w:t>
+      </w:r>
+      <w:r>
+        <w:rPr>
+          <w:rFonts w:ascii="Noto Sans CJK SC" w:hAnsi="Noto Sans CJK SC" w:eastAsia="Noto Sans CJK SC" w:cs="Noto Sans CJK SC" w:hint="eastAsia"/>
+        </w:rPr>
+        <w:tab/>
+      </w:r>
+      <w:r>
+        <w:rPr>
           <w:rFonts w:hint="eastAsia" w:ascii="Noto Sans CJK SC" w:hAnsi="Noto Sans CJK SC" w:eastAsia="Noto Sans CJK SC" w:cs="Noto Sans CJK SC"/>
         </w:rPr>
         <w:t xml:space="preserve">证据链为什么被设计得很严格</w:t>
       </w:r>
     </w:p>
-    <w:bookmarkStart w:id="69" w:name="三类源快照"/>
+    <w:bookmarkStart w:id="214" w:name="三类源快照"/>
     <w:p>
       <w:pPr>
         <w:pStyle w:val="Heading2"/>
       </w:pPr>
+      <w:r>
+        <w:rPr>
+          <w:rStyle w:val="SectionNumber"/>
+          <w:rFonts w:ascii="Noto Sans CJK SC" w:hAnsi="Noto Sans CJK SC" w:eastAsia="Noto Sans CJK SC" w:cs="Noto Sans CJK SC" w:hint="eastAsia"/>
+        </w:rPr>
+        <w:t xml:space="preserve">15.1</w:t>
+      </w:r>
+      <w:r>
+        <w:rPr>
+          <w:rFonts w:ascii="Noto Sans CJK SC" w:hAnsi="Noto Sans CJK SC" w:eastAsia="Noto Sans CJK SC" w:cs="Noto Sans CJK SC" w:hint="eastAsia"/>
+        </w:rPr>
+        <w:tab/>
+      </w:r>
       <w:r>
         <w:rPr>
           <w:rFonts w:hint="eastAsia" w:ascii="Noto Sans CJK SC" w:hAnsi="Noto Sans CJK SC" w:eastAsia="Noto Sans CJK SC" w:cs="Noto Sans CJK SC"/>
@@ -20605,12 +21274,25 @@
         <w:t xml:space="preserve">都不够。</w:t>
       </w:r>
     </w:p>
-    <w:bookmarkEnd w:id="69"/>
-    <w:bookmarkStart w:id="70" w:name="route-a-的-s1-与-s2-已冻结资格已选择-route-c"/>
+    <w:bookmarkEnd w:id="214"/>
+    <w:bookmarkStart w:id="215" w:name="route-a-的-s1-与-s2-已冻结资格已选择-route-c"/>
     <w:p>
       <w:pPr>
         <w:pStyle w:val="Heading2"/>
       </w:pPr>
+      <w:r>
+        <w:rPr>
+          <w:rStyle w:val="SectionNumber"/>
+          <w:rFonts w:ascii="Noto Sans CJK SC" w:hAnsi="Noto Sans CJK SC" w:eastAsia="Noto Sans CJK SC" w:cs="Noto Sans CJK SC" w:hint="eastAsia"/>
+        </w:rPr>
+        <w:t xml:space="preserve">15.2</w:t>
+      </w:r>
+      <w:r>
+        <w:rPr>
+          <w:rFonts w:ascii="Noto Sans CJK SC" w:hAnsi="Noto Sans CJK SC" w:eastAsia="Noto Sans CJK SC" w:cs="Noto Sans CJK SC" w:hint="eastAsia"/>
+        </w:rPr>
+        <w:tab/>
+      </w:r>
       <w:r>
         <w:rPr>
           <w:rFonts w:ascii="Noto Sans CJK SC" w:hAnsi="Noto Sans CJK SC" w:eastAsia="Noto Sans CJK SC" w:cs="Noto Sans CJK SC" w:hint="eastAsia"/>
@@ -21320,12 +22002,25 @@
         <w:t xml:space="preserve">均被永久禁止在本次预注册下启动。</w:t>
       </w:r>
     </w:p>
-    <w:bookmarkEnd w:id="70"/>
-    <w:bookmarkStart w:id="71" w:name="四个执行层级"/>
+    <w:bookmarkEnd w:id="215"/>
+    <w:bookmarkStart w:id="216" w:name="四个执行层级"/>
     <w:p>
       <w:pPr>
         <w:pStyle w:val="Heading2"/>
       </w:pPr>
+      <w:r>
+        <w:rPr>
+          <w:rStyle w:val="SectionNumber"/>
+          <w:rFonts w:ascii="Noto Sans CJK SC" w:hAnsi="Noto Sans CJK SC" w:eastAsia="Noto Sans CJK SC" w:cs="Noto Sans CJK SC" w:hint="eastAsia"/>
+        </w:rPr>
+        <w:t xml:space="preserve">15.3</w:t>
+      </w:r>
+      <w:r>
+        <w:rPr>
+          <w:rFonts w:ascii="Noto Sans CJK SC" w:hAnsi="Noto Sans CJK SC" w:eastAsia="Noto Sans CJK SC" w:cs="Noto Sans CJK SC" w:hint="eastAsia"/>
+        </w:rPr>
+        <w:tab/>
+      </w:r>
       <w:r>
         <w:rPr>
           <w:rFonts w:hint="eastAsia" w:ascii="Noto Sans CJK SC" w:hAnsi="Noto Sans CJK SC" w:eastAsia="Noto Sans CJK SC" w:cs="Noto Sans CJK SC"/>
@@ -21658,13 +22353,26 @@
         <w:t xml:space="preserve">或论文主张已经释放。</w:t>
       </w:r>
     </w:p>
-    <w:bookmarkEnd w:id="71"/>
-    <w:bookmarkEnd w:id="72"/>
-    <w:bookmarkStart w:id="73" w:name="正确性边界与整数安全"/>
+    <w:bookmarkEnd w:id="216"/>
+    <w:bookmarkEnd w:id="217"/>
+    <w:bookmarkStart w:id="218" w:name="正确性边界与整数安全"/>
     <w:p>
       <w:pPr>
         <w:pStyle w:val="Heading1"/>
       </w:pPr>
+      <w:r>
+        <w:rPr>
+          <w:rStyle w:val="SectionNumber"/>
+          <w:rFonts w:ascii="Noto Sans CJK SC" w:hAnsi="Noto Sans CJK SC" w:eastAsia="Noto Sans CJK SC" w:cs="Noto Sans CJK SC" w:hint="eastAsia"/>
+        </w:rPr>
+        <w:t xml:space="preserve">16</w:t>
+      </w:r>
+      <w:r>
+        <w:rPr>
+          <w:rFonts w:ascii="Noto Sans CJK SC" w:hAnsi="Noto Sans CJK SC" w:eastAsia="Noto Sans CJK SC" w:cs="Noto Sans CJK SC" w:hint="eastAsia"/>
+        </w:rPr>
+        <w:tab/>
+      </w:r>
       <w:r>
         <w:rPr>
           <w:rFonts w:hint="eastAsia" w:ascii="Noto Sans CJK SC" w:hAnsi="Noto Sans CJK SC" w:eastAsia="Noto Sans CJK SC" w:cs="Noto Sans CJK SC"/>
@@ -22254,24 +22962,50 @@
         <w:t xml:space="preserve">门禁。</w:t>
       </w:r>
     </w:p>
-    <w:bookmarkEnd w:id="73"/>
-    <w:bookmarkStart w:id="76" w:name="论文真正可以声称什么"/>
+    <w:bookmarkEnd w:id="218"/>
+    <w:bookmarkStart w:id="221" w:name="论文真正可以声称什么"/>
     <w:p>
       <w:pPr>
         <w:pStyle w:val="Heading1"/>
       </w:pPr>
       <w:r>
         <w:rPr>
+          <w:rStyle w:val="SectionNumber"/>
+          <w:rFonts w:ascii="Noto Sans CJK SC" w:hAnsi="Noto Sans CJK SC" w:eastAsia="Noto Sans CJK SC" w:cs="Noto Sans CJK SC" w:hint="eastAsia"/>
+        </w:rPr>
+        <w:t xml:space="preserve">17</w:t>
+      </w:r>
+      <w:r>
+        <w:rPr>
+          <w:rFonts w:ascii="Noto Sans CJK SC" w:hAnsi="Noto Sans CJK SC" w:eastAsia="Noto Sans CJK SC" w:cs="Noto Sans CJK SC" w:hint="eastAsia"/>
+        </w:rPr>
+        <w:tab/>
+      </w:r>
+      <w:r>
+        <w:rPr>
           <w:rFonts w:hint="eastAsia" w:ascii="Noto Sans CJK SC" w:hAnsi="Noto Sans CJK SC" w:eastAsia="Noto Sans CJK SC" w:cs="Noto Sans CJK SC"/>
         </w:rPr>
         <w:t xml:space="preserve">论文真正可以声称什么</w:t>
       </w:r>
     </w:p>
-    <w:bookmarkStart w:id="74" w:name="可以主张的贡献"/>
+    <w:bookmarkStart w:id="219" w:name="可以主张的贡献"/>
     <w:p>
       <w:pPr>
         <w:pStyle w:val="Heading2"/>
       </w:pPr>
+      <w:r>
+        <w:rPr>
+          <w:rStyle w:val="SectionNumber"/>
+          <w:rFonts w:ascii="Noto Sans CJK SC" w:hAnsi="Noto Sans CJK SC" w:eastAsia="Noto Sans CJK SC" w:cs="Noto Sans CJK SC" w:hint="eastAsia"/>
+        </w:rPr>
+        <w:t xml:space="preserve">17.1</w:t>
+      </w:r>
+      <w:r>
+        <w:rPr>
+          <w:rFonts w:ascii="Noto Sans CJK SC" w:hAnsi="Noto Sans CJK SC" w:eastAsia="Noto Sans CJK SC" w:cs="Noto Sans CJK SC" w:hint="eastAsia"/>
+        </w:rPr>
+        <w:tab/>
+      </w:r>
       <w:r>
         <w:rPr>
           <w:rFonts w:hint="eastAsia" w:ascii="Noto Sans CJK SC" w:hAnsi="Noto Sans CJK SC" w:eastAsia="Noto Sans CJK SC" w:cs="Noto Sans CJK SC"/>
@@ -22508,12 +23242,25 @@
         <w:t xml:space="preserve">评估方法。</w:t>
       </w:r>
     </w:p>
-    <w:bookmarkEnd w:id="74"/>
-    <w:bookmarkStart w:id="75" w:name="不能扩大成的主张"/>
+    <w:bookmarkEnd w:id="219"/>
+    <w:bookmarkStart w:id="220" w:name="不能扩大成的主张"/>
     <w:p>
       <w:pPr>
         <w:pStyle w:val="Heading2"/>
       </w:pPr>
+      <w:r>
+        <w:rPr>
+          <w:rStyle w:val="SectionNumber"/>
+          <w:rFonts w:ascii="Noto Sans CJK SC" w:hAnsi="Noto Sans CJK SC" w:eastAsia="Noto Sans CJK SC" w:cs="Noto Sans CJK SC" w:hint="eastAsia"/>
+        </w:rPr>
+        <w:t xml:space="preserve">17.2</w:t>
+      </w:r>
+      <w:r>
+        <w:rPr>
+          <w:rFonts w:ascii="Noto Sans CJK SC" w:hAnsi="Noto Sans CJK SC" w:eastAsia="Noto Sans CJK SC" w:cs="Noto Sans CJK SC" w:hint="eastAsia"/>
+        </w:rPr>
+        <w:tab/>
+      </w:r>
       <w:r>
         <w:rPr>
           <w:rFonts w:hint="eastAsia" w:ascii="Noto Sans CJK SC" w:hAnsi="Noto Sans CJK SC" w:eastAsia="Noto Sans CJK SC" w:cs="Noto Sans CJK SC"/>
@@ -22899,13 +23646,26 @@
         <w:t xml:space="preserve">是看完正式结果后修改矩阵、门槛或策略身份并继续声称原结论。</w:t>
       </w:r>
     </w:p>
-    <w:bookmarkEnd w:id="75"/>
-    <w:bookmarkEnd w:id="76"/>
-    <w:bookmarkStart w:id="77" w:name="这篇论文的叙事主线"/>
+    <w:bookmarkEnd w:id="220"/>
+    <w:bookmarkEnd w:id="221"/>
+    <w:bookmarkStart w:id="222" w:name="这篇论文的叙事主线"/>
     <w:p>
       <w:pPr>
         <w:pStyle w:val="Heading1"/>
       </w:pPr>
+      <w:r>
+        <w:rPr>
+          <w:rStyle w:val="SectionNumber"/>
+          <w:rFonts w:ascii="Noto Sans CJK SC" w:hAnsi="Noto Sans CJK SC" w:eastAsia="Noto Sans CJK SC" w:cs="Noto Sans CJK SC" w:hint="eastAsia"/>
+        </w:rPr>
+        <w:t xml:space="preserve">18</w:t>
+      </w:r>
+      <w:r>
+        <w:rPr>
+          <w:rFonts w:ascii="Noto Sans CJK SC" w:hAnsi="Noto Sans CJK SC" w:eastAsia="Noto Sans CJK SC" w:cs="Noto Sans CJK SC" w:hint="eastAsia"/>
+        </w:rPr>
+        <w:tab/>
+      </w:r>
       <w:r>
         <w:rPr>
           <w:rFonts w:hint="eastAsia" w:ascii="Noto Sans CJK SC" w:hAnsi="Noto Sans CJK SC" w:eastAsia="Noto Sans CJK SC" w:cs="Noto Sans CJK SC"/>
@@ -23270,14 +24030,27 @@
         <w:t xml:space="preserve">和事件语义下的机制级权衡；若增量维护失去优势，就把失效位置与原因写成边界或负结果。</w:t>
       </w:r>
     </w:p>
-    <w:bookmarkEnd w:id="77"/>
-    <w:bookmarkStart w:id="78" w:name="当前进度与剩余工作"/>
+    <w:bookmarkEnd w:id="222"/>
+    <w:bookmarkStart w:id="226" w:name="当前进度与剩余工作"/>
     <w:p>
       <w:pPr>
         <w:pStyle w:val="Heading1"/>
       </w:pPr>
       <w:r>
         <w:rPr>
+          <w:rStyle w:val="SectionNumber"/>
+          <w:rFonts w:ascii="Noto Sans CJK SC" w:hAnsi="Noto Sans CJK SC" w:eastAsia="Noto Sans CJK SC" w:cs="Noto Sans CJK SC" w:hint="eastAsia"/>
+        </w:rPr>
+        <w:t xml:space="preserve">19</w:t>
+      </w:r>
+      <w:r>
+        <w:rPr>
+          <w:rFonts w:ascii="Noto Sans CJK SC" w:hAnsi="Noto Sans CJK SC" w:eastAsia="Noto Sans CJK SC" w:cs="Noto Sans CJK SC" w:hint="eastAsia"/>
+        </w:rPr>
+        <w:tab/>
+      </w:r>
+      <w:r>
+        <w:rPr>
           <w:rFonts w:hint="eastAsia" w:ascii="Noto Sans CJK SC" w:hAnsi="Noto Sans CJK SC" w:eastAsia="Noto Sans CJK SC" w:cs="Noto Sans CJK SC"/>
         </w:rPr>
         <w:t xml:space="preserve">当前进度与剩余工作</w:t>
@@ -23340,6 +24113,105 @@
           <w:rFonts w:hint="eastAsia" w:ascii="Noto Sans CJK SC" w:hAnsi="Noto Sans CJK SC" w:eastAsia="Noto Sans CJK SC" w:cs="Noto Sans CJK SC"/>
         </w:rPr>
         <w:t xml:space="preserve">记录为准。这里必须区分“方法已经实现”“工程门禁已经通过”“一次性资格是否通过”和“论文经验结果是否产生”四件事；任何前一层都不能替代后一层。</w:t>
+      </w:r>
+    </w:p>
+    <w:p>
+      <w:pPr>
+        <w:pStyle w:val="CaptionedFigure"/>
+        <w:keepNext/>
+        <w:jc w:val="center"/>
+      </w:pPr>
+      <w:r>
+        <w:rPr>
+          <w:rFonts w:ascii="Noto Sans CJK SC" w:hAnsi="Noto Sans CJK SC" w:eastAsia="Noto Sans CJK SC" w:cs="Noto Sans CJK SC" w:hint="eastAsia"/>
+        </w:rPr>
+        <w:drawing>
+          <wp:inline>
+            <wp:extent cx="5760720" cy="3127247"/>
+            <wp:effectExtent b="0" l="0" r="0" t="0"/>
+            <wp:docPr descr="从 S1、S2 到一次性资格停止点的证据链；正式实验没有启动，论文转入 Route C。" title="Figure 2" id="224" name="Picture"/>
+            <a:graphic>
+              <a:graphicData uri="http://schemas.openxmlformats.org/drawingml/2006/picture">
+                <pic:pic>
+                  <pic:nvPicPr>
+                    <pic:cNvPr descr="assets/route-c-evidence-boundary.png" id="225" name="Picture"/>
+                    <pic:cNvPicPr>
+                      <a:picLocks noChangeArrowheads="1" noChangeAspect="1"/>
+                    </pic:cNvPicPr>
+                  </pic:nvPicPr>
+                  <pic:blipFill>
+                    <a:blip r:embed="rId223"/>
+                    <a:stretch>
+                      <a:fillRect/>
+                    </a:stretch>
+                  </pic:blipFill>
+                  <pic:spPr bwMode="auto">
+                    <a:xfrm>
+                      <a:off x="0" y="0"/>
+                      <a:ext cx="5760720" cy="3127247"/>
+                    </a:xfrm>
+                    <a:prstGeom prst="rect">
+                      <a:avLst/>
+                    </a:prstGeom>
+                    <a:noFill/>
+                    <a:ln w="9525">
+                      <a:noFill/>
+                      <a:headEnd/>
+                      <a:tailEnd/>
+                    </a:ln>
+                  </pic:spPr>
+                </pic:pic>
+              </a:graphicData>
+            </a:graphic>
+          </wp:inline>
+        </w:drawing>
+      </w:r>
+    </w:p>
+    <w:p>
+      <w:pPr>
+        <w:pStyle w:val="ImageCaption"/>
+      </w:pPr>
+      <w:r>
+        <w:rPr>
+          <w:rFonts w:hint="eastAsia" w:ascii="Noto Sans CJK SC" w:hAnsi="Noto Sans CJK SC" w:eastAsia="Noto Sans CJK SC" w:cs="Noto Sans CJK SC"/>
+        </w:rPr>
+        <w:t xml:space="preserve">图</w:t>
+      </w:r>
+      <w:r>
+        <w:rPr>
+          <w:rFonts w:ascii="Noto Sans CJK SC" w:hAnsi="Noto Sans CJK SC" w:eastAsia="Noto Sans CJK SC" w:cs="Noto Sans CJK SC" w:hint="eastAsia"/>
+        </w:rPr>
+        <w:t xml:space="preserve"> </w:t>
+      </w:r>
+      <w:r>
+        <w:rPr>
+          <w:rFonts w:hint="eastAsia" w:ascii="Noto Sans CJK SC" w:hAnsi="Noto Sans CJK SC" w:eastAsia="Noto Sans CJK SC" w:cs="Noto Sans CJK SC"/>
+        </w:rPr>
+        <w:t xml:space="preserve">2：S1/S2</w:t>
+      </w:r>
+      <w:r>
+        <w:rPr>
+          <w:rFonts w:ascii="Noto Sans CJK SC" w:hAnsi="Noto Sans CJK SC" w:eastAsia="Noto Sans CJK SC" w:cs="Noto Sans CJK SC" w:hint="eastAsia"/>
+        </w:rPr>
+        <w:t xml:space="preserve"> </w:t>
+      </w:r>
+      <w:r>
+        <w:rPr>
+          <w:rFonts w:hint="eastAsia" w:ascii="Noto Sans CJK SC" w:hAnsi="Noto Sans CJK SC" w:eastAsia="Noto Sans CJK SC" w:cs="Noto Sans CJK SC"/>
+        </w:rPr>
+        <w:t xml:space="preserve">工程证据、一次性资格停止点与</w:t>
+      </w:r>
+      <w:r>
+        <w:rPr>
+          <w:rFonts w:ascii="Noto Sans CJK SC" w:hAnsi="Noto Sans CJK SC" w:eastAsia="Noto Sans CJK SC" w:cs="Noto Sans CJK SC" w:hint="eastAsia"/>
+        </w:rPr>
+        <w:t xml:space="preserve"> Route C </w:t>
+      </w:r>
+      <w:r>
+        <w:rPr>
+          <w:rFonts w:hint="eastAsia" w:ascii="Noto Sans CJK SC" w:hAnsi="Noto Sans CJK SC" w:eastAsia="Noto Sans CJK SC" w:cs="Noto Sans CJK SC"/>
+        </w:rPr>
+        <w:t xml:space="preserve">证据边界。</w:t>
       </w:r>
     </w:p>
     <w:p>
@@ -25100,12 +25972,25 @@
         <w:t xml:space="preserve">，而且仍不保证结果为正。以上是形成投稿稿的估计，不是录用时间承诺。</w:t>
       </w:r>
     </w:p>
-    <w:bookmarkEnd w:id="78"/>
-    <w:bookmarkStart w:id="79" w:name="最终理解"/>
+    <w:bookmarkEnd w:id="226"/>
+    <w:bookmarkStart w:id="227" w:name="最终理解"/>
     <w:p>
       <w:pPr>
         <w:pStyle w:val="Heading1"/>
       </w:pPr>
+      <w:r>
+        <w:rPr>
+          <w:rStyle w:val="SectionNumber"/>
+          <w:rFonts w:ascii="Noto Sans CJK SC" w:hAnsi="Noto Sans CJK SC" w:eastAsia="Noto Sans CJK SC" w:cs="Noto Sans CJK SC" w:hint="eastAsia"/>
+        </w:rPr>
+        <w:t xml:space="preserve">20</w:t>
+      </w:r>
+      <w:r>
+        <w:rPr>
+          <w:rFonts w:ascii="Noto Sans CJK SC" w:hAnsi="Noto Sans CJK SC" w:eastAsia="Noto Sans CJK SC" w:cs="Noto Sans CJK SC" w:hint="eastAsia"/>
+        </w:rPr>
+        <w:tab/>
+      </w:r>
       <w:r>
         <w:rPr>
           <w:rFonts w:hint="eastAsia" w:ascii="Noto Sans CJK SC" w:hAnsi="Noto Sans CJK SC" w:eastAsia="Noto Sans CJK SC" w:cs="Noto Sans CJK SC"/>
@@ -25257,12 +26142,25 @@
         <w:t xml:space="preserve">的核心。</w:t>
       </w:r>
     </w:p>
-    <w:bookmarkEnd w:id="79"/>
-    <w:bookmarkStart w:id="80" w:name="项目内主要依据"/>
+    <w:bookmarkEnd w:id="227"/>
+    <w:bookmarkStart w:id="228" w:name="项目内主要依据"/>
     <w:p>
       <w:pPr>
         <w:pStyle w:val="Heading1"/>
       </w:pPr>
+      <w:r>
+        <w:rPr>
+          <w:rStyle w:val="SectionNumber"/>
+          <w:rFonts w:ascii="Noto Sans CJK SC" w:hAnsi="Noto Sans CJK SC" w:eastAsia="Noto Sans CJK SC" w:cs="Noto Sans CJK SC" w:hint="eastAsia"/>
+        </w:rPr>
+        <w:t xml:space="preserve">21</w:t>
+      </w:r>
+      <w:r>
+        <w:rPr>
+          <w:rFonts w:ascii="Noto Sans CJK SC" w:hAnsi="Noto Sans CJK SC" w:eastAsia="Noto Sans CJK SC" w:cs="Noto Sans CJK SC" w:hint="eastAsia"/>
+        </w:rPr>
+        <w:tab/>
+      </w:r>
       <w:r>
         <w:rPr>
           <w:rFonts w:hint="eastAsia" w:ascii="Noto Sans CJK SC" w:hAnsi="Noto Sans CJK SC" w:eastAsia="Noto Sans CJK SC" w:cs="Noto Sans CJK SC"/>
@@ -25526,15 +26424,18 @@
         <w:t xml:space="preserve">config/params_manifest.json</w:t>
       </w:r>
     </w:p>
-    <w:bookmarkEnd w:id="80"/>
+    <w:bookmarkEnd w:id="228"/>
     <w:sectPr>
       <w:headerReference r:id="rId9" w:type="default"/>
       <w:footerReference r:id="rId10" w:type="default"/>
+      <w:headerReference r:id="rId1" w:type="first"/>
+      <w:footerReference r:id="rId2" w:type="first"/>
       <w:footnotePr>
         <w:numRestart w:val="eachSect"/>
       </w:footnotePr>
       <w:pgSz w:h="16838" w:w="11906"/>
       <w:pgMar w:bottom="1219" w:footer="567" w:gutter="0" w:header="595" w:left="1332" w:right="1332" w:top="1276"/>
+      <w:titlePg/>
     </w:sectPr>
   </w:body>
 </w:document>
@@ -25549,8 +26450,8 @@
   <w:p>
     <w:pPr>
       <w:pStyle w:val="Footer"/>
-      <w:spacing w:before="60"/>
-      <w:jc w:val="center"/>
+      <w:spacing w:before="0"/>
+      <w:jc w:val="right"/>
       <w:pBdr>
         <w:top w:val="single" w:sz="4" w:space="4" w:color="D6E4EF"/>
       </w:pBdr>
@@ -25558,31 +26459,37 @@
     <w:r>
       <w:rPr>
         <w:rFonts w:ascii="Noto Sans CJK SC" w:hAnsi="Noto Sans CJK SC" w:eastAsia="Noto Sans CJK SC" w:cs="Noto Sans CJK SC" w:hint="eastAsia"/>
-        <w:color w:val="697586"/>
+        <w:color w:val="5B6573"/>
         <w:sz w:val="17"/>
       </w:rPr>
+      <w:t xml:space="preserve">Page </w:t>
       <w:fldChar w:fldCharType="begin"/>
       <w:instrText xml:space="preserve"> PAGE </w:instrText>
       <w:fldChar w:fldCharType="separate"/>
       <w:t>1</w:t>
       <w:fldChar w:fldCharType="end"/>
     </w:r>
+  </w:p>
+</w:ftr>
+</file>
+
+<file path=word/footer2.xml><?xml version="1.0" encoding="utf-8"?>
+<w:ftr xmlns:m="http://schemas.openxmlformats.org/officeDocument/2006/math" xmlns:mc="http://schemas.openxmlformats.org/markup-compatibility/2006" xmlns:mo="http://schemas.microsoft.com/office/mac/office/2008/main" xmlns:mv="urn:schemas-microsoft-com:mac:vml" xmlns:o="urn:schemas-microsoft-com:office:office" xmlns:r="http://schemas.openxmlformats.org/officeDocument/2006/relationships" xmlns:v="urn:schemas-microsoft-com:vml" xmlns:w10="urn:schemas-microsoft-com:office:word" xmlns:w14="http://schemas.microsoft.com/office/word/2010/wordml" xmlns:w="http://schemas.openxmlformats.org/wordprocessingml/2006/main" xmlns:wne="http://schemas.microsoft.com/office/word/2006/wordml" xmlns:wp14="http://schemas.microsoft.com/office/word/2010/wordprocessingDrawing" xmlns:wp="http://schemas.openxmlformats.org/drawingml/2006/wordprocessingDrawing" xmlns:wpc="http://schemas.microsoft.com/office/word/2010/wordprocessingCanvas" xmlns:wpg="http://schemas.microsoft.com/office/word/2010/wordprocessingGroup" xmlns:wpi="http://schemas.microsoft.com/office/word/2010/wordprocessingInk" xmlns:wps="http://schemas.microsoft.com/office/word/2010/wordprocessingShape" mc:Ignorable="w14 wp14">
+  <w:p>
+    <w:pPr>
+      <w:pStyle w:val="Footer"/>
+      <w:spacing w:before="0"/>
+      <w:jc w:val="right"/>
+    </w:pPr>
     <w:r>
       <w:rPr>
         <w:rFonts w:ascii="Noto Sans CJK SC" w:hAnsi="Noto Sans CJK SC" w:eastAsia="Noto Sans CJK SC" w:cs="Noto Sans CJK SC" w:hint="eastAsia"/>
-        <w:color w:val="697586"/>
+        <w:color w:val="5B6573"/>
         <w:sz w:val="17"/>
       </w:rPr>
-      <w:t xml:space="preserve">  /  </w:t>
-    </w:r>
-    <w:r>
-      <w:rPr>
-        <w:rFonts w:ascii="Noto Sans CJK SC" w:hAnsi="Noto Sans CJK SC" w:eastAsia="Noto Sans CJK SC" w:cs="Noto Sans CJK SC" w:hint="eastAsia"/>
-        <w:color w:val="697586"/>
-        <w:sz w:val="17"/>
-      </w:rPr>
+      <w:t xml:space="preserve">Page </w:t>
       <w:fldChar w:fldCharType="begin"/>
-      <w:instrText xml:space="preserve"> NUMPAGES </w:instrText>
+      <w:instrText xml:space="preserve"> PAGE </w:instrText>
       <w:fldChar w:fldCharType="separate"/>
       <w:t>1</w:t>
       <w:fldChar w:fldCharType="end"/>
@@ -25615,7 +26522,7 @@
   <w:p>
     <w:pPr>
       <w:pStyle w:val="Header"/>
-      <w:spacing w:after="60"/>
+      <w:spacing w:after="0"/>
       <w:jc w:val="left"/>
       <w:pBdr>
         <w:bottom w:val="single" w:sz="4" w:space="4" w:color="D6E4EF"/>
@@ -25624,10 +26531,32 @@
     <w:r>
       <w:rPr>
         <w:rFonts w:ascii="Noto Sans CJK SC" w:hAnsi="Noto Sans CJK SC" w:eastAsia="Noto Sans CJK SC" w:cs="Noto Sans CJK SC" w:hint="eastAsia"/>
-        <w:color w:val="697586"/>
+        <w:b/>
+        <w:color w:val="5B6573"/>
         <w:sz w:val="17"/>
       </w:rPr>
-      <w:t>Dynamic CSSC SpMV   |   Technical Explanation</w:t>
+      <w:t>DYNAMIC CSSC SPMV • ROUTE C 技术说明</w:t>
+    </w:r>
+  </w:p>
+</w:hdr>
+</file>
+
+<file path=word/header2.xml><?xml version="1.0" encoding="utf-8"?>
+<w:hdr xmlns:m="http://schemas.openxmlformats.org/officeDocument/2006/math" xmlns:mc="http://schemas.openxmlformats.org/markup-compatibility/2006" xmlns:mo="http://schemas.microsoft.com/office/mac/office/2008/main" xmlns:mv="urn:schemas-microsoft-com:mac:vml" xmlns:o="urn:schemas-microsoft-com:office:office" xmlns:r="http://schemas.openxmlformats.org/officeDocument/2006/relationships" xmlns:v="urn:schemas-microsoft-com:vml" xmlns:w10="urn:schemas-microsoft-com:office:word" xmlns:w14="http://schemas.microsoft.com/office/word/2010/wordml" xmlns:w="http://schemas.openxmlformats.org/wordprocessingml/2006/main" xmlns:wne="http://schemas.microsoft.com/office/word/2006/wordml" xmlns:wp14="http://schemas.microsoft.com/office/word/2010/wordprocessingDrawing" xmlns:wp="http://schemas.openxmlformats.org/drawingml/2006/wordprocessingDrawing" xmlns:wpc="http://schemas.microsoft.com/office/word/2010/wordprocessingCanvas" xmlns:wpg="http://schemas.microsoft.com/office/word/2010/wordprocessingGroup" xmlns:wpi="http://schemas.microsoft.com/office/word/2010/wordprocessingInk" xmlns:wps="http://schemas.microsoft.com/office/word/2010/wordprocessingShape" mc:Ignorable="w14 wp14">
+  <w:p>
+    <w:pPr>
+      <w:pStyle w:val="Header"/>
+      <w:spacing w:after="0"/>
+      <w:jc w:val="left"/>
+    </w:pPr>
+    <w:r>
+      <w:rPr>
+        <w:rFonts w:ascii="Noto Sans CJK SC" w:hAnsi="Noto Sans CJK SC" w:eastAsia="Noto Sans CJK SC" w:cs="Noto Sans CJK SC" w:hint="eastAsia"/>
+        <w:b/>
+        <w:color w:val="5B6573"/>
+        <w:sz w:val="17"/>
+      </w:rPr>
+      <w:t>DYNAMIC CSSC SPMV • ROUTE C 技术说明</w:t>
     </w:r>
   </w:p>
 </w:hdr>
@@ -26239,7 +27168,7 @@
       <w:spacing w:after="100" w:before="0" w:line="312" w:lineRule="auto"/>
     </w:pPr>
     <w:rPr>
-      <w:rFonts w:ascii="Noto Sans CJK SC" w:eastAsia="Noto Sans CJK SC" w:hAnsi="Noto Sans CJK SC" w:cs="Noto Sans CJK SC" w:hint="eastAsia"/>
+      <w:rFonts w:ascii="Noto Sans CJK SC" w:cs="Noto Sans CJK SC" w:eastAsia="Noto Sans CJK SC" w:hAnsi="Noto Sans CJK SC" w:hint="eastAsia"/>
       <w:color w:val="1F2937"/>
       <w:sz w:val="21"/>
     </w:rPr>
@@ -26253,7 +27182,7 @@
       <w:spacing w:after="80" w:before="0" w:line="307" w:lineRule="auto"/>
     </w:pPr>
     <w:rPr>
-      <w:rFonts w:ascii="Noto Sans CJK SC" w:eastAsia="Noto Sans CJK SC" w:hAnsi="Noto Sans CJK SC" w:cs="Noto Sans CJK SC" w:hint="eastAsia"/>
+      <w:rFonts w:ascii="Noto Sans CJK SC" w:cs="Noto Sans CJK SC" w:eastAsia="Noto Sans CJK SC" w:hAnsi="Noto Sans CJK SC" w:hint="eastAsia"/>
       <w:color w:val="1F2937"/>
       <w:sz w:val="21"/>
     </w:rPr>
@@ -26267,7 +27196,7 @@
       <w:spacing w:after="80" w:before="0" w:line="307" w:lineRule="auto"/>
     </w:pPr>
     <w:rPr>
-      <w:rFonts w:ascii="Noto Sans CJK SC" w:eastAsia="Noto Sans CJK SC" w:hAnsi="Noto Sans CJK SC" w:cs="Noto Sans CJK SC" w:hint="eastAsia"/>
+      <w:rFonts w:ascii="Noto Sans CJK SC" w:cs="Noto Sans CJK SC" w:eastAsia="Noto Sans CJK SC" w:hAnsi="Noto Sans CJK SC" w:hint="eastAsia"/>
       <w:color w:val="1F2937"/>
       <w:sz w:val="21"/>
     </w:rPr>
@@ -26280,7 +27209,7 @@
       <w:spacing w:after="80" w:before="0" w:line="307" w:lineRule="auto"/>
     </w:pPr>
     <w:rPr>
-      <w:rFonts w:ascii="Noto Sans CJK SC" w:eastAsia="Noto Sans CJK SC" w:hAnsi="Noto Sans CJK SC" w:cs="Noto Sans CJK SC" w:hint="eastAsia"/>
+      <w:rFonts w:ascii="Noto Sans CJK SC" w:cs="Noto Sans CJK SC" w:eastAsia="Noto Sans CJK SC" w:hAnsi="Noto Sans CJK SC" w:hint="eastAsia"/>
       <w:color w:val="1F2937"/>
       <w:sz w:val="21"/>
     </w:rPr>
@@ -26300,7 +27229,7 @@
       <w:jc w:val="left"/>
     </w:pPr>
     <w:rPr>
-      <w:rFonts w:ascii="Noto Sans CJK SC" w:asciiTheme="majorHAnsi" w:cstheme="majorBidi" w:eastAsia="Noto Sans CJK SC" w:eastAsiaTheme="majorEastAsia" w:hAnsi="Noto Sans CJK SC" w:hAnsiTheme="majorHAnsi" w:cs="Noto Sans CJK SC" w:hint="eastAsia"/>
+      <w:rFonts w:ascii="Noto Sans CJK SC" w:asciiTheme="majorHAnsi" w:cs="Noto Sans CJK SC" w:cstheme="majorBidi" w:eastAsia="Noto Sans CJK SC" w:eastAsiaTheme="majorEastAsia" w:hAnsi="Noto Sans CJK SC" w:hAnsiTheme="majorHAnsi" w:hint="eastAsia"/>
       <w:b/>
       <w:color w:val="1F5F8B"/>
       <w:sz w:val="50"/>
@@ -26314,7 +27243,7 @@
     <w:uiPriority w:val="10"/>
     <w:rsid w:val="00A10FD9"/>
     <w:rPr>
-      <w:rFonts w:asciiTheme="majorHAnsi" w:cstheme="majorBidi" w:eastAsia="Songti SC" w:eastAsiaTheme="majorEastAsia" w:hAnsiTheme="majorHAnsi"/>
+      <w:rFonts w:ascii="Noto Sans CJK SC" w:asciiTheme="majorHAnsi" w:cs="Noto Sans CJK SC" w:cstheme="majorBidi" w:eastAsia="Noto Sans CJK SC" w:eastAsiaTheme="majorEastAsia" w:hAnsi="Noto Sans CJK SC" w:hAnsiTheme="majorHAnsi" w:hint="eastAsia"/>
       <w:sz w:val="56"/>
       <w:szCs w:val="56"/>
     </w:rPr>
@@ -26335,7 +27264,7 @@
       <w:spacing w:after="360" w:before="0" w:line="276" w:lineRule="auto"/>
     </w:pPr>
     <w:rPr>
-      <w:rFonts w:ascii="Noto Sans CJK SC" w:cstheme="majorBidi" w:eastAsia="Noto Sans CJK SC" w:eastAsiaTheme="majorEastAsia" w:hAnsi="Noto Sans CJK SC" w:cs="Noto Sans CJK SC" w:hint="eastAsia"/>
+      <w:rFonts w:ascii="Noto Sans CJK SC" w:cs="Noto Sans CJK SC" w:cstheme="majorBidi" w:eastAsia="Noto Sans CJK SC" w:eastAsiaTheme="majorEastAsia" w:hAnsi="Noto Sans CJK SC" w:hint="eastAsia"/>
       <w:color w:val="5B6573"/>
       <w:spacing w:val="15"/>
       <w:sz w:val="25"/>
@@ -26349,7 +27278,7 @@
     <w:uiPriority w:val="11"/>
     <w:rsid w:val="00A10FD9"/>
     <w:rPr>
-      <w:rFonts w:cstheme="majorBidi" w:eastAsia="Songti SC" w:eastAsiaTheme="majorEastAsia"/>
+      <w:rFonts w:ascii="Noto Sans CJK SC" w:cs="Noto Sans CJK SC" w:cstheme="majorBidi" w:eastAsia="Noto Sans CJK SC" w:eastAsiaTheme="majorEastAsia" w:hAnsi="Noto Sans CJK SC" w:hint="eastAsia"/>
       <w:color w:themeColor="text1" w:themeTint="A6" w:val="595959"/>
       <w:spacing w:val="15"/>
       <w:sz w:val="28"/>
@@ -26366,7 +27295,7 @@
       <w:keepLines/>
     </w:pPr>
     <w:rPr>
-      <w:rFonts w:ascii="Noto Sans CJK SC" w:hAnsi="Noto Sans CJK SC" w:eastAsia="Noto Sans CJK SC" w:cs="Noto Sans CJK SC" w:hint="eastAsia"/>
+      <w:rFonts w:ascii="Noto Sans CJK SC" w:cs="Noto Sans CJK SC" w:eastAsia="Noto Sans CJK SC" w:hAnsi="Noto Sans CJK SC" w:hint="eastAsia"/>
       <w:sz w:val="24"/>
       <w:szCs w:val="24"/>
     </w:rPr>
@@ -26381,7 +27310,7 @@
       <w:keepLines/>
     </w:pPr>
     <w:rPr>
-      <w:rFonts w:ascii="Noto Sans CJK SC" w:hAnsi="Noto Sans CJK SC" w:eastAsia="Noto Sans CJK SC" w:cs="Noto Sans CJK SC" w:hint="eastAsia"/>
+      <w:rFonts w:ascii="Noto Sans CJK SC" w:cs="Noto Sans CJK SC" w:eastAsia="Noto Sans CJK SC" w:hAnsi="Noto Sans CJK SC" w:hint="eastAsia"/>
       <w:sz w:val="24"/>
       <w:szCs w:val="24"/>
     </w:rPr>
@@ -26398,7 +27327,7 @@
       <w:jc w:val="center"/>
     </w:pPr>
     <w:rPr>
-      <w:rFonts w:ascii="Noto Sans CJK SC" w:hAnsi="Noto Sans CJK SC" w:eastAsia="Noto Sans CJK SC" w:cs="Noto Sans CJK SC" w:hint="eastAsia"/>
+      <w:rFonts w:ascii="Noto Sans CJK SC" w:cs="Noto Sans CJK SC" w:eastAsia="Noto Sans CJK SC" w:hAnsi="Noto Sans CJK SC" w:hint="eastAsia"/>
       <w:b/>
       <w:sz w:val="20"/>
       <w:szCs w:val="20"/>
@@ -26415,7 +27344,7 @@
       <w:spacing w:after="300" w:before="100"/>
     </w:pPr>
     <w:rPr>
-      <w:rFonts w:ascii="Noto Sans CJK SC" w:hAnsi="Noto Sans CJK SC" w:eastAsia="Noto Sans CJK SC" w:cs="Noto Sans CJK SC" w:hint="eastAsia"/>
+      <w:rFonts w:ascii="Noto Sans CJK SC" w:cs="Noto Sans CJK SC" w:eastAsia="Noto Sans CJK SC" w:hAnsi="Noto Sans CJK SC" w:hint="eastAsia"/>
       <w:sz w:val="20"/>
       <w:szCs w:val="20"/>
     </w:rPr>
@@ -26427,7 +27356,7 @@
     <w:qFormat/>
     <w:pPr/>
     <w:rPr>
-      <w:rFonts w:ascii="Noto Sans CJK SC" w:hAnsi="Noto Sans CJK SC" w:eastAsia="Noto Sans CJK SC" w:cs="Noto Sans CJK SC" w:hint="eastAsia"/>
+      <w:rFonts w:ascii="Noto Sans CJK SC" w:cs="Noto Sans CJK SC" w:eastAsia="Noto Sans CJK SC" w:hAnsi="Noto Sans CJK SC" w:hint="eastAsia"/>
     </w:rPr>
   </w:style>
   <w:style w:styleId="Heading1" w:type="paragraph">
@@ -26445,7 +27374,7 @@
       <w:outlineLvl w:val="0"/>
     </w:pPr>
     <w:rPr>
-      <w:rFonts w:ascii="Noto Sans CJK SC" w:asciiTheme="majorHAnsi" w:cstheme="majorBidi" w:eastAsia="Noto Sans CJK SC" w:eastAsiaTheme="majorEastAsia" w:hAnsi="Noto Sans CJK SC" w:hAnsiTheme="majorHAnsi" w:cs="Noto Sans CJK SC" w:hint="eastAsia"/>
+      <w:rFonts w:ascii="Noto Sans CJK SC" w:asciiTheme="majorHAnsi" w:cs="Noto Sans CJK SC" w:cstheme="majorBidi" w:eastAsia="Noto Sans CJK SC" w:eastAsiaTheme="majorEastAsia" w:hAnsi="Noto Sans CJK SC" w:hAnsiTheme="majorHAnsi" w:hint="eastAsia"/>
       <w:b/>
       <w:color w:val="1F5F8B"/>
       <w:sz w:val="40"/>
@@ -26469,7 +27398,7 @@
       <w:outlineLvl w:val="1"/>
     </w:pPr>
     <w:rPr>
-      <w:rFonts w:ascii="Noto Sans CJK SC" w:asciiTheme="majorHAnsi" w:cstheme="majorBidi" w:eastAsia="Noto Sans CJK SC" w:eastAsiaTheme="majorEastAsia" w:hAnsi="Noto Sans CJK SC" w:hAnsiTheme="majorHAnsi" w:cs="Noto Sans CJK SC" w:hint="eastAsia"/>
+      <w:rFonts w:ascii="Noto Sans CJK SC" w:asciiTheme="majorHAnsi" w:cs="Noto Sans CJK SC" w:cstheme="majorBidi" w:eastAsia="Noto Sans CJK SC" w:eastAsiaTheme="majorEastAsia" w:hAnsi="Noto Sans CJK SC" w:hAnsiTheme="majorHAnsi" w:hint="eastAsia"/>
       <w:b/>
       <w:color w:val="1F5F8B"/>
       <w:sz w:val="31"/>
@@ -26493,7 +27422,7 @@
       <w:outlineLvl w:val="2"/>
     </w:pPr>
     <w:rPr>
-      <w:rFonts w:ascii="Noto Sans CJK SC" w:cstheme="majorBidi" w:eastAsia="Noto Sans CJK SC" w:eastAsiaTheme="majorEastAsia" w:hAnsi="Noto Sans CJK SC" w:cs="Noto Sans CJK SC" w:hint="eastAsia"/>
+      <w:rFonts w:ascii="Noto Sans CJK SC" w:cs="Noto Sans CJK SC" w:cstheme="majorBidi" w:eastAsia="Noto Sans CJK SC" w:eastAsiaTheme="majorEastAsia" w:hAnsi="Noto Sans CJK SC" w:hint="eastAsia"/>
       <w:b/>
       <w:color w:val="1F5F8B"/>
       <w:sz w:val="25"/>
@@ -26517,7 +27446,7 @@
       <w:outlineLvl w:val="3"/>
     </w:pPr>
     <w:rPr>
-      <w:rFonts w:ascii="Noto Sans CJK SC" w:cstheme="majorBidi" w:eastAsia="Noto Sans CJK SC" w:eastAsiaTheme="majorEastAsia" w:hAnsi="Noto Sans CJK SC" w:cs="Noto Sans CJK SC" w:hint="eastAsia"/>
+      <w:rFonts w:ascii="Noto Sans CJK SC" w:cs="Noto Sans CJK SC" w:cstheme="majorBidi" w:eastAsia="Noto Sans CJK SC" w:eastAsiaTheme="majorEastAsia" w:hAnsi="Noto Sans CJK SC" w:hint="eastAsia"/>
       <w:b/>
       <w:i/>
       <w:iCs/>
@@ -26542,7 +27471,7 @@
       <w:outlineLvl w:val="4"/>
     </w:pPr>
     <w:rPr>
-      <w:rFonts w:cstheme="majorBidi" w:eastAsia="Noto Sans CJK SC" w:eastAsiaTheme="majorEastAsia" w:ascii="Noto Sans CJK SC" w:hAnsi="Noto Sans CJK SC" w:cs="Noto Sans CJK SC" w:hint="eastAsia"/>
+      <w:rFonts w:ascii="Noto Sans CJK SC" w:cs="Noto Sans CJK SC" w:cstheme="majorBidi" w:eastAsia="Noto Sans CJK SC" w:eastAsiaTheme="majorEastAsia" w:hAnsi="Noto Sans CJK SC" w:hint="eastAsia"/>
       <w:color w:themeColor="accent1" w:themeShade="BF" w:val="0F4761"/>
     </w:rPr>
   </w:style>
@@ -26563,7 +27492,7 @@
       <w:outlineLvl w:val="5"/>
     </w:pPr>
     <w:rPr>
-      <w:rFonts w:cstheme="majorBidi" w:eastAsia="Noto Sans CJK SC" w:eastAsiaTheme="majorEastAsia" w:ascii="Noto Sans CJK SC" w:hAnsi="Noto Sans CJK SC" w:cs="Noto Sans CJK SC" w:hint="eastAsia"/>
+      <w:rFonts w:ascii="Noto Sans CJK SC" w:cs="Noto Sans CJK SC" w:cstheme="majorBidi" w:eastAsia="Noto Sans CJK SC" w:eastAsiaTheme="majorEastAsia" w:hAnsi="Noto Sans CJK SC" w:hint="eastAsia"/>
       <w:i/>
       <w:iCs/>
       <w:color w:themeColor="text1" w:themeTint="A6" w:val="595959"/>
@@ -26586,7 +27515,7 @@
       <w:outlineLvl w:val="6"/>
     </w:pPr>
     <w:rPr>
-      <w:rFonts w:cstheme="majorBidi" w:eastAsia="Noto Sans CJK SC" w:eastAsiaTheme="majorEastAsia" w:ascii="Noto Sans CJK SC" w:hAnsi="Noto Sans CJK SC" w:cs="Noto Sans CJK SC" w:hint="eastAsia"/>
+      <w:rFonts w:ascii="Noto Sans CJK SC" w:cs="Noto Sans CJK SC" w:cstheme="majorBidi" w:eastAsia="Noto Sans CJK SC" w:eastAsiaTheme="majorEastAsia" w:hAnsi="Noto Sans CJK SC" w:hint="eastAsia"/>
       <w:color w:themeColor="text1" w:themeTint="A6" w:val="595959"/>
     </w:rPr>
   </w:style>
@@ -26607,7 +27536,7 @@
       <w:outlineLvl w:val="7"/>
     </w:pPr>
     <w:rPr>
-      <w:rFonts w:cstheme="majorBidi" w:eastAsia="Noto Sans CJK SC" w:eastAsiaTheme="majorEastAsia" w:ascii="Noto Sans CJK SC" w:hAnsi="Noto Sans CJK SC" w:cs="Noto Sans CJK SC" w:hint="eastAsia"/>
+      <w:rFonts w:ascii="Noto Sans CJK SC" w:cs="Noto Sans CJK SC" w:cstheme="majorBidi" w:eastAsia="Noto Sans CJK SC" w:eastAsiaTheme="majorEastAsia" w:hAnsi="Noto Sans CJK SC" w:hint="eastAsia"/>
       <w:i/>
       <w:iCs/>
       <w:color w:themeColor="text1" w:themeTint="D8" w:val="272727"/>
@@ -26630,7 +27559,7 @@
       <w:outlineLvl w:val="8"/>
     </w:pPr>
     <w:rPr>
-      <w:rFonts w:cstheme="majorBidi" w:eastAsia="Noto Sans CJK SC" w:eastAsiaTheme="majorEastAsia" w:ascii="Noto Sans CJK SC" w:hAnsi="Noto Sans CJK SC" w:cs="Noto Sans CJK SC" w:hint="eastAsia"/>
+      <w:rFonts w:ascii="Noto Sans CJK SC" w:cs="Noto Sans CJK SC" w:cstheme="majorBidi" w:eastAsia="Noto Sans CJK SC" w:eastAsiaTheme="majorEastAsia" w:hAnsi="Noto Sans CJK SC" w:hint="eastAsia"/>
       <w:color w:themeColor="text1" w:themeTint="D8" w:val="272727"/>
     </w:rPr>
   </w:style>
@@ -26641,7 +27570,7 @@
     <w:uiPriority w:val="9"/>
     <w:rsid w:val="00A10FD9"/>
     <w:rPr>
-      <w:rFonts w:asciiTheme="majorHAnsi" w:cstheme="majorBidi" w:eastAsia="Songti SC" w:eastAsiaTheme="majorEastAsia" w:hAnsiTheme="majorHAnsi"/>
+      <w:rFonts w:ascii="Noto Sans CJK SC" w:asciiTheme="majorHAnsi" w:cs="Noto Sans CJK SC" w:cstheme="majorBidi" w:eastAsia="Noto Sans CJK SC" w:eastAsiaTheme="majorEastAsia" w:hAnsi="Noto Sans CJK SC" w:hAnsiTheme="majorHAnsi" w:hint="eastAsia"/>
       <w:color w:themeColor="accent1" w:themeShade="BF" w:val="0F4761"/>
       <w:sz w:val="40"/>
       <w:szCs w:val="40"/>
@@ -26655,7 +27584,7 @@
     <w:semiHidden/>
     <w:rsid w:val="00A10FD9"/>
     <w:rPr>
-      <w:rFonts w:asciiTheme="majorHAnsi" w:cstheme="majorBidi" w:eastAsia="Songti SC" w:eastAsiaTheme="majorEastAsia" w:hAnsiTheme="majorHAnsi"/>
+      <w:rFonts w:ascii="Noto Sans CJK SC" w:asciiTheme="majorHAnsi" w:cs="Noto Sans CJK SC" w:cstheme="majorBidi" w:eastAsia="Noto Sans CJK SC" w:eastAsiaTheme="majorEastAsia" w:hAnsi="Noto Sans CJK SC" w:hAnsiTheme="majorHAnsi" w:hint="eastAsia"/>
       <w:color w:themeColor="accent1" w:themeShade="BF" w:val="0F4761"/>
       <w:sz w:val="32"/>
       <w:szCs w:val="32"/>
@@ -26669,7 +27598,7 @@
     <w:semiHidden/>
     <w:rsid w:val="00A10FD9"/>
     <w:rPr>
-      <w:rFonts w:cstheme="majorBidi" w:eastAsia="Songti SC" w:eastAsiaTheme="majorEastAsia"/>
+      <w:rFonts w:ascii="Noto Sans CJK SC" w:cs="Noto Sans CJK SC" w:cstheme="majorBidi" w:eastAsia="Noto Sans CJK SC" w:eastAsiaTheme="majorEastAsia" w:hAnsi="Noto Sans CJK SC" w:hint="eastAsia"/>
       <w:color w:themeColor="accent1" w:themeShade="BF" w:val="0F4761"/>
       <w:sz w:val="28"/>
       <w:szCs w:val="28"/>
@@ -26683,7 +27612,7 @@
     <w:semiHidden/>
     <w:rsid w:val="00A10FD9"/>
     <w:rPr>
-      <w:rFonts w:cstheme="majorBidi" w:eastAsia="Songti SC" w:eastAsiaTheme="majorEastAsia"/>
+      <w:rFonts w:ascii="Noto Sans CJK SC" w:cs="Noto Sans CJK SC" w:cstheme="majorBidi" w:eastAsia="Noto Sans CJK SC" w:eastAsiaTheme="majorEastAsia" w:hAnsi="Noto Sans CJK SC" w:hint="eastAsia"/>
       <w:i/>
       <w:iCs/>
       <w:color w:themeColor="accent1" w:themeShade="BF" w:val="0F4761"/>
@@ -26697,7 +27626,7 @@
     <w:semiHidden/>
     <w:rsid w:val="00A10FD9"/>
     <w:rPr>
-      <w:rFonts w:cstheme="majorBidi" w:eastAsia="Songti SC" w:eastAsiaTheme="majorEastAsia"/>
+      <w:rFonts w:ascii="Noto Sans CJK SC" w:cs="Noto Sans CJK SC" w:cstheme="majorBidi" w:eastAsia="Noto Sans CJK SC" w:eastAsiaTheme="majorEastAsia" w:hAnsi="Noto Sans CJK SC" w:hint="eastAsia"/>
       <w:color w:themeColor="accent1" w:themeShade="BF" w:val="0F4761"/>
     </w:rPr>
   </w:style>
@@ -26709,7 +27638,7 @@
     <w:semiHidden/>
     <w:rsid w:val="00A10FD9"/>
     <w:rPr>
-      <w:rFonts w:cstheme="majorBidi" w:eastAsia="Songti SC" w:eastAsiaTheme="majorEastAsia"/>
+      <w:rFonts w:ascii="Noto Sans CJK SC" w:cs="Noto Sans CJK SC" w:cstheme="majorBidi" w:eastAsia="Noto Sans CJK SC" w:eastAsiaTheme="majorEastAsia" w:hAnsi="Noto Sans CJK SC" w:hint="eastAsia"/>
       <w:i/>
       <w:iCs/>
       <w:color w:themeColor="text1" w:themeTint="A6" w:val="595959"/>
@@ -26723,7 +27652,7 @@
     <w:semiHidden/>
     <w:rsid w:val="00A10FD9"/>
     <w:rPr>
-      <w:rFonts w:cstheme="majorBidi" w:eastAsia="Songti SC" w:eastAsiaTheme="majorEastAsia"/>
+      <w:rFonts w:ascii="Noto Sans CJK SC" w:cs="Noto Sans CJK SC" w:cstheme="majorBidi" w:eastAsia="Noto Sans CJK SC" w:eastAsiaTheme="majorEastAsia" w:hAnsi="Noto Sans CJK SC" w:hint="eastAsia"/>
       <w:color w:themeColor="text1" w:themeTint="A6" w:val="595959"/>
     </w:rPr>
   </w:style>
@@ -26735,7 +27664,7 @@
     <w:semiHidden/>
     <w:rsid w:val="00A10FD9"/>
     <w:rPr>
-      <w:rFonts w:cstheme="majorBidi" w:eastAsia="Songti SC" w:eastAsiaTheme="majorEastAsia"/>
+      <w:rFonts w:ascii="Noto Sans CJK SC" w:cs="Noto Sans CJK SC" w:cstheme="majorBidi" w:eastAsia="Noto Sans CJK SC" w:eastAsiaTheme="majorEastAsia" w:hAnsi="Noto Sans CJK SC" w:hint="eastAsia"/>
       <w:i/>
       <w:iCs/>
       <w:color w:themeColor="text1" w:themeTint="D8" w:val="272727"/>
@@ -26749,7 +27678,7 @@
     <w:semiHidden/>
     <w:rsid w:val="00A10FD9"/>
     <w:rPr>
-      <w:rFonts w:cstheme="majorBidi" w:eastAsia="Songti SC" w:eastAsiaTheme="majorEastAsia"/>
+      <w:rFonts w:ascii="Noto Sans CJK SC" w:cs="Noto Sans CJK SC" w:cstheme="majorBidi" w:eastAsia="Noto Sans CJK SC" w:eastAsiaTheme="majorEastAsia" w:hAnsi="Noto Sans CJK SC" w:hint="eastAsia"/>
       <w:color w:themeColor="text1" w:themeTint="D8" w:val="272727"/>
     </w:rPr>
   </w:style>
@@ -26765,7 +27694,7 @@
       <w:ind w:firstLine="0" w:left="397" w:right="227"/>
     </w:pPr>
     <w:rPr>
-      <w:rFonts w:ascii="Noto Sans CJK SC" w:eastAsia="Noto Sans CJK SC" w:hAnsi="Noto Sans CJK SC" w:cs="Noto Sans CJK SC" w:hint="eastAsia"/>
+      <w:rFonts w:ascii="Noto Sans CJK SC" w:cs="Noto Sans CJK SC" w:eastAsia="Noto Sans CJK SC" w:hAnsi="Noto Sans CJK SC" w:hint="eastAsia"/>
       <w:color w:val="5B6573"/>
       <w:sz w:val="20"/>
     </w:rPr>
@@ -26778,7 +27707,7 @@
     <w:unhideWhenUsed/>
     <w:qFormat/>
     <w:rPr>
-      <w:rFonts w:ascii="Noto Sans CJK SC" w:hAnsi="Noto Sans CJK SC" w:eastAsia="Noto Sans CJK SC" w:cs="Noto Sans CJK SC" w:hint="eastAsia"/>
+      <w:rFonts w:ascii="Noto Sans CJK SC" w:cs="Noto Sans CJK SC" w:eastAsia="Noto Sans CJK SC" w:hAnsi="Noto Sans CJK SC" w:hint="eastAsia"/>
     </w:rPr>
   </w:style>
   <w:style w:styleId="FootnoteBlockText" w:type="paragraph">
@@ -26793,7 +27722,7 @@
       <w:ind w:firstLine="0" w:left="480" w:right="480"/>
     </w:pPr>
     <w:rPr>
-      <w:rFonts w:ascii="Noto Sans CJK SC" w:hAnsi="Noto Sans CJK SC" w:eastAsia="Noto Sans CJK SC" w:cs="Noto Sans CJK SC" w:hint="eastAsia"/>
+      <w:rFonts w:ascii="Noto Sans CJK SC" w:cs="Noto Sans CJK SC" w:eastAsia="Noto Sans CJK SC" w:hAnsi="Noto Sans CJK SC" w:hint="eastAsia"/>
     </w:rPr>
   </w:style>
   <w:style w:default="1" w:styleId="DefaultParagraphFont" w:type="character">
@@ -26839,7 +27768,7 @@
       <w:spacing w:after="0"/>
     </w:pPr>
     <w:rPr>
-      <w:rFonts w:ascii="Noto Sans CJK SC" w:hAnsi="Noto Sans CJK SC" w:eastAsia="Noto Sans CJK SC" w:cs="Noto Sans CJK SC" w:hint="eastAsia"/>
+      <w:rFonts w:ascii="Noto Sans CJK SC" w:cs="Noto Sans CJK SC" w:eastAsia="Noto Sans CJK SC" w:hAnsi="Noto Sans CJK SC" w:hint="eastAsia"/>
       <w:b/>
     </w:rPr>
   </w:style>
@@ -26847,7 +27776,7 @@
     <w:name w:val="Definition"/>
     <w:basedOn w:val="Normal"/>
     <w:rPr>
-      <w:rFonts w:ascii="Noto Sans CJK SC" w:hAnsi="Noto Sans CJK SC" w:eastAsia="Noto Sans CJK SC" w:cs="Noto Sans CJK SC" w:hint="eastAsia"/>
+      <w:rFonts w:ascii="Noto Sans CJK SC" w:cs="Noto Sans CJK SC" w:eastAsia="Noto Sans CJK SC" w:hAnsi="Noto Sans CJK SC" w:hint="eastAsia"/>
     </w:rPr>
   </w:style>
   <w:style w:styleId="Caption" w:type="paragraph">
@@ -26859,7 +27788,7 @@
       <w:spacing w:after="100" w:before="100" w:line="276" w:lineRule="auto"/>
     </w:pPr>
     <w:rPr>
-      <w:rFonts w:ascii="Noto Sans CJK SC" w:eastAsia="Noto Sans CJK SC" w:hAnsi="Noto Sans CJK SC" w:cs="Noto Sans CJK SC" w:hint="eastAsia"/>
+      <w:rFonts w:ascii="Noto Sans CJK SC" w:cs="Noto Sans CJK SC" w:eastAsia="Noto Sans CJK SC" w:hAnsi="Noto Sans CJK SC" w:hint="eastAsia"/>
       <w:i/>
       <w:color w:val="5B6573"/>
       <w:sz w:val="18"/>
@@ -26873,7 +27802,7 @@
       <w:spacing w:after="100" w:before="100" w:line="276" w:lineRule="auto"/>
     </w:pPr>
     <w:rPr>
-      <w:rFonts w:ascii="Noto Sans CJK SC" w:eastAsia="Noto Sans CJK SC" w:hAnsi="Noto Sans CJK SC" w:cs="Noto Sans CJK SC" w:hint="eastAsia"/>
+      <w:rFonts w:ascii="Noto Sans CJK SC" w:cs="Noto Sans CJK SC" w:eastAsia="Noto Sans CJK SC" w:hAnsi="Noto Sans CJK SC" w:hint="eastAsia"/>
       <w:color w:val="5B6573"/>
       <w:sz w:val="18"/>
     </w:rPr>
@@ -26882,14 +27811,14 @@
     <w:name w:val="Image Caption"/>
     <w:basedOn w:val="Caption"/>
     <w:rPr>
-      <w:rFonts w:ascii="Noto Sans CJK SC" w:hAnsi="Noto Sans CJK SC" w:eastAsia="Noto Sans CJK SC" w:cs="Noto Sans CJK SC" w:hint="eastAsia"/>
+      <w:rFonts w:ascii="Noto Sans CJK SC" w:cs="Noto Sans CJK SC" w:eastAsia="Noto Sans CJK SC" w:hAnsi="Noto Sans CJK SC" w:hint="eastAsia"/>
     </w:rPr>
   </w:style>
   <w:style w:customStyle="1" w:styleId="Figure" w:type="paragraph">
     <w:name w:val="Figure"/>
     <w:basedOn w:val="Normal"/>
     <w:rPr>
-      <w:rFonts w:ascii="Noto Sans CJK SC" w:hAnsi="Noto Sans CJK SC" w:eastAsia="Noto Sans CJK SC" w:cs="Noto Sans CJK SC" w:hint="eastAsia"/>
+      <w:rFonts w:ascii="Noto Sans CJK SC" w:cs="Noto Sans CJK SC" w:eastAsia="Noto Sans CJK SC" w:hAnsi="Noto Sans CJK SC" w:hint="eastAsia"/>
     </w:rPr>
   </w:style>
   <w:style w:customStyle="1" w:styleId="CaptionedFigure" w:type="paragraph">
@@ -26899,7 +27828,7 @@
       <w:keepNext/>
     </w:pPr>
     <w:rPr>
-      <w:rFonts w:ascii="Noto Sans CJK SC" w:hAnsi="Noto Sans CJK SC" w:eastAsia="Noto Sans CJK SC" w:cs="Noto Sans CJK SC" w:hint="eastAsia"/>
+      <w:rFonts w:ascii="Noto Sans CJK SC" w:cs="Noto Sans CJK SC" w:eastAsia="Noto Sans CJK SC" w:hAnsi="Noto Sans CJK SC" w:hint="eastAsia"/>
     </w:rPr>
   </w:style>
   <w:style w:customStyle="1" w:styleId="BodyTextChar" w:type="character">
@@ -26911,7 +27840,7 @@
     <w:name w:val="Verbatim Char"/>
     <w:basedOn w:val="BodyTextChar"/>
     <w:rPr>
-      <w:rFonts w:ascii="SFMono-Regular" w:eastAsia="Songti SC" w:hAnsi="SFMono-Regular"/>
+      <w:rFonts w:ascii="Noto Sans CJK SC" w:cs="Noto Sans CJK SC" w:eastAsia="Noto Sans CJK SC" w:hAnsi="Noto Sans CJK SC" w:hint="eastAsia"/>
       <w:color w:val="1F2937"/>
       <w:sz w:val="18"/>
     </w:rPr>
@@ -26925,13 +27854,14 @@
     <w:basedOn w:val="BodyTextChar"/>
     <w:rPr>
       <w:vertAlign w:val="superscript"/>
+      <w:rFonts w:ascii="Noto Sans CJK SC" w:cs="Noto Sans CJK SC" w:eastAsia="Noto Sans CJK SC" w:hAnsi="Noto Sans CJK SC" w:hint="eastAsia"/>
     </w:rPr>
   </w:style>
   <w:style w:styleId="Hyperlink" w:type="character">
     <w:name w:val="Hyperlink"/>
     <w:basedOn w:val="BodyTextChar"/>
     <w:rPr>
-      <w:rFonts w:ascii="Aptos" w:eastAsia="Songti SC" w:hAnsi="Aptos"/>
+      <w:rFonts w:ascii="Noto Sans CJK SC" w:cs="Noto Sans CJK SC" w:eastAsia="Noto Sans CJK SC" w:hAnsi="Noto Sans CJK SC" w:hint="eastAsia"/>
       <w:color w:val="1F5F8B"/>
       <w:sz w:val="21"/>
       <w:u w:val="single"/>
@@ -26949,7 +27879,7 @@
       <w:outlineLvl w:val="9"/>
     </w:pPr>
     <w:rPr>
-      <w:rFonts w:asciiTheme="majorHAnsi" w:cstheme="majorBidi" w:eastAsia="Noto Sans CJK SC" w:eastAsiaTheme="majorEastAsia" w:hAnsiTheme="majorHAnsi" w:ascii="Noto Sans CJK SC" w:hAnsi="Noto Sans CJK SC" w:cs="Noto Sans CJK SC" w:hint="eastAsia"/>
+      <w:rFonts w:ascii="Noto Sans CJK SC" w:asciiTheme="majorHAnsi" w:cs="Noto Sans CJK SC" w:cstheme="majorBidi" w:eastAsia="Noto Sans CJK SC" w:eastAsiaTheme="majorEastAsia" w:hAnsi="Noto Sans CJK SC" w:hAnsiTheme="majorHAnsi" w:hint="eastAsia"/>
       <w:b w:val="0"/>
       <w:bCs w:val="0"/>
       <w:color w:themeColor="accent1" w:themeShade="BF" w:val="365F91"/>
@@ -26965,7 +27895,7 @@
       <w:ind w:left="255"/>
     </w:pPr>
     <w:rPr>
-      <w:rFonts w:ascii="Noto Sans CJK SC" w:eastAsia="Noto Sans CJK SC" w:hAnsi="Noto Sans CJK SC" w:cs="Noto Sans CJK SC" w:hint="eastAsia"/>
+      <w:rFonts w:ascii="Noto Sans CJK SC" w:cs="Noto Sans CJK SC" w:eastAsia="Noto Sans CJK SC" w:hAnsi="Noto Sans CJK SC" w:hint="eastAsia"/>
       <w:color w:val="1F2937"/>
       <w:sz w:val="17"/>
     </w:rPr>
@@ -26976,6 +27906,7 @@
     <w:rPr>
       <w:b/>
       <w:color w:val="007020"/>
+      <w:rFonts w:ascii="Noto Sans CJK SC" w:cs="Noto Sans CJK SC" w:eastAsia="Noto Sans CJK SC" w:hAnsi="Noto Sans CJK SC" w:hint="eastAsia"/>
     </w:rPr>
   </w:style>
   <w:style w:customStyle="1" w:styleId="DataTypeTok" w:type="character">
@@ -26983,6 +27914,7 @@
     <w:basedOn w:val="VerbatimChar"/>
     <w:rPr>
       <w:color w:val="902000"/>
+      <w:rFonts w:ascii="Noto Sans CJK SC" w:cs="Noto Sans CJK SC" w:eastAsia="Noto Sans CJK SC" w:hAnsi="Noto Sans CJK SC" w:hint="eastAsia"/>
     </w:rPr>
   </w:style>
   <w:style w:customStyle="1" w:styleId="DecValTok" w:type="character">
@@ -26990,6 +27922,7 @@
     <w:basedOn w:val="VerbatimChar"/>
     <w:rPr>
       <w:color w:val="40a070"/>
+      <w:rFonts w:ascii="Noto Sans CJK SC" w:cs="Noto Sans CJK SC" w:eastAsia="Noto Sans CJK SC" w:hAnsi="Noto Sans CJK SC" w:hint="eastAsia"/>
     </w:rPr>
   </w:style>
   <w:style w:customStyle="1" w:styleId="BaseNTok" w:type="character">
@@ -26997,6 +27930,7 @@
     <w:basedOn w:val="VerbatimChar"/>
     <w:rPr>
       <w:color w:val="40a070"/>
+      <w:rFonts w:ascii="Noto Sans CJK SC" w:cs="Noto Sans CJK SC" w:eastAsia="Noto Sans CJK SC" w:hAnsi="Noto Sans CJK SC" w:hint="eastAsia"/>
     </w:rPr>
   </w:style>
   <w:style w:customStyle="1" w:styleId="FloatTok" w:type="character">
@@ -27004,6 +27938,7 @@
     <w:basedOn w:val="VerbatimChar"/>
     <w:rPr>
       <w:color w:val="40a070"/>
+      <w:rFonts w:ascii="Noto Sans CJK SC" w:cs="Noto Sans CJK SC" w:eastAsia="Noto Sans CJK SC" w:hAnsi="Noto Sans CJK SC" w:hint="eastAsia"/>
     </w:rPr>
   </w:style>
   <w:style w:customStyle="1" w:styleId="ConstantTok" w:type="character">
@@ -27011,6 +27946,7 @@
     <w:basedOn w:val="VerbatimChar"/>
     <w:rPr>
       <w:color w:val="880000"/>
+      <w:rFonts w:ascii="Noto Sans CJK SC" w:cs="Noto Sans CJK SC" w:eastAsia="Noto Sans CJK SC" w:hAnsi="Noto Sans CJK SC" w:hint="eastAsia"/>
     </w:rPr>
   </w:style>
   <w:style w:customStyle="1" w:styleId="CharTok" w:type="character">
@@ -27018,6 +27954,7 @@
     <w:basedOn w:val="VerbatimChar"/>
     <w:rPr>
       <w:color w:val="4070a0"/>
+      <w:rFonts w:ascii="Noto Sans CJK SC" w:cs="Noto Sans CJK SC" w:eastAsia="Noto Sans CJK SC" w:hAnsi="Noto Sans CJK SC" w:hint="eastAsia"/>
     </w:rPr>
   </w:style>
   <w:style w:customStyle="1" w:styleId="SpecialCharTok" w:type="character">
@@ -27025,6 +27962,7 @@
     <w:basedOn w:val="VerbatimChar"/>
     <w:rPr>
       <w:color w:val="4070a0"/>
+      <w:rFonts w:ascii="Noto Sans CJK SC" w:cs="Noto Sans CJK SC" w:eastAsia="Noto Sans CJK SC" w:hAnsi="Noto Sans CJK SC" w:hint="eastAsia"/>
     </w:rPr>
   </w:style>
   <w:style w:customStyle="1" w:styleId="StringTok" w:type="character">
@@ -27032,6 +27970,7 @@
     <w:basedOn w:val="VerbatimChar"/>
     <w:rPr>
       <w:color w:val="4070a0"/>
+      <w:rFonts w:ascii="Noto Sans CJK SC" w:cs="Noto Sans CJK SC" w:eastAsia="Noto Sans CJK SC" w:hAnsi="Noto Sans CJK SC" w:hint="eastAsia"/>
     </w:rPr>
   </w:style>
   <w:style w:customStyle="1" w:styleId="VerbatimStringTok" w:type="character">
@@ -27039,6 +27978,7 @@
     <w:basedOn w:val="VerbatimChar"/>
     <w:rPr>
       <w:color w:val="4070a0"/>
+      <w:rFonts w:ascii="Noto Sans CJK SC" w:cs="Noto Sans CJK SC" w:eastAsia="Noto Sans CJK SC" w:hAnsi="Noto Sans CJK SC" w:hint="eastAsia"/>
     </w:rPr>
   </w:style>
   <w:style w:customStyle="1" w:styleId="SpecialStringTok" w:type="character">
@@ -27046,6 +27986,7 @@
     <w:basedOn w:val="VerbatimChar"/>
     <w:rPr>
       <w:color w:val="bb6688"/>
+      <w:rFonts w:ascii="Noto Sans CJK SC" w:cs="Noto Sans CJK SC" w:eastAsia="Noto Sans CJK SC" w:hAnsi="Noto Sans CJK SC" w:hint="eastAsia"/>
     </w:rPr>
   </w:style>
   <w:style w:customStyle="1" w:styleId="ImportTok" w:type="character">
@@ -27054,6 +27995,7 @@
     <w:rPr>
       <w:b/>
       <w:color w:val="008000"/>
+      <w:rFonts w:ascii="Noto Sans CJK SC" w:cs="Noto Sans CJK SC" w:eastAsia="Noto Sans CJK SC" w:hAnsi="Noto Sans CJK SC" w:hint="eastAsia"/>
     </w:rPr>
   </w:style>
   <w:style w:customStyle="1" w:styleId="CommentTok" w:type="character">
@@ -27062,6 +28004,7 @@
     <w:rPr>
       <w:i/>
       <w:color w:val="60a0b0"/>
+      <w:rFonts w:ascii="Noto Sans CJK SC" w:cs="Noto Sans CJK SC" w:eastAsia="Noto Sans CJK SC" w:hAnsi="Noto Sans CJK SC" w:hint="eastAsia"/>
     </w:rPr>
   </w:style>
   <w:style w:customStyle="1" w:styleId="DocumentationTok" w:type="character">
@@ -27070,6 +28013,7 @@
     <w:rPr>
       <w:i/>
       <w:color w:val="ba2121"/>
+      <w:rFonts w:ascii="Noto Sans CJK SC" w:cs="Noto Sans CJK SC" w:eastAsia="Noto Sans CJK SC" w:hAnsi="Noto Sans CJK SC" w:hint="eastAsia"/>
     </w:rPr>
   </w:style>
   <w:style w:customStyle="1" w:styleId="AnnotationTok" w:type="character">
@@ -27079,6 +28023,7 @@
       <w:b/>
       <w:i/>
       <w:color w:val="60a0b0"/>
+      <w:rFonts w:ascii="Noto Sans CJK SC" w:cs="Noto Sans CJK SC" w:eastAsia="Noto Sans CJK SC" w:hAnsi="Noto Sans CJK SC" w:hint="eastAsia"/>
     </w:rPr>
   </w:style>
   <w:style w:customStyle="1" w:styleId="CommentVarTok" w:type="character">
@@ -27088,6 +28033,7 @@
       <w:b/>
       <w:i/>
       <w:color w:val="60a0b0"/>
+      <w:rFonts w:ascii="Noto Sans CJK SC" w:cs="Noto Sans CJK SC" w:eastAsia="Noto Sans CJK SC" w:hAnsi="Noto Sans CJK SC" w:hint="eastAsia"/>
     </w:rPr>
   </w:style>
   <w:style w:customStyle="1" w:styleId="OtherTok" w:type="character">
@@ -27095,6 +28041,7 @@
     <w:basedOn w:val="VerbatimChar"/>
     <w:rPr>
       <w:color w:val="007020"/>
+      <w:rFonts w:ascii="Noto Sans CJK SC" w:cs="Noto Sans CJK SC" w:eastAsia="Noto Sans CJK SC" w:hAnsi="Noto Sans CJK SC" w:hint="eastAsia"/>
     </w:rPr>
   </w:style>
   <w:style w:customStyle="1" w:styleId="FunctionTok" w:type="character">
@@ -27102,6 +28049,7 @@
     <w:basedOn w:val="VerbatimChar"/>
     <w:rPr>
       <w:color w:val="06287e"/>
+      <w:rFonts w:ascii="Noto Sans CJK SC" w:cs="Noto Sans CJK SC" w:eastAsia="Noto Sans CJK SC" w:hAnsi="Noto Sans CJK SC" w:hint="eastAsia"/>
     </w:rPr>
   </w:style>
   <w:style w:customStyle="1" w:styleId="VariableTok" w:type="character">
@@ -27109,6 +28057,7 @@
     <w:basedOn w:val="VerbatimChar"/>
     <w:rPr>
       <w:color w:val="19177c"/>
+      <w:rFonts w:ascii="Noto Sans CJK SC" w:cs="Noto Sans CJK SC" w:eastAsia="Noto Sans CJK SC" w:hAnsi="Noto Sans CJK SC" w:hint="eastAsia"/>
     </w:rPr>
   </w:style>
   <w:style w:customStyle="1" w:styleId="ControlFlowTok" w:type="character">
@@ -27117,6 +28066,7 @@
     <w:rPr>
       <w:b/>
       <w:color w:val="007020"/>
+      <w:rFonts w:ascii="Noto Sans CJK SC" w:cs="Noto Sans CJK SC" w:eastAsia="Noto Sans CJK SC" w:hAnsi="Noto Sans CJK SC" w:hint="eastAsia"/>
     </w:rPr>
   </w:style>
   <w:style w:customStyle="1" w:styleId="OperatorTok" w:type="character">
@@ -27124,6 +28074,7 @@
     <w:basedOn w:val="VerbatimChar"/>
     <w:rPr>
       <w:color w:val="666666"/>
+      <w:rFonts w:ascii="Noto Sans CJK SC" w:cs="Noto Sans CJK SC" w:eastAsia="Noto Sans CJK SC" w:hAnsi="Noto Sans CJK SC" w:hint="eastAsia"/>
     </w:rPr>
   </w:style>
   <w:style w:customStyle="1" w:styleId="BuiltInTok" w:type="character">
@@ -27131,18 +28082,22 @@
     <w:basedOn w:val="VerbatimChar"/>
     <w:rPr>
       <w:color w:val="008000"/>
+      <w:rFonts w:ascii="Noto Sans CJK SC" w:cs="Noto Sans CJK SC" w:eastAsia="Noto Sans CJK SC" w:hAnsi="Noto Sans CJK SC" w:hint="eastAsia"/>
     </w:rPr>
   </w:style>
   <w:style w:customStyle="1" w:styleId="ExtensionTok" w:type="character">
     <w:name w:val="ExtensionTok"/>
     <w:basedOn w:val="VerbatimChar"/>
-    <w:rPr/>
+    <w:rPr>
+      <w:rFonts w:ascii="Noto Sans CJK SC" w:cs="Noto Sans CJK SC" w:eastAsia="Noto Sans CJK SC" w:hAnsi="Noto Sans CJK SC" w:hint="eastAsia"/>
+    </w:rPr>
   </w:style>
   <w:style w:customStyle="1" w:styleId="PreprocessorTok" w:type="character">
     <w:name w:val="PreprocessorTok"/>
     <w:basedOn w:val="VerbatimChar"/>
     <w:rPr>
       <w:color w:val="bc7a00"/>
+      <w:rFonts w:ascii="Noto Sans CJK SC" w:cs="Noto Sans CJK SC" w:eastAsia="Noto Sans CJK SC" w:hAnsi="Noto Sans CJK SC" w:hint="eastAsia"/>
     </w:rPr>
   </w:style>
   <w:style w:customStyle="1" w:styleId="AttributeTok" w:type="character">
@@ -27150,12 +28105,15 @@
     <w:basedOn w:val="VerbatimChar"/>
     <w:rPr>
       <w:color w:val="7d9029"/>
+      <w:rFonts w:ascii="Noto Sans CJK SC" w:cs="Noto Sans CJK SC" w:eastAsia="Noto Sans CJK SC" w:hAnsi="Noto Sans CJK SC" w:hint="eastAsia"/>
     </w:rPr>
   </w:style>
   <w:style w:customStyle="1" w:styleId="RegionMarkerTok" w:type="character">
     <w:name w:val="RegionMarkerTok"/>
     <w:basedOn w:val="VerbatimChar"/>
-    <w:rPr/>
+    <w:rPr>
+      <w:rFonts w:ascii="Noto Sans CJK SC" w:cs="Noto Sans CJK SC" w:eastAsia="Noto Sans CJK SC" w:hAnsi="Noto Sans CJK SC" w:hint="eastAsia"/>
+    </w:rPr>
   </w:style>
   <w:style w:customStyle="1" w:styleId="InformationTok" w:type="character">
     <w:name w:val="InformationTok"/>
@@ -27164,6 +28122,7 @@
       <w:b/>
       <w:i/>
       <w:color w:val="60a0b0"/>
+      <w:rFonts w:ascii="Noto Sans CJK SC" w:cs="Noto Sans CJK SC" w:eastAsia="Noto Sans CJK SC" w:hAnsi="Noto Sans CJK SC" w:hint="eastAsia"/>
     </w:rPr>
   </w:style>
   <w:style w:customStyle="1" w:styleId="WarningTok" w:type="character">
@@ -27173,6 +28132,7 @@
       <w:b/>
       <w:i/>
       <w:color w:val="60a0b0"/>
+      <w:rFonts w:ascii="Noto Sans CJK SC" w:cs="Noto Sans CJK SC" w:eastAsia="Noto Sans CJK SC" w:hAnsi="Noto Sans CJK SC" w:hint="eastAsia"/>
     </w:rPr>
   </w:style>
   <w:style w:customStyle="1" w:styleId="AlertTok" w:type="character">
@@ -27181,6 +28141,7 @@
     <w:rPr>
       <w:b/>
       <w:color w:val="ff0000"/>
+      <w:rFonts w:ascii="Noto Sans CJK SC" w:cs="Noto Sans CJK SC" w:eastAsia="Noto Sans CJK SC" w:hAnsi="Noto Sans CJK SC" w:hint="eastAsia"/>
     </w:rPr>
   </w:style>
   <w:style w:customStyle="1" w:styleId="ErrorTok" w:type="character">
@@ -27189,12 +28150,15 @@
     <w:rPr>
       <w:b/>
       <w:color w:val="ff0000"/>
+      <w:rFonts w:ascii="Noto Sans CJK SC" w:cs="Noto Sans CJK SC" w:eastAsia="Noto Sans CJK SC" w:hAnsi="Noto Sans CJK SC" w:hint="eastAsia"/>
     </w:rPr>
   </w:style>
   <w:style w:customStyle="1" w:styleId="NormalTok" w:type="character">
     <w:name w:val="NormalTok"/>
     <w:basedOn w:val="VerbatimChar"/>
-    <w:rPr/>
+    <w:rPr>
+      <w:rFonts w:ascii="Noto Sans CJK SC" w:cs="Noto Sans CJK SC" w:eastAsia="Noto Sans CJK SC" w:hAnsi="Noto Sans CJK SC" w:hint="eastAsia"/>
+    </w:rPr>
   </w:style>
 </w:styles>
 </file>

</xml_diff>

<commit_message>
paper: close exact review findings
</commit_message>
<xml_diff>
--- a/docs/paper/paper-idea-detailed-zh.docx
+++ b/docs/paper/paper-idea-detailed-zh.docx
@@ -58,7 +58,7 @@
         <w:t xml:space="preserve">2026-08-31</w:t>
       </w:r>
     </w:p>
-    <w:bookmarkStart w:id="658" w:name="阅读提示"/>
+    <w:bookmarkStart w:id="800" w:name="阅读提示"/>
     <w:p>
       <w:pPr>
         <w:pStyle w:val="Heading1"/>
@@ -1393,8 +1393,8 @@
         <w:t xml:space="preserve">CAS，目前证据不足，论文只能写“具体子原因未知”。</w:t>
       </w:r>
     </w:p>
-    <w:bookmarkEnd w:id="658"/>
-    <w:bookmarkStart w:id="662" w:name="一句话概括论文-idea"/>
+    <w:bookmarkEnd w:id="800"/>
+    <w:bookmarkStart w:id="804" w:name="一句话概括论文-idea"/>
     <w:p>
       <w:pPr>
         <w:pStyle w:val="Heading1"/>
@@ -1651,18 +1651,18 @@
           <wp:inline>
             <wp:extent cx="5760720" cy="3127247"/>
             <wp:effectExtent b="0" l="0" r="0" t="0"/>
-            <wp:docPr descr="版本绑定协议流程：Client A 拥有矩阵发布、元数据、完整计划和加密掩码；Client B 拥有查询与密钥、加密重排后的查询并完成重构；Cloud 只执行公开程序和密文操作数。" title="Figure 1" id="660" name="Picture"/>
+            <wp:docPr descr="版本绑定协议流程：Client A 拥有矩阵发布、元数据、完整计划和加密掩码；Client B 拥有查询与密钥、加密重排后的查询并完成重构；Cloud 只执行公开程序和密文操作数。" title="Figure 1" id="802" name="Picture"/>
             <a:graphic>
               <a:graphicData uri="http://schemas.openxmlformats.org/drawingml/2006/picture">
                 <pic:pic>
                   <pic:nvPicPr>
-                    <pic:cNvPr descr="assets/route-c-protocol-flow.png" id="661" name="Picture"/>
+                    <pic:cNvPr descr="assets/route-c-protocol-flow.png" id="803" name="Picture"/>
                     <pic:cNvPicPr>
                       <a:picLocks noChangeArrowheads="1" noChangeAspect="1"/>
                     </pic:cNvPicPr>
                   </pic:nvPicPr>
                   <pic:blipFill>
-                    <a:blip r:embed="rId659"/>
+                    <a:blip r:embed="rId801"/>
                     <a:stretch>
                       <a:fillRect/>
                     </a:stretch>
@@ -1736,8 +1736,8 @@
         <w:t xml:space="preserve">私有重构闭合起来。</w:t>
       </w:r>
     </w:p>
-    <w:bookmarkEnd w:id="662"/>
-    <w:bookmarkStart w:id="665" w:name="研究问题为什么存在"/>
+    <w:bookmarkEnd w:id="804"/>
+    <w:bookmarkStart w:id="807" w:name="研究问题为什么存在"/>
     <w:p>
       <w:pPr>
         <w:pStyle w:val="Heading1"/>
@@ -1762,7 +1762,7 @@
         <w:t xml:space="preserve">研究问题为什么存在</w:t>
       </w:r>
     </w:p>
-    <w:bookmarkStart w:id="663" w:name="静态-cssc-解决了什么"/>
+    <w:bookmarkStart w:id="805" w:name="静态-cssc-解决了什么"/>
     <w:p>
       <w:pPr>
         <w:pStyle w:val="Heading2"/>
@@ -3733,8 +3733,8 @@
         <w:t xml:space="preserve">决定，不能只根据纸面表格猜测。</w:t>
       </w:r>
     </w:p>
-    <w:bookmarkEnd w:id="663"/>
-    <w:bookmarkStart w:id="664" w:name="朴素解法为什么可能太贵"/>
+    <w:bookmarkEnd w:id="805"/>
+    <w:bookmarkStart w:id="806" w:name="朴素解法为什么可能太贵"/>
     <w:p>
       <w:pPr>
         <w:pStyle w:val="Heading2"/>
@@ -4305,9 +4305,9 @@
         <w:t xml:space="preserve">区域。</w:t>
       </w:r>
     </w:p>
-    <w:bookmarkEnd w:id="664"/>
-    <w:bookmarkEnd w:id="665"/>
-    <w:bookmarkStart w:id="680" w:name="与已有工作的边界本文的新意只剩什么"/>
+    <w:bookmarkEnd w:id="806"/>
+    <w:bookmarkEnd w:id="807"/>
+    <w:bookmarkStart w:id="822" w:name="与已有工作的边界本文的新意只剩什么"/>
     <w:p>
       <w:pPr>
         <w:pStyle w:val="Heading1"/>
@@ -4368,7 +4368,7 @@
         <w:t xml:space="preserve">叙事。</w:t>
       </w:r>
     </w:p>
-    <w:bookmarkStart w:id="673" w:name="静态加密稀疏线性代数已经很丰富"/>
+    <w:bookmarkStart w:id="815" w:name="静态加密稀疏线性代数已经很丰富"/>
     <w:p>
       <w:pPr>
         <w:pStyle w:val="Heading2"/>
@@ -4401,7 +4401,7 @@
           <w:numId w:val="1003"/>
         </w:numPr>
       </w:pPr>
-      <w:hyperlink r:id="rId666">
+      <w:hyperlink r:id="rId808">
         <w:r>
           <w:rPr>
             <w:rStyle w:val="Hyperlink"/>
@@ -4461,7 +4461,7 @@
           <w:numId w:val="1003"/>
         </w:numPr>
       </w:pPr>
-      <w:hyperlink r:id="rId667">
+      <w:hyperlink r:id="rId809">
         <w:r>
           <w:rPr>
             <w:rStyle w:val="Hyperlink"/>
@@ -4505,7 +4505,7 @@
         </w:rPr>
         <w:t xml:space="preserve">decomposition；</w:t>
       </w:r>
-      <w:hyperlink r:id="rId668">
+      <w:hyperlink r:id="rId810">
         <w:r>
           <w:rPr>
             <w:rStyle w:val="Hyperlink"/>
@@ -4558,7 +4558,7 @@
           <w:numId w:val="1003"/>
         </w:numPr>
       </w:pPr>
-      <w:hyperlink r:id="rId669">
+      <w:hyperlink r:id="rId811">
         <w:r>
           <w:rPr>
             <w:rStyle w:val="Hyperlink"/>
@@ -4614,7 +4614,7 @@
         </w:rPr>
         <w:t xml:space="preserve">indices，并利用双方稀疏性；</w:t>
       </w:r>
-      <w:hyperlink r:id="rId670">
+      <w:hyperlink r:id="rId812">
         <w:r>
           <w:rPr>
             <w:rStyle w:val="Hyperlink"/>
@@ -4781,7 +4781,7 @@
         </w:rPr>
         <w:t xml:space="preserve"> </w:t>
       </w:r>
-      <w:hyperlink r:id="rId671">
+      <w:hyperlink r:id="rId813">
         <w:r>
           <w:rPr>
             <w:rStyle w:val="Hyperlink"/>
@@ -4819,7 +4819,7 @@
         </w:rPr>
         <w:t xml:space="preserve"> </w:t>
       </w:r>
-      <w:hyperlink r:id="rId672">
+      <w:hyperlink r:id="rId814">
         <w:r>
           <w:rPr>
             <w:rStyle w:val="Hyperlink"/>
@@ -5002,8 +5002,8 @@
         <w:t xml:space="preserve"> publication-state maintenance。</w:t>
       </w:r>
     </w:p>
-    <w:bookmarkEnd w:id="673"/>
-    <w:bookmarkStart w:id="678" w:name="动态版本和掩码也不是孤立的新原语"/>
+    <w:bookmarkEnd w:id="815"/>
+    <w:bookmarkStart w:id="820" w:name="动态版本和掩码也不是孤立的新原语"/>
     <w:p>
       <w:pPr>
         <w:pStyle w:val="Heading2"/>
@@ -5032,7 +5032,7 @@
       <w:pPr>
         <w:pStyle w:val="FirstParagraph"/>
       </w:pPr>
-      <w:hyperlink r:id="rId674">
+      <w:hyperlink r:id="rId816">
         <w:r>
           <w:rPr>
             <w:rStyle w:val="Hyperlink"/>
@@ -5088,7 +5088,7 @@
         </w:rPr>
         <w:t xml:space="preserve">本身还可能显著增加存储与通信成本。</w:t>
       </w:r>
-      <w:hyperlink r:id="rId675">
+      <w:hyperlink r:id="rId817">
         <w:r>
           <w:rPr>
             <w:rStyle w:val="Hyperlink"/>
@@ -5173,7 +5173,7 @@
       <w:pPr>
         <w:pStyle w:val="BodyText"/>
       </w:pPr>
-      <w:hyperlink r:id="rId676">
+      <w:hyperlink r:id="rId818">
         <w:r>
           <w:rPr>
             <w:rStyle w:val="Hyperlink"/>
@@ -5217,7 +5217,7 @@
         </w:rPr>
         <w:t xml:space="preserve">shares，</w:t>
       </w:r>
-      <w:hyperlink r:id="rId677">
+      <w:hyperlink r:id="rId819">
         <w:r>
           <w:rPr>
             <w:rStyle w:val="Hyperlink"/>
@@ -5439,8 +5439,8 @@
         <w:t xml:space="preserve">被重复使用。</w:t>
       </w:r>
     </w:p>
-    <w:bookmarkEnd w:id="678"/>
-    <w:bookmarkStart w:id="679" w:name="因而最终只能采用窄-gap-statement"/>
+    <w:bookmarkEnd w:id="820"/>
+    <w:bookmarkStart w:id="821" w:name="因而最终只能采用窄-gap-statement"/>
     <w:p>
       <w:pPr>
         <w:pStyle w:val="Heading2"/>
@@ -5839,9 +5839,9 @@
         <w:t xml:space="preserve"> baseline。</w:t>
       </w:r>
     </w:p>
-    <w:bookmarkEnd w:id="679"/>
-    <w:bookmarkEnd w:id="680"/>
-    <w:bookmarkStart w:id="681" w:name="系统与威胁模型"/>
+    <w:bookmarkEnd w:id="821"/>
+    <w:bookmarkEnd w:id="822"/>
+    <w:bookmarkStart w:id="823" w:name="系统与威胁模型"/>
     <w:p>
       <w:pPr>
         <w:pStyle w:val="Heading1"/>
@@ -6488,8 +6488,8 @@
         <w:t xml:space="preserve"> simulation-based security proof。</w:t>
       </w:r>
     </w:p>
-    <w:bookmarkEnd w:id="681"/>
-    <w:bookmarkStart w:id="685" w:name="核心设计一版本绑定-publication-window"/>
+    <w:bookmarkEnd w:id="823"/>
+    <w:bookmarkStart w:id="827" w:name="核心设计一版本绑定-publication-window"/>
     <w:p>
       <w:pPr>
         <w:pStyle w:val="Heading1"/>
@@ -6520,7 +6520,7 @@
         <w:t xml:space="preserve"> Publication Window</w:t>
       </w:r>
     </w:p>
-    <w:bookmarkStart w:id="682" w:name="版本化状态"/>
+    <w:bookmarkStart w:id="824" w:name="版本化状态"/>
     <w:p>
       <w:pPr>
         <w:pStyle w:val="Heading2"/>
@@ -7285,8 +7285,8 @@
         </m:oMath>
       </m:oMathPara>
     </w:p>
-    <w:bookmarkEnd w:id="682"/>
-    <w:bookmarkStart w:id="683" w:name="原子提交规则"/>
+    <w:bookmarkEnd w:id="824"/>
+    <w:bookmarkStart w:id="825" w:name="原子提交规则"/>
     <w:p>
       <w:pPr>
         <w:pStyle w:val="Heading2"/>
@@ -8140,8 +8140,8 @@
         <w:t xml:space="preserve">基础设施重跑外，不做选择性重试。</w:t>
       </w:r>
     </w:p>
-    <w:bookmarkEnd w:id="683"/>
-    <w:bookmarkStart w:id="684" w:name="publication-window"/>
+    <w:bookmarkEnd w:id="825"/>
+    <w:bookmarkStart w:id="826" w:name="publication-window"/>
     <w:p>
       <w:pPr>
         <w:pStyle w:val="Heading2"/>
@@ -8493,9 +8493,9 @@
         <w:t xml:space="preserve">流量无限推迟新鲜度边界。窗口不能切开一个原子事件组。</w:t>
       </w:r>
     </w:p>
-    <w:bookmarkEnd w:id="684"/>
-    <w:bookmarkEnd w:id="685"/>
-    <w:bookmarkStart w:id="686" w:name="核心设计二版本化查询重排而不是列号取模"/>
+    <w:bookmarkEnd w:id="826"/>
+    <w:bookmarkEnd w:id="827"/>
+    <w:bookmarkStart w:id="828" w:name="核心设计二版本化查询重排而不是列号取模"/>
     <w:p>
       <w:pPr>
         <w:pStyle w:val="Heading1"/>
@@ -9384,8 +9384,8 @@
         <w:t xml:space="preserve"> typed bundle。</w:t>
       </w:r>
     </w:p>
-    <w:bookmarkEnd w:id="686"/>
-    <w:bookmarkStart w:id="690" w:name="核心设计三outputplan-统一重叠拼接和隐式零"/>
+    <w:bookmarkEnd w:id="828"/>
+    <w:bookmarkStart w:id="832" w:name="核心设计三outputplan-统一重叠拼接和隐式零"/>
     <w:p>
       <w:pPr>
         <w:pStyle w:val="Heading1"/>
@@ -9422,7 +9422,7 @@
         <w:t xml:space="preserve">统一重叠、拼接和隐式零</w:t>
       </w:r>
     </w:p>
-    <w:bookmarkStart w:id="687" w:name="为什么不能把所有返回密文直接相加"/>
+    <w:bookmarkStart w:id="829" w:name="为什么不能把所有返回密文直接相加"/>
     <w:p>
       <w:pPr>
         <w:pStyle w:val="Heading2"/>
@@ -9526,8 +9526,8 @@
         <w:t xml:space="preserve">如果只看“返回了几个密文”，无法区分这三种情况。</w:t>
       </w:r>
     </w:p>
-    <w:bookmarkEnd w:id="687"/>
-    <w:bookmarkStart w:id="688" w:name="映射与贡献集合"/>
+    <w:bookmarkEnd w:id="829"/>
+    <w:bookmarkStart w:id="830" w:name="映射与贡献集合"/>
     <w:p>
       <w:pPr>
         <w:pStyle w:val="Heading2"/>
@@ -10559,8 +10559,8 @@
         <w:t xml:space="preserve">不会被误加，重叠坐标也不会被误拼接。</w:t>
       </w:r>
     </w:p>
-    <w:bookmarkEnd w:id="688"/>
-    <w:bookmarkStart w:id="689" w:name="公开摘要与私有计划"/>
+    <w:bookmarkEnd w:id="830"/>
+    <w:bookmarkStart w:id="831" w:name="公开摘要与私有计划"/>
     <w:p>
       <w:pPr>
         <w:pStyle w:val="Heading2"/>
@@ -11424,9 +11424,9 @@
         <w:t xml:space="preserve">按完整计划恢复。</w:t>
       </w:r>
     </w:p>
-    <w:bookmarkEnd w:id="689"/>
-    <w:bookmarkEnd w:id="690"/>
-    <w:bookmarkStart w:id="695" w:name="核心设计四只对真实重叠做-f1-m-零和掩码"/>
+    <w:bookmarkEnd w:id="831"/>
+    <w:bookmarkEnd w:id="832"/>
+    <w:bookmarkStart w:id="837" w:name="核心设计四只对真实重叠做-f1-m-零和掩码"/>
     <w:p>
       <w:pPr>
         <w:pStyle w:val="Heading1"/>
@@ -11463,7 +11463,7 @@
         <w:t xml:space="preserve">零和掩码</w:t>
       </w:r>
     </w:p>
-    <w:bookmarkStart w:id="691" w:name="目标"/>
+    <w:bookmarkStart w:id="833" w:name="目标"/>
     <w:p>
       <w:pPr>
         <w:pStyle w:val="Heading2"/>
@@ -11583,8 +11583,8 @@
         <w:t xml:space="preserve">上，并把“一次性”要求变成持久化、可失败关闭的绑定。</w:t>
       </w:r>
     </w:p>
-    <w:bookmarkEnd w:id="691"/>
-    <w:bookmarkStart w:id="692" w:name="零和构造"/>
+    <w:bookmarkEnd w:id="833"/>
+    <w:bookmarkStart w:id="834" w:name="零和构造"/>
     <w:p>
       <w:pPr>
         <w:pStyle w:val="Heading2"/>
@@ -13089,8 +13089,8 @@
         <w:t xml:space="preserve">门禁证明，当前文字不得把代数抵消等式写成已经完成的安全证明。</w:t>
       </w:r>
     </w:p>
-    <w:bookmarkEnd w:id="692"/>
-    <w:bookmarkStart w:id="693" w:name="为什么-multiplicity-为-0-或-1-时不应随机掩码"/>
+    <w:bookmarkEnd w:id="834"/>
+    <w:bookmarkStart w:id="835" w:name="为什么-multiplicity-为-0-或-1-时不应随机掩码"/>
     <w:p>
       <w:pPr>
         <w:pStyle w:val="Heading2"/>
@@ -13328,8 +13328,8 @@
         <w:t xml:space="preserve">。它和随机零和掩码是两个不同的成本类别，不能混算。</w:t>
       </w:r>
     </w:p>
-    <w:bookmarkEnd w:id="693"/>
-    <w:bookmarkStart w:id="694" w:name="reserve-before-sample"/>
+    <w:bookmarkEnd w:id="835"/>
+    <w:bookmarkStart w:id="836" w:name="reserve-before-sample"/>
     <w:p>
       <w:pPr>
         <w:pStyle w:val="Heading2"/>
@@ -13595,9 +13595,9 @@
         <w:t xml:space="preserve">模型。仓库回滚、数据库复制、跨设备协调或数据库被攻破不在当前安全主张内。</w:t>
       </w:r>
     </w:p>
-    <w:bookmarkEnd w:id="694"/>
-    <w:bookmarkEnd w:id="695"/>
-    <w:bookmarkStart w:id="699" w:name="核心设计五固定分段-strong-delta"/>
+    <w:bookmarkEnd w:id="836"/>
+    <w:bookmarkEnd w:id="837"/>
+    <w:bookmarkStart w:id="841" w:name="核心设计五固定分段-strong-delta"/>
     <w:p>
       <w:pPr>
         <w:pStyle w:val="Heading1"/>
@@ -13628,7 +13628,7 @@
         <w:t xml:space="preserve"> strong delta</w:t>
       </w:r>
     </w:p>
-    <w:bookmarkStart w:id="696" w:name="设计动机"/>
+    <w:bookmarkStart w:id="838" w:name="设计动机"/>
     <w:p>
       <w:pPr>
         <w:pStyle w:val="Heading2"/>
@@ -14046,8 +14046,8 @@
         <w:t xml:space="preserve">由固定宽度段组成。</w:t>
       </w:r>
     </w:p>
-    <w:bookmarkEnd w:id="696"/>
-    <w:bookmarkStart w:id="697" w:name="固定宽度与页面"/>
+    <w:bookmarkEnd w:id="838"/>
+    <w:bookmarkStart w:id="839" w:name="固定宽度与页面"/>
     <w:p>
       <w:pPr>
         <w:pStyle w:val="Heading2"/>
@@ -14325,8 +14325,8 @@
         <w:t xml:space="preserve">对所有矩阵都最优”。</w:t>
       </w:r>
     </w:p>
-    <w:bookmarkEnd w:id="697"/>
-    <w:bookmarkStart w:id="698" w:name="cloud-侧固定-reduction"/>
+    <w:bookmarkEnd w:id="839"/>
+    <w:bookmarkStart w:id="840" w:name="cloud-侧固定-reduction"/>
     <w:p>
       <w:pPr>
         <w:pStyle w:val="Heading2"/>
@@ -15516,9 +15516,9 @@
         <w:t xml:space="preserve">dummy。由此既保持执行图的类型稳定，又把两类对象分别计费。</w:t>
       </w:r>
     </w:p>
-    <w:bookmarkEnd w:id="698"/>
-    <w:bookmarkEnd w:id="699"/>
-    <w:bookmarkStart w:id="700" w:name="三个固定策略不是在线万能选择器"/>
+    <w:bookmarkEnd w:id="840"/>
+    <w:bookmarkEnd w:id="841"/>
+    <w:bookmarkStart w:id="842" w:name="三个固定策略不是在线万能选择器"/>
     <w:p>
       <w:pPr>
         <w:pStyle w:val="Heading1"/>
@@ -15896,8 +15896,8 @@
         <w:t xml:space="preserve">中，三个固定机制本来会分别付出什么代价。</w:t>
       </w:r>
     </w:p>
-    <w:bookmarkEnd w:id="700"/>
-    <w:bookmarkStart w:id="704" w:name="成本与测量口径"/>
+    <w:bookmarkEnd w:id="842"/>
+    <w:bookmarkStart w:id="846" w:name="成本与测量口径"/>
     <w:p>
       <w:pPr>
         <w:pStyle w:val="Heading1"/>
@@ -15922,7 +15922,7 @@
         <w:t xml:space="preserve">成本与测量口径</w:t>
       </w:r>
     </w:p>
-    <w:bookmarkStart w:id="701" w:name="五类证据必须分开"/>
+    <w:bookmarkStart w:id="843" w:name="五类证据必须分开"/>
     <w:p>
       <w:pPr>
         <w:pStyle w:val="Heading2"/>
@@ -17128,8 +17128,8 @@
         <w:t xml:space="preserve">外推。</w:t>
       </w:r>
     </w:p>
-    <w:bookmarkEnd w:id="701"/>
-    <w:bookmarkStart w:id="702" w:name="通信字节与带宽换算"/>
+    <w:bookmarkEnd w:id="843"/>
+    <w:bookmarkStart w:id="844" w:name="通信字节与带宽换算"/>
     <w:p>
       <w:pPr>
         <w:pStyle w:val="Heading2"/>
@@ -17652,8 +17652,8 @@
         <w:t xml:space="preserve">通信。</w:t>
       </w:r>
     </w:p>
-    <w:bookmarkEnd w:id="702"/>
-    <w:bookmarkStart w:id="703" w:name="openfhe-原生-case-不与-simulator-混加"/>
+    <w:bookmarkEnd w:id="844"/>
+    <w:bookmarkStart w:id="845" w:name="openfhe-原生-case-不与-simulator-混加"/>
     <w:p>
       <w:pPr>
         <w:pStyle w:val="Heading2"/>
@@ -18320,9 +18320,9 @@
         <w:t xml:space="preserve">完全相同。</w:t>
       </w:r>
     </w:p>
-    <w:bookmarkEnd w:id="703"/>
-    <w:bookmarkEnd w:id="704"/>
-    <w:bookmarkStart w:id="709" w:name="三类正式实验矩阵"/>
+    <w:bookmarkEnd w:id="845"/>
+    <w:bookmarkEnd w:id="846"/>
+    <w:bookmarkStart w:id="851" w:name="三类正式实验矩阵"/>
     <w:p>
       <w:pPr>
         <w:pStyle w:val="Heading1"/>
@@ -18347,7 +18347,7 @@
         <w:t xml:space="preserve">三类正式实验矩阵</w:t>
       </w:r>
     </w:p>
-    <w:bookmarkStart w:id="705" w:name="合成矩阵两个规模三个种子四个-rho"/>
+    <w:bookmarkStart w:id="847" w:name="合成矩阵两个规模三个种子四个-rho"/>
     <w:p>
       <w:pPr>
         <w:pStyle w:val="Heading2"/>
@@ -19322,8 +19322,8 @@
         <w:t xml:space="preserve"> shard fail closed。</w:t>
       </w:r>
     </w:p>
-    <w:bookmarkEnd w:id="705"/>
-    <w:bookmarkStart w:id="706" w:name="单一真实来源snap-stack-overflow-a2q"/>
+    <w:bookmarkEnd w:id="847"/>
+    <w:bookmarkStart w:id="848" w:name="单一真实来源snap-stack-overflow-a2q"/>
     <w:p>
       <w:pPr>
         <w:pStyle w:val="Heading2"/>
@@ -20110,8 +20110,8 @@
         <w:t xml:space="preserve">稳健性外推。</w:t>
       </w:r>
     </w:p>
-    <w:bookmarkEnd w:id="706"/>
-    <w:bookmarkStart w:id="707" w:name="当前源码-openfhe-矩阵"/>
+    <w:bookmarkEnd w:id="848"/>
+    <w:bookmarkStart w:id="849" w:name="当前源码-openfhe-矩阵"/>
     <w:p>
       <w:pPr>
         <w:pStyle w:val="Heading2"/>
@@ -20498,8 +20498,8 @@
         <w:t xml:space="preserve">被重放。</w:t>
       </w:r>
     </w:p>
-    <w:bookmarkEnd w:id="707"/>
-    <w:bookmarkStart w:id="708" w:name="完整工件数量"/>
+    <w:bookmarkEnd w:id="849"/>
+    <w:bookmarkStart w:id="850" w:name="完整工件数量"/>
     <w:p>
       <w:pPr>
         <w:pStyle w:val="Heading2"/>
@@ -20731,9 +20731,9 @@
         <w:t xml:space="preserve">都拒绝。</w:t>
       </w:r>
     </w:p>
-    <w:bookmarkEnd w:id="708"/>
-    <w:bookmarkEnd w:id="709"/>
-    <w:bookmarkStart w:id="710" w:name="因果解释报告规则与否证条件"/>
+    <w:bookmarkEnd w:id="850"/>
+    <w:bookmarkEnd w:id="851"/>
+    <w:bookmarkStart w:id="852" w:name="因果解释报告规则与否证条件"/>
     <w:p>
       <w:pPr>
         <w:pStyle w:val="Heading1"/>
@@ -21474,8 +21474,8 @@
         <w:t xml:space="preserve">有利，并不构成失败；它会作为边界或负结果如实报告。</w:t>
       </w:r>
     </w:p>
-    <w:bookmarkEnd w:id="710"/>
-    <w:bookmarkStart w:id="714" w:name="证据链为什么被设计得很严格"/>
+    <w:bookmarkEnd w:id="852"/>
+    <w:bookmarkStart w:id="856" w:name="证据链为什么被设计得很严格"/>
     <w:p>
       <w:pPr>
         <w:pStyle w:val="Heading1"/>
@@ -21500,7 +21500,7 @@
         <w:t xml:space="preserve">证据链为什么被设计得很严格</w:t>
       </w:r>
     </w:p>
-    <w:bookmarkStart w:id="711" w:name="三类源快照"/>
+    <w:bookmarkStart w:id="853" w:name="三类源快照"/>
     <w:p>
       <w:pPr>
         <w:pStyle w:val="Heading2"/>
@@ -21707,8 +21707,8 @@
         <w:t xml:space="preserve">都不够。</w:t>
       </w:r>
     </w:p>
-    <w:bookmarkEnd w:id="711"/>
-    <w:bookmarkStart w:id="712" w:name="route-a-与独立-follow-up-均已关闭论文继续-route-c"/>
+    <w:bookmarkEnd w:id="853"/>
+    <w:bookmarkStart w:id="854" w:name="route-a-与独立-follow-up-均已关闭论文继续-route-c"/>
     <w:p>
       <w:pPr>
         <w:pStyle w:val="Heading2"/>
@@ -22609,8 +22609,8 @@
         <w:t xml:space="preserve">NO-GO。修复控制器后再跑一次会改变“一次尝试”的事后定义，不被允许。</w:t>
       </w:r>
     </w:p>
-    <w:bookmarkEnd w:id="712"/>
-    <w:bookmarkStart w:id="713" w:name="四个执行层级"/>
+    <w:bookmarkEnd w:id="854"/>
+    <w:bookmarkStart w:id="855" w:name="四个执行层级"/>
     <w:p>
       <w:pPr>
         <w:pStyle w:val="Heading2"/>
@@ -22960,9 +22960,9 @@
         <w:t xml:space="preserve">或论文主张已经释放。</w:t>
       </w:r>
     </w:p>
-    <w:bookmarkEnd w:id="713"/>
-    <w:bookmarkEnd w:id="714"/>
-    <w:bookmarkStart w:id="715" w:name="正确性边界与整数安全"/>
+    <w:bookmarkEnd w:id="855"/>
+    <w:bookmarkEnd w:id="856"/>
+    <w:bookmarkStart w:id="857" w:name="正确性边界与整数安全"/>
     <w:p>
       <w:pPr>
         <w:pStyle w:val="Heading1"/>
@@ -23569,8 +23569,8 @@
         <w:t xml:space="preserve">门禁。</w:t>
       </w:r>
     </w:p>
-    <w:bookmarkEnd w:id="715"/>
-    <w:bookmarkStart w:id="718" w:name="论文真正可以声称什么"/>
+    <w:bookmarkEnd w:id="857"/>
+    <w:bookmarkStart w:id="860" w:name="论文真正可以声称什么"/>
     <w:p>
       <w:pPr>
         <w:pStyle w:val="Heading1"/>
@@ -23595,7 +23595,7 @@
         <w:t xml:space="preserve">论文真正可以声称什么</w:t>
       </w:r>
     </w:p>
-    <w:bookmarkStart w:id="716" w:name="可以主张的贡献"/>
+    <w:bookmarkStart w:id="858" w:name="可以主张的贡献"/>
     <w:p>
       <w:pPr>
         <w:pStyle w:val="Heading2"/>
@@ -23849,8 +23849,8 @@
         <w:t xml:space="preserve">评估方法。</w:t>
       </w:r>
     </w:p>
-    <w:bookmarkEnd w:id="716"/>
-    <w:bookmarkStart w:id="717" w:name="不能扩大成的主张"/>
+    <w:bookmarkEnd w:id="858"/>
+    <w:bookmarkStart w:id="859" w:name="不能扩大成的主张"/>
     <w:p>
       <w:pPr>
         <w:pStyle w:val="Heading2"/>
@@ -24253,9 +24253,9 @@
         <w:t xml:space="preserve">是看完正式结果后修改矩阵、门槛或策略身份并继续声称原结论。</w:t>
       </w:r>
     </w:p>
-    <w:bookmarkEnd w:id="717"/>
-    <w:bookmarkEnd w:id="718"/>
-    <w:bookmarkStart w:id="719" w:name="这篇论文的叙事主线"/>
+    <w:bookmarkEnd w:id="859"/>
+    <w:bookmarkEnd w:id="860"/>
+    <w:bookmarkStart w:id="861" w:name="这篇论文的叙事主线"/>
     <w:p>
       <w:pPr>
         <w:pStyle w:val="Heading1"/>
@@ -24637,8 +24637,8 @@
         <w:t xml:space="preserve">和事件语义下的机制级权衡；若增量维护失去优势，就把失效位置与原因写成边界或负结果。</w:t>
       </w:r>
     </w:p>
-    <w:bookmarkEnd w:id="719"/>
-    <w:bookmarkStart w:id="723" w:name="当前进度与剩余工作"/>
+    <w:bookmarkEnd w:id="861"/>
+    <w:bookmarkStart w:id="865" w:name="当前进度与剩余工作"/>
     <w:p>
       <w:pPr>
         <w:pStyle w:val="Heading1"/>
@@ -24736,18 +24736,18 @@
           <wp:inline>
             <wp:extent cx="5760720" cy="3127247"/>
             <wp:effectExtent b="0" l="0" r="0" t="0"/>
-            <wp:docPr descr="从 S1、S2 到一次性资格停止点的证据链；正式实验没有启动，论文转入 Route C。" title="Figure 2" id="721" name="Picture"/>
+            <wp:docPr descr="从 S1、S2 到一次性资格停止点的证据链；正式实验没有启动，论文转入 Route C。" title="Figure 2" id="863" name="Picture"/>
             <a:graphic>
               <a:graphicData uri="http://schemas.openxmlformats.org/drawingml/2006/picture">
                 <pic:pic>
                   <pic:nvPicPr>
-                    <pic:cNvPr descr="assets/route-c-evidence-boundary.png" id="722" name="Picture"/>
+                    <pic:cNvPr descr="assets/route-c-evidence-boundary.png" id="864" name="Picture"/>
                     <pic:cNvPicPr>
                       <a:picLocks noChangeArrowheads="1" noChangeAspect="1"/>
                     </pic:cNvPicPr>
                   </pic:nvPicPr>
                   <pic:blipFill>
-                    <a:blip r:embed="rId720"/>
+                    <a:blip r:embed="rId862"/>
                     <a:stretch>
                       <a:fillRect/>
                     </a:stretch>
@@ -26898,8 +26898,8 @@
         <w:t xml:space="preserve">lineage；它不能支持本稿，保守看至少另需数周，而且仍不保证结果为正。以上是形成投稿稿的估计，不是录用时间承诺。</w:t>
       </w:r>
     </w:p>
-    <w:bookmarkEnd w:id="723"/>
-    <w:bookmarkStart w:id="724" w:name="最终理解"/>
+    <w:bookmarkEnd w:id="865"/>
+    <w:bookmarkStart w:id="866" w:name="最终理解"/>
     <w:p>
       <w:pPr>
         <w:pStyle w:val="Heading1"/>
@@ -27068,8 +27068,8 @@
         <w:t xml:space="preserve">的核心。</w:t>
       </w:r>
     </w:p>
-    <w:bookmarkEnd w:id="724"/>
-    <w:bookmarkStart w:id="725" w:name="项目内主要依据"/>
+    <w:bookmarkEnd w:id="866"/>
+    <w:bookmarkStart w:id="867" w:name="项目内主要依据"/>
     <w:p>
       <w:pPr>
         <w:pStyle w:val="Heading1"/>
@@ -27350,7 +27350,7 @@
         <w:t xml:space="preserve">config/params_manifest.json</w:t>
       </w:r>
     </w:p>
-    <w:bookmarkEnd w:id="725"/>
+    <w:bookmarkEnd w:id="867"/>
     <w:sectPr>
       <w:headerReference r:id="rId9" w:type="default"/>
       <w:footerReference r:id="rId10" w:type="default"/>

</xml_diff>